<commit_message>
chore: TCC — apresentação individual de cada etapa redesenhada (paisagem, faixa da etapa, diagrama didático, cartões por tarefa, prova passo a passo)
</commit_message>
<xml_diff>
--- a/apresentacao-orientador/relatorios-por-etapa/E1-planejamento.docx
+++ b/apresentacao-orientador/relatorios-por-etapa/E1-planejamento.docx
@@ -3,85 +3,114 @@
 <w:document xmlns:wpc="http://schemas.microsoft.com/office/word/2010/wordprocessingCanvas" xmlns:mo="http://schemas.microsoft.com/office/mac/office/2008/main" xmlns:mc="http://schemas.openxmlformats.org/markup-compatibility/2006" xmlns:mv="urn:schemas-microsoft-com:mac:vml" xmlns:o="urn:schemas-microsoft-com:office:office" xmlns:r="http://schemas.openxmlformats.org/officeDocument/2006/relationships" xmlns:m="http://schemas.openxmlformats.org/officeDocument/2006/math" xmlns:v="urn:schemas-microsoft-com:vml" xmlns:wp14="http://schemas.microsoft.com/office/word/2010/wordprocessingDrawing" xmlns:wp="http://schemas.openxmlformats.org/drawingml/2006/wordprocessingDrawing" xmlns:w10="urn:schemas-microsoft-com:office:word" xmlns:w="http://schemas.openxmlformats.org/wordprocessingml/2006/main" xmlns:w14="http://schemas.microsoft.com/office/word/2010/wordml" xmlns:wpg="http://schemas.microsoft.com/office/word/2010/wordprocessingGroup" xmlns:wpi="http://schemas.microsoft.com/office/word/2010/wordprocessingInk" xmlns:wne="http://schemas.microsoft.com/office/word/2006/wordml" xmlns:wps="http://schemas.microsoft.com/office/word/2010/wordprocessingShape" mc:Ignorable="w14 wp14">
   <w:body>
     <w:p>
+      <w:pPr>
+        <w:spacing w:before="80" w:after="0"/>
+      </w:pPr>
       <w:r>
         <w:rPr>
           <w:b/>
-          <w:color w:val="555555"/>
-          <w:sz w:val="17"/>
+          <w:i w:val="0"/>
+          <w:color w:val="6B7480"/>
+          <w:sz w:val="26"/>
         </w:rPr>
-        <w:t>FÁBRICA DE SOFTWARE MULTI-AGENTE · TCC · ENZO CONSULO</w:t>
+        <w:t>ETAPA 1 DE 10</w:t>
       </w:r>
     </w:p>
     <w:p>
       <w:pPr>
-        <w:pStyle w:val="Title"/>
+        <w:spacing w:before="0" w:after="40"/>
       </w:pPr>
       <w:r>
         <w:rPr>
-          <w:color w:val="222222"/>
+          <w:rFonts w:ascii="Cambria" w:hAnsi="Cambria"/>
+          <w:b/>
+          <w:i w:val="0"/>
+          <w:color w:val="1B2A41"/>
+          <w:sz w:val="68"/>
         </w:rPr>
-        <w:t>E1 — Planejamento e arquitetura</w:t>
+        <w:t>Planejamento e arquitetura</w:t>
       </w:r>
     </w:p>
     <w:p>
+      <w:pPr>
+        <w:spacing w:before="0" w:after="280"/>
+      </w:pPr>
       <w:r>
         <w:rPr>
-          <w:color w:val="555555"/>
+          <w:b w:val="0"/>
+          <w:i w:val="0"/>
+          <w:color w:val="6B7480"/>
+          <w:sz w:val="24"/>
         </w:rPr>
-        <w:t>Período planejado: 04/09 – 18/09/2026   ·   Branch: etapa/e1-planejamento</w:t>
+        <w:t xml:space="preserve">Período planejado: 04/09 – 18/09/2026     ·     branch </w:t>
+      </w:r>
+      <w:r>
+        <w:rPr>
+          <w:rFonts w:ascii="Consolas" w:hAnsi="Consolas"/>
+          <w:b/>
+          <w:i w:val="0"/>
+          <w:color w:val="4A6FA5"/>
+          <w:sz w:val="24"/>
+        </w:rPr>
+        <w:t>etapa/e1-planejamento</w:t>
       </w:r>
     </w:p>
     <w:tbl>
       <w:tblPr>
-        <w:tblStyle w:val="LightGrid-Accent1"/>
         <w:tblW w:type="auto" w:w="0"/>
         <w:jc w:val="center"/>
         <w:tblLayout w:type="fixed"/>
         <w:tblLook w:firstColumn="1" w:firstRow="1" w:lastColumn="0" w:lastRow="0" w:noHBand="0" w:noVBand="1" w:val="04A0"/>
+        <w:tblBorders>
+          <w:top w:val="nil"/>
+          <w:left w:val="nil"/>
+          <w:bottom w:val="nil"/>
+          <w:right w:val="nil"/>
+          <w:insideH w:val="nil"/>
+          <w:insideV w:val="nil"/>
+        </w:tblBorders>
       </w:tblPr>
       <w:tblGrid>
-        <w:gridCol w:w="7087"/>
-        <w:gridCol w:w="2268"/>
+        <w:gridCol w:w="7370"/>
+        <w:gridCol w:w="7654"/>
       </w:tblGrid>
       <w:tr>
         <w:tc>
           <w:tcPr>
-            <w:tcW w:type="dxa" w:w="7087"/>
+            <w:tcW w:type="dxa" w:w="7370"/>
+            <w:shd w:val="clear" w:color="auto" w:fill="1B2A41"/>
+            <w:tcMar>
+              <w:top w:w="283" w:type="dxa"/>
+              <w:left w:w="283" w:type="dxa"/>
+              <w:bottom w:w="283" w:type="dxa"/>
+              <w:right w:w="283" w:type="dxa"/>
+            </w:tcMar>
           </w:tcPr>
           <w:p>
+            <w:pPr>
+              <w:spacing w:before="0" w:after="120"/>
+            </w:pPr>
             <w:r>
               <w:rPr>
                 <w:b/>
-                <w:sz w:val="19"/>
+                <w:i w:val="0"/>
+                <w:color w:val="E9A23B"/>
+                <w:sz w:val="22"/>
               </w:rPr>
-              <w:t>Entrega combinada no plano</w:t>
+              <w:t>PROPOSTA DO PLANO</w:t>
             </w:r>
           </w:p>
-        </w:tc>
-        <w:tc>
-          <w:tcPr>
-            <w:tcW w:type="dxa" w:w="2268"/>
-          </w:tcPr>
           <w:p>
+            <w:pPr>
+              <w:spacing w:before="0" w:after="0"/>
+            </w:pPr>
             <w:r>
               <w:rPr>
+                <w:rFonts w:ascii="Cambria" w:hAnsi="Cambria"/>
                 <w:b/>
-                <w:sz w:val="19"/>
-              </w:rPr>
-              <w:t>Situação</w:t>
-            </w:r>
-          </w:p>
-        </w:tc>
-      </w:tr>
-      <w:tr>
-        <w:tc>
-          <w:tcPr>
-            <w:tcW w:type="dxa" w:w="7087"/>
-          </w:tcPr>
-          <w:p>
-            <w:r>
-              <w:rPr>
-                <w:sz w:val="19"/>
+                <w:i w:val="0"/>
+                <w:color w:val="FFFFFF"/>
+                <w:sz w:val="38"/>
               </w:rPr>
               <w:t>Requisitos, arquitetura, tarefas, critérios e projetos de teste aprovados.</w:t>
             </w:r>
@@ -89,150 +118,757 @@
         </w:tc>
         <w:tc>
           <w:tcPr>
-            <w:tcW w:type="dxa" w:w="2268"/>
-            <w:shd w:val="clear" w:color="auto" w:fill="FBF0DC"/>
+            <w:tcW w:type="dxa" w:w="7654"/>
+            <w:shd w:val="clear" w:color="auto" w:fill="E9A23B"/>
+            <w:tcMar>
+              <w:top w:w="283" w:type="dxa"/>
+              <w:left w:w="283" w:type="dxa"/>
+              <w:bottom w:w="283" w:type="dxa"/>
+              <w:right w:w="283" w:type="dxa"/>
+            </w:tcMar>
           </w:tcPr>
           <w:p>
+            <w:pPr>
+              <w:spacing w:before="0" w:after="120"/>
+            </w:pPr>
             <w:r>
               <w:rPr>
-                <w:sz w:val="19"/>
+                <w:b/>
+                <w:i w:val="0"/>
+                <w:color w:val="FFFFFF"/>
+                <w:sz w:val="22"/>
               </w:rPr>
-              <w:t>Em andamento</w:t>
+              <w:t>ENTREGUE COM PENDÊNCIA</w:t>
+            </w:r>
+          </w:p>
+          <w:p>
+            <w:pPr>
+              <w:spacing w:before="0" w:after="0"/>
+            </w:pPr>
+            <w:r>
+              <w:rPr>
+                <w:rFonts w:ascii="Cambria" w:hAnsi="Cambria"/>
+                <w:b/>
+                <w:i w:val="0"/>
+                <w:color w:val="FFFFFF"/>
+                <w:sz w:val="30"/>
+              </w:rPr>
+              <w:t>Requisitos, arquitetura, divisão do trabalho e critérios de desempenho definidos. Os cinco projetos de teste estão propostos e aguardam validação.</w:t>
             </w:r>
           </w:p>
         </w:tc>
       </w:tr>
     </w:tbl>
-    <w:p/>
-    <w:p>
-      <w:r>
-        <w:rPr>
-          <w:b/>
-        </w:rPr>
-        <w:t xml:space="preserve">Em uma frase: </w:t>
-      </w:r>
-      <w:r>
-        <w:t>Requisitos, arquitetura, divisão do trabalho e critérios de desempenho definidos. Os cinco projetos de teste estão propostos e aguardam validação.</w:t>
-      </w:r>
-    </w:p>
     <w:p>
       <w:pPr>
-        <w:pStyle w:val="Heading1"/>
+        <w:spacing w:before="0" w:after="200"/>
       </w:pPr>
-      <w:r>
-        <w:rPr>
-          <w:color w:val="2A78D6"/>
-        </w:rPr>
-        <w:t>O que foi feito</w:t>
-      </w:r>
     </w:p>
     <w:tbl>
       <w:tblPr>
-        <w:tblStyle w:val="LightGrid-Accent1"/>
         <w:tblW w:type="auto" w:w="0"/>
         <w:jc w:val="center"/>
         <w:tblLayout w:type="fixed"/>
         <w:tblLook w:firstColumn="1" w:firstRow="1" w:lastColumn="0" w:lastRow="0" w:noHBand="0" w:noVBand="1" w:val="04A0"/>
+        <w:tblBorders>
+          <w:top w:val="nil"/>
+          <w:left w:val="nil"/>
+          <w:bottom w:val="nil"/>
+          <w:right w:val="nil"/>
+          <w:insideH w:val="nil"/>
+          <w:insideV w:val="nil"/>
+        </w:tblBorders>
       </w:tblPr>
       <w:tblGrid>
-        <w:gridCol w:w="1247"/>
-        <w:gridCol w:w="907"/>
-        <w:gridCol w:w="5783"/>
-        <w:gridCol w:w="1474"/>
+        <w:gridCol w:w="3742"/>
+        <w:gridCol w:w="3742"/>
+        <w:gridCol w:w="3742"/>
+        <w:gridCol w:w="3742"/>
       </w:tblGrid>
       <w:tr>
         <w:tc>
           <w:tcPr>
-            <w:tcW w:type="dxa" w:w="1247"/>
+            <w:tcW w:type="dxa" w:w="3742"/>
+            <w:shd w:val="clear" w:color="auto" w:fill="F2F4F7"/>
+            <w:tcMar>
+              <w:top w:w="198" w:type="dxa"/>
+              <w:left w:w="198" w:type="dxa"/>
+              <w:bottom w:w="198" w:type="dxa"/>
+              <w:right w:w="198" w:type="dxa"/>
+            </w:tcMar>
           </w:tcPr>
           <w:p>
+            <w:pPr>
+              <w:spacing w:before="0" w:after="0"/>
+            </w:pPr>
             <w:r>
               <w:rPr>
+                <w:rFonts w:ascii="Cambria" w:hAnsi="Cambria"/>
                 <w:b/>
-                <w:sz w:val="19"/>
+                <w:i w:val="0"/>
+                <w:color w:val="1B2A41"/>
+                <w:sz w:val="60"/>
               </w:rPr>
-              <w:t>Tarefa</w:t>
+              <w:t>4/5</w:t>
+            </w:r>
+          </w:p>
+          <w:p>
+            <w:pPr>
+              <w:spacing w:before="0" w:after="0"/>
+            </w:pPr>
+            <w:r>
+              <w:rPr>
+                <w:b w:val="0"/>
+                <w:i w:val="0"/>
+                <w:color w:val="6B7480"/>
+                <w:sz w:val="22"/>
+              </w:rPr>
+              <w:t>documentos</w:t>
             </w:r>
           </w:p>
         </w:tc>
         <w:tc>
           <w:tcPr>
-            <w:tcW w:type="dxa" w:w="907"/>
+            <w:tcW w:type="dxa" w:w="3742"/>
+            <w:shd w:val="clear" w:color="auto" w:fill="F2F4F7"/>
+            <w:tcMar>
+              <w:top w:w="198" w:type="dxa"/>
+              <w:left w:w="198" w:type="dxa"/>
+              <w:bottom w:w="198" w:type="dxa"/>
+              <w:right w:w="198" w:type="dxa"/>
+            </w:tcMar>
           </w:tcPr>
           <w:p>
+            <w:pPr>
+              <w:spacing w:before="0" w:after="0"/>
+            </w:pPr>
             <w:r>
               <w:rPr>
+                <w:rFonts w:ascii="Cambria" w:hAnsi="Cambria"/>
                 <w:b/>
-                <w:sz w:val="19"/>
+                <w:i w:val="0"/>
+                <w:color w:val="1B2A41"/>
+                <w:sz w:val="60"/>
               </w:rPr>
-              <w:t>Pacote</w:t>
+              <w:t>15</w:t>
+            </w:r>
+          </w:p>
+          <w:p>
+            <w:pPr>
+              <w:spacing w:before="0" w:after="0"/>
+            </w:pPr>
+            <w:r>
+              <w:rPr>
+                <w:b w:val="0"/>
+                <w:i w:val="0"/>
+                <w:color w:val="6B7480"/>
+                <w:sz w:val="22"/>
+              </w:rPr>
+              <w:t>requisitos</w:t>
             </w:r>
           </w:p>
         </w:tc>
         <w:tc>
           <w:tcPr>
-            <w:tcW w:type="dxa" w:w="5783"/>
+            <w:tcW w:type="dxa" w:w="3742"/>
+            <w:shd w:val="clear" w:color="auto" w:fill="F2F4F7"/>
+            <w:tcMar>
+              <w:top w:w="198" w:type="dxa"/>
+              <w:left w:w="198" w:type="dxa"/>
+              <w:bottom w:w="198" w:type="dxa"/>
+              <w:right w:w="198" w:type="dxa"/>
+            </w:tcMar>
           </w:tcPr>
           <w:p>
+            <w:pPr>
+              <w:spacing w:before="0" w:after="0"/>
+            </w:pPr>
             <w:r>
               <w:rPr>
+                <w:rFonts w:ascii="Cambria" w:hAnsi="Cambria"/>
                 <w:b/>
-                <w:sz w:val="19"/>
+                <w:i w:val="0"/>
+                <w:color w:val="1B2A41"/>
+                <w:sz w:val="60"/>
               </w:rPr>
-              <w:t>Descrição</w:t>
+              <w:t>8</w:t>
+            </w:r>
+          </w:p>
+          <w:p>
+            <w:pPr>
+              <w:spacing w:before="0" w:after="0"/>
+            </w:pPr>
+            <w:r>
+              <w:rPr>
+                <w:b w:val="0"/>
+                <w:i w:val="0"/>
+                <w:color w:val="6B7480"/>
+                <w:sz w:val="22"/>
+              </w:rPr>
+              <w:t>critérios de desempenho</w:t>
             </w:r>
           </w:p>
         </w:tc>
         <w:tc>
           <w:tcPr>
-            <w:tcW w:type="dxa" w:w="1474"/>
+            <w:tcW w:type="dxa" w:w="3742"/>
+            <w:shd w:val="clear" w:color="auto" w:fill="F2F4F7"/>
+            <w:tcMar>
+              <w:top w:w="198" w:type="dxa"/>
+              <w:left w:w="198" w:type="dxa"/>
+              <w:bottom w:w="198" w:type="dxa"/>
+              <w:right w:w="198" w:type="dxa"/>
+            </w:tcMar>
           </w:tcPr>
           <w:p>
+            <w:pPr>
+              <w:spacing w:before="0" w:after="0"/>
+            </w:pPr>
             <w:r>
               <w:rPr>
+                <w:rFonts w:ascii="Cambria" w:hAnsi="Cambria"/>
                 <w:b/>
-                <w:sz w:val="19"/>
+                <w:i w:val="0"/>
+                <w:color w:val="1B2A41"/>
+                <w:sz w:val="60"/>
               </w:rPr>
-              <w:t>Status</w:t>
+              <w:t>5</w:t>
+            </w:r>
+          </w:p>
+          <w:p>
+            <w:pPr>
+              <w:spacing w:before="0" w:after="0"/>
+            </w:pPr>
+            <w:r>
+              <w:rPr>
+                <w:b w:val="0"/>
+                <w:i w:val="0"/>
+                <w:color w:val="6B7480"/>
+                <w:sz w:val="22"/>
+              </w:rPr>
+              <w:t>projetos de teste</w:t>
             </w:r>
           </w:p>
         </w:tc>
       </w:tr>
+    </w:tbl>
+    <w:p>
+      <w:pPr>
+        <w:spacing w:before="0" w:after="240"/>
+      </w:pPr>
+    </w:p>
+    <w:p>
+      <w:pPr>
+        <w:spacing w:before="0" w:after="80"/>
+      </w:pPr>
+      <w:r>
+        <w:rPr>
+          <w:b/>
+          <w:i w:val="0"/>
+          <w:color w:val="4A6FA5"/>
+          <w:sz w:val="21"/>
+        </w:rPr>
+        <w:t>NESTA APRESENTAÇÃO</w:t>
+      </w:r>
+    </w:p>
+    <w:tbl>
+      <w:tblPr>
+        <w:tblW w:type="auto" w:w="0"/>
+        <w:jc w:val="center"/>
+        <w:tblLayout w:type="fixed"/>
+        <w:tblLook w:firstColumn="1" w:firstRow="1" w:lastColumn="0" w:lastRow="0" w:noHBand="0" w:noVBand="1" w:val="04A0"/>
+        <w:tblBorders>
+          <w:top w:val="nil"/>
+          <w:left w:val="nil"/>
+          <w:bottom w:val="nil"/>
+          <w:right w:val="nil"/>
+          <w:insideH w:val="nil"/>
+          <w:insideV w:val="nil"/>
+        </w:tblBorders>
+      </w:tblPr>
+      <w:tblGrid>
+        <w:gridCol w:w="3005"/>
+        <w:gridCol w:w="3005"/>
+        <w:gridCol w:w="3005"/>
+        <w:gridCol w:w="3005"/>
+        <w:gridCol w:w="3005"/>
+      </w:tblGrid>
       <w:tr>
         <w:tc>
           <w:tcPr>
-            <w:tcW w:type="dxa" w:w="1247"/>
+            <w:tcW w:type="dxa" w:w="3005"/>
+            <w:shd w:val="clear" w:color="auto" w:fill="FFFFFF"/>
+            <w:tcMar>
+              <w:top w:w="85" w:type="dxa"/>
+              <w:left w:w="85" w:type="dxa"/>
+              <w:bottom w:w="85" w:type="dxa"/>
+              <w:right w:w="85" w:type="dxa"/>
+            </w:tcMar>
           </w:tcPr>
           <w:p>
+            <w:pPr>
+              <w:spacing w:before="0" w:after="0"/>
+            </w:pPr>
             <w:r>
               <w:rPr>
-                <w:sz w:val="19"/>
+                <w:b/>
+                <w:i w:val="0"/>
+                <w:color w:val="E9A23B"/>
+                <w:sz w:val="28"/>
               </w:rPr>
-              <w:t>FAB-101</w:t>
+              <w:t xml:space="preserve">1  </w:t>
+            </w:r>
+            <w:r>
+              <w:rPr>
+                <w:b/>
+                <w:i w:val="0"/>
+                <w:color w:val="1B2A41"/>
+                <w:sz w:val="23"/>
+              </w:rPr>
+              <w:t>Onde entra no sistema</w:t>
             </w:r>
           </w:p>
         </w:tc>
         <w:tc>
           <w:tcPr>
-            <w:tcW w:type="dxa" w:w="907"/>
+            <w:tcW w:type="dxa" w:w="3005"/>
+            <w:shd w:val="clear" w:color="auto" w:fill="FFFFFF"/>
+            <w:tcMar>
+              <w:top w:w="85" w:type="dxa"/>
+              <w:left w:w="85" w:type="dxa"/>
+              <w:bottom w:w="85" w:type="dxa"/>
+              <w:right w:w="85" w:type="dxa"/>
+            </w:tcMar>
           </w:tcPr>
           <w:p>
+            <w:pPr>
+              <w:spacing w:before="0" w:after="0"/>
+            </w:pPr>
             <w:r>
               <w:rPr>
-                <w:sz w:val="19"/>
+                <w:b/>
+                <w:i w:val="0"/>
+                <w:color w:val="E9A23B"/>
+                <w:sz w:val="28"/>
               </w:rPr>
-              <w:t>1.1</w:t>
+              <w:t xml:space="preserve">2  </w:t>
+            </w:r>
+            <w:r>
+              <w:rPr>
+                <w:b/>
+                <w:i w:val="0"/>
+                <w:color w:val="1B2A41"/>
+                <w:sz w:val="23"/>
+              </w:rPr>
+              <w:t>Como funciona</w:t>
             </w:r>
           </w:p>
         </w:tc>
         <w:tc>
           <w:tcPr>
-            <w:tcW w:type="dxa" w:w="5783"/>
+            <w:tcW w:type="dxa" w:w="3005"/>
+            <w:shd w:val="clear" w:color="auto" w:fill="FFFFFF"/>
+            <w:tcMar>
+              <w:top w:w="85" w:type="dxa"/>
+              <w:left w:w="85" w:type="dxa"/>
+              <w:bottom w:w="85" w:type="dxa"/>
+              <w:right w:w="85" w:type="dxa"/>
+            </w:tcMar>
           </w:tcPr>
           <w:p>
+            <w:pPr>
+              <w:spacing w:before="0" w:after="0"/>
+            </w:pPr>
             <w:r>
               <w:rPr>
-                <w:sz w:val="19"/>
+                <w:b/>
+                <w:i w:val="0"/>
+                <w:color w:val="E9A23B"/>
+                <w:sz w:val="28"/>
+              </w:rPr>
+              <w:t xml:space="preserve">3  </w:t>
+            </w:r>
+            <w:r>
+              <w:rPr>
+                <w:b/>
+                <w:i w:val="0"/>
+                <w:color w:val="1B2A41"/>
+                <w:sz w:val="23"/>
+              </w:rPr>
+              <w:t>Tarefa por tarefa</w:t>
+            </w:r>
+          </w:p>
+        </w:tc>
+        <w:tc>
+          <w:tcPr>
+            <w:tcW w:type="dxa" w:w="3005"/>
+            <w:shd w:val="clear" w:color="auto" w:fill="FFFFFF"/>
+            <w:tcMar>
+              <w:top w:w="85" w:type="dxa"/>
+              <w:left w:w="85" w:type="dxa"/>
+              <w:bottom w:w="85" w:type="dxa"/>
+              <w:right w:w="85" w:type="dxa"/>
+            </w:tcMar>
+          </w:tcPr>
+          <w:p>
+            <w:pPr>
+              <w:spacing w:before="0" w:after="0"/>
+            </w:pPr>
+            <w:r>
+              <w:rPr>
+                <w:b/>
+                <w:i w:val="0"/>
+                <w:color w:val="E9A23B"/>
+                <w:sz w:val="28"/>
+              </w:rPr>
+              <w:t xml:space="preserve">4  </w:t>
+            </w:r>
+            <w:r>
+              <w:rPr>
+                <w:b/>
+                <w:i w:val="0"/>
+                <w:color w:val="1B2A41"/>
+                <w:sz w:val="23"/>
+              </w:rPr>
+              <w:t>Como se prova</w:t>
+            </w:r>
+          </w:p>
+        </w:tc>
+        <w:tc>
+          <w:tcPr>
+            <w:tcW w:type="dxa" w:w="3005"/>
+            <w:shd w:val="clear" w:color="auto" w:fill="FFFFFF"/>
+            <w:tcMar>
+              <w:top w:w="85" w:type="dxa"/>
+              <w:left w:w="85" w:type="dxa"/>
+              <w:bottom w:w="85" w:type="dxa"/>
+              <w:right w:w="85" w:type="dxa"/>
+            </w:tcMar>
+          </w:tcPr>
+          <w:p>
+            <w:pPr>
+              <w:spacing w:before="0" w:after="0"/>
+            </w:pPr>
+            <w:r>
+              <w:rPr>
+                <w:b/>
+                <w:i w:val="0"/>
+                <w:color w:val="E9A23B"/>
+                <w:sz w:val="28"/>
+              </w:rPr>
+              <w:t xml:space="preserve">5  </w:t>
+            </w:r>
+            <w:r>
+              <w:rPr>
+                <w:b/>
+                <w:i w:val="0"/>
+                <w:color w:val="1B2A41"/>
+                <w:sz w:val="23"/>
+              </w:rPr>
+              <w:t>Próximos passos</w:t>
+            </w:r>
+          </w:p>
+        </w:tc>
+      </w:tr>
+    </w:tbl>
+    <w:p>
+      <w:pPr>
+        <w:pageBreakBefore/>
+        <w:spacing w:before="0" w:after="40"/>
+      </w:pPr>
+      <w:r>
+        <w:rPr>
+          <w:rFonts w:ascii="Cambria" w:hAnsi="Cambria"/>
+          <w:b/>
+          <w:i w:val="0"/>
+          <w:color w:val="1B2A41"/>
+          <w:sz w:val="48"/>
+        </w:rPr>
+        <w:t>Onde esta etapa entra no sistema</w:t>
+      </w:r>
+    </w:p>
+    <w:p>
+      <w:pPr>
+        <w:spacing w:before="0" w:after="200"/>
+      </w:pPr>
+      <w:r>
+        <w:rPr>
+          <w:b w:val="0"/>
+          <w:i w:val="0"/>
+          <w:color w:val="6B7480"/>
+          <w:sz w:val="25"/>
+        </w:rPr>
+        <w:t>A E1 não constrói camada: ela desenha o sistema inteiro. A construção começa pela base, na E2, e sobe uma camada por etapa.</w:t>
+      </w:r>
+    </w:p>
+    <w:p>
+      <w:pPr>
+        <w:jc w:val="center"/>
+      </w:pPr>
+      <w:r>
+        <w:drawing>
+          <wp:inline xmlns:a="http://schemas.openxmlformats.org/drawingml/2006/main" xmlns:pic="http://schemas.openxmlformats.org/drawingml/2006/picture">
+            <wp:extent cx="7560000" cy="3190539"/>
+            <wp:docPr id="1" name="Picture 1"/>
+            <wp:cNvGraphicFramePr>
+              <a:graphicFrameLocks noChangeAspect="1"/>
+            </wp:cNvGraphicFramePr>
+            <a:graphic>
+              <a:graphicData uri="http://schemas.openxmlformats.org/drawingml/2006/picture">
+                <pic:pic>
+                  <pic:nvPicPr>
+                    <pic:cNvPr id="0" name="mapa.png"/>
+                    <pic:cNvPicPr/>
+                  </pic:nvPicPr>
+                  <pic:blipFill>
+                    <a:blip r:embed="rId11"/>
+                    <a:stretch>
+                      <a:fillRect/>
+                    </a:stretch>
+                  </pic:blipFill>
+                  <pic:spPr>
+                    <a:xfrm>
+                      <a:off x="0" y="0"/>
+                      <a:ext cx="7560000" cy="3190539"/>
+                    </a:xfrm>
+                    <a:prstGeom prst="rect"/>
+                  </pic:spPr>
+                </pic:pic>
+              </a:graphicData>
+            </a:graphic>
+          </wp:inline>
+        </w:drawing>
+      </w:r>
+    </w:p>
+    <w:p>
+      <w:pPr>
+        <w:pageBreakBefore/>
+        <w:spacing w:before="0" w:after="40"/>
+      </w:pPr>
+      <w:r>
+        <w:rPr>
+          <w:rFonts w:ascii="Cambria" w:hAnsi="Cambria"/>
+          <w:b/>
+          <w:i w:val="0"/>
+          <w:color w:val="1B2A41"/>
+          <w:sz w:val="48"/>
+        </w:rPr>
+        <w:t>Como funciona</w:t>
+      </w:r>
+    </w:p>
+    <w:p>
+      <w:pPr>
+        <w:spacing w:before="0" w:after="200"/>
+      </w:pPr>
+      <w:r>
+        <w:rPr>
+          <w:b w:val="0"/>
+          <w:i w:val="0"/>
+          <w:color w:val="6B7480"/>
+          <w:sz w:val="25"/>
+        </w:rPr>
+        <w:t>O desenho mostra as peças desta etapa e como elas conversam.</w:t>
+      </w:r>
+    </w:p>
+    <w:p>
+      <w:pPr>
+        <w:jc w:val="center"/>
+      </w:pPr>
+      <w:r>
+        <w:drawing>
+          <wp:inline xmlns:a="http://schemas.openxmlformats.org/drawingml/2006/main" xmlns:pic="http://schemas.openxmlformats.org/drawingml/2006/picture">
+            <wp:extent cx="8460000" cy="3689999"/>
+            <wp:docPr id="2" name="Picture 2"/>
+            <wp:cNvGraphicFramePr>
+              <a:graphicFrameLocks noChangeAspect="1"/>
+            </wp:cNvGraphicFramePr>
+            <a:graphic>
+              <a:graphicData uri="http://schemas.openxmlformats.org/drawingml/2006/picture">
+                <pic:pic>
+                  <pic:nvPicPr>
+                    <pic:cNvPr id="0" name="diag.png"/>
+                    <pic:cNvPicPr/>
+                  </pic:nvPicPr>
+                  <pic:blipFill>
+                    <a:blip r:embed="rId12"/>
+                    <a:stretch>
+                      <a:fillRect/>
+                    </a:stretch>
+                  </pic:blipFill>
+                  <pic:spPr>
+                    <a:xfrm>
+                      <a:off x="0" y="0"/>
+                      <a:ext cx="8460000" cy="3689999"/>
+                    </a:xfrm>
+                    <a:prstGeom prst="rect"/>
+                  </pic:spPr>
+                </pic:pic>
+              </a:graphicData>
+            </a:graphic>
+          </wp:inline>
+        </w:drawing>
+      </w:r>
+    </w:p>
+    <w:p>
+      <w:pPr>
+        <w:pStyle w:val="ListBullet"/>
+        <w:spacing w:after="40"/>
+      </w:pPr>
+      <w:r>
+        <w:rPr>
+          <w:b w:val="0"/>
+          <w:i w:val="0"/>
+          <w:color w:val="1F2328"/>
+          <w:sz w:val="24"/>
+        </w:rPr>
+        <w:t>15 requisitos: 8 funcionais (R1–R8) e 7 restrições (R9–R15), cada um com etapa e forma de verificar.</w:t>
+      </w:r>
+    </w:p>
+    <w:p>
+      <w:pPr>
+        <w:pStyle w:val="ListBullet"/>
+        <w:spacing w:after="40"/>
+      </w:pPr>
+      <w:r>
+        <w:rPr>
+          <w:b w:val="0"/>
+          <w:i w:val="0"/>
+          <w:color w:val="1F2328"/>
+          <w:sz w:val="24"/>
+        </w:rPr>
+        <w:t>Arquitetura em 4 camadas (tela, motor, agentes, fronteiras) sobre um único banco PostgreSQL.</w:t>
+      </w:r>
+    </w:p>
+    <w:p>
+      <w:pPr>
+        <w:pStyle w:val="ListBullet"/>
+        <w:spacing w:after="40"/>
+      </w:pPr>
+      <w:r>
+        <w:rPr>
+          <w:b w:val="0"/>
+          <w:i w:val="0"/>
+          <w:color w:val="1F2328"/>
+          <w:sz w:val="24"/>
+        </w:rPr>
+        <w:t>Ciclo de vida da tarefa com 6 estados e 2 portões independentes; escada de 4 degraus para falhas.</w:t>
+      </w:r>
+    </w:p>
+    <w:p>
+      <w:pPr>
+        <w:pStyle w:val="ListBullet"/>
+        <w:spacing w:after="40"/>
+      </w:pPr>
+      <w:r>
+        <w:rPr>
+          <w:b w:val="0"/>
+          <w:i w:val="0"/>
+          <w:color w:val="1F2328"/>
+          <w:sz w:val="24"/>
+        </w:rPr>
+        <w:t>Pilha Elixir/OTP escolhida pela supervisão de processos: cada agente é um processo isolado.</w:t>
+      </w:r>
+    </w:p>
+    <w:p>
+      <w:pPr>
+        <w:pStyle w:val="ListBullet"/>
+        <w:spacing w:after="40"/>
+      </w:pPr>
+      <w:r>
+        <w:rPr>
+          <w:b w:val="0"/>
+          <w:i w:val="0"/>
+          <w:color w:val="1F2328"/>
+          <w:sz w:val="24"/>
+        </w:rPr>
+        <w:t>Trabalho de E2–E7 decomposto em 39 tarefas, uma por pacote do plano, com critérios executáveis.</w:t>
+      </w:r>
+    </w:p>
+    <w:p>
+      <w:pPr>
+        <w:pageBreakBefore/>
+        <w:spacing w:before="0" w:after="40"/>
+      </w:pPr>
+      <w:r>
+        <w:rPr>
+          <w:rFonts w:ascii="Cambria" w:hAnsi="Cambria"/>
+          <w:b/>
+          <w:i w:val="0"/>
+          <w:color w:val="1B2A41"/>
+          <w:sz w:val="48"/>
+        </w:rPr>
+        <w:t>O que foi feito, tarefa por tarefa</w:t>
+      </w:r>
+    </w:p>
+    <w:p>
+      <w:pPr>
+        <w:spacing w:before="0" w:after="200"/>
+      </w:pPr>
+      <w:r>
+        <w:rPr>
+          <w:b w:val="0"/>
+          <w:i w:val="0"/>
+          <w:color w:val="6B7480"/>
+          <w:sz w:val="25"/>
+        </w:rPr>
+        <w:t>Cada tarefa é um pacote do plano de desenvolvimento. Detalhes completos em docs/tasks/pt/.</w:t>
+      </w:r>
+    </w:p>
+    <w:tbl>
+      <w:tblPr>
+        <w:tblW w:type="auto" w:w="0"/>
+        <w:jc w:val="center"/>
+        <w:tblLayout w:type="fixed"/>
+        <w:tblLook w:firstColumn="1" w:firstRow="1" w:lastColumn="0" w:lastRow="0" w:noHBand="0" w:noVBand="1" w:val="04A0"/>
+        <w:tblBorders>
+          <w:top w:val="nil"/>
+          <w:left w:val="nil"/>
+          <w:bottom w:val="nil"/>
+          <w:right w:val="nil"/>
+          <w:insideH w:val="nil"/>
+          <w:insideV w:val="nil"/>
+        </w:tblBorders>
+      </w:tblPr>
+      <w:tblGrid>
+        <w:gridCol w:w="11622"/>
+        <w:gridCol w:w="3402"/>
+      </w:tblGrid>
+      <w:tr>
+        <w:trPr>
+          <w:cantSplit/>
+        </w:trPr>
+        <w:tc>
+          <w:tcPr>
+            <w:tcW w:type="dxa" w:w="11622"/>
+            <w:shd w:val="clear" w:color="auto" w:fill="1B2A41"/>
+            <w:tcMar>
+              <w:top w:w="158" w:type="dxa"/>
+              <w:left w:w="158" w:type="dxa"/>
+              <w:bottom w:w="158" w:type="dxa"/>
+              <w:right w:w="158" w:type="dxa"/>
+            </w:tcMar>
+          </w:tcPr>
+          <w:p>
+            <w:pPr>
+              <w:keepNext/>
+              <w:spacing w:before="0" w:after="0"/>
+            </w:pPr>
+            <w:r>
+              <w:rPr>
+                <w:rFonts w:ascii="Consolas" w:hAnsi="Consolas"/>
+                <w:b/>
+                <w:i w:val="0"/>
+                <w:color w:val="E9A23B"/>
+                <w:sz w:val="24"/>
+              </w:rPr>
+              <w:t xml:space="preserve">FAB-101   </w:t>
+            </w:r>
+            <w:r>
+              <w:rPr>
+                <w:b/>
+                <w:i w:val="0"/>
+                <w:color w:val="FFFFFF"/>
+                <w:sz w:val="27"/>
               </w:rPr>
               <w:t>Levantar os requisitos R1–R15</w:t>
             </w:r>
@@ -240,54 +876,233 @@
         </w:tc>
         <w:tc>
           <w:tcPr>
-            <w:tcW w:type="dxa" w:w="1474"/>
-            <w:shd w:val="clear" w:color="auto" w:fill="E3F3E8"/>
+            <w:tcW w:type="dxa" w:w="3402"/>
+            <w:shd w:val="clear" w:color="auto" w:fill="2A9D8F"/>
+            <w:tcMar>
+              <w:top w:w="158" w:type="dxa"/>
+              <w:left w:w="158" w:type="dxa"/>
+              <w:bottom w:w="158" w:type="dxa"/>
+              <w:right w:w="158" w:type="dxa"/>
+            </w:tcMar>
           </w:tcPr>
           <w:p>
+            <w:pPr>
+              <w:keepNext/>
+              <w:spacing w:before="0" w:after="0"/>
+              <w:jc w:val="center"/>
+            </w:pPr>
             <w:r>
               <w:rPr>
-                <w:sz w:val="19"/>
+                <w:b/>
+                <w:i w:val="0"/>
+                <w:color w:val="FFFFFF"/>
+                <w:sz w:val="25"/>
               </w:rPr>
-              <w:t>Concluída</w:t>
+              <w:t>✓ Concluída</w:t>
             </w:r>
           </w:p>
         </w:tc>
       </w:tr>
       <w:tr>
+        <w:trPr>
+          <w:cantSplit/>
+        </w:trPr>
         <w:tc>
           <w:tcPr>
-            <w:tcW w:type="dxa" w:w="1247"/>
+            <w:tcW w:type="dxa" w:w="15024"/>
+            <w:gridSpan w:val="2"/>
+            <w:shd w:val="clear" w:color="auto" w:fill="F2F4F7"/>
+            <w:tcMar>
+              <w:top w:w="198" w:type="dxa"/>
+              <w:left w:w="198" w:type="dxa"/>
+              <w:bottom w:w="198" w:type="dxa"/>
+              <w:right w:w="198" w:type="dxa"/>
+            </w:tcMar>
           </w:tcPr>
           <w:p>
+            <w:pPr>
+              <w:keepNext/>
+              <w:spacing w:before="0" w:after="80"/>
+            </w:pPr>
             <w:r>
               <w:rPr>
+                <w:b/>
+                <w:i w:val="0"/>
+                <w:color w:val="4A6FA5"/>
+                <w:sz w:val="22"/>
+              </w:rPr>
+              <w:t xml:space="preserve">O que é   </w:t>
+            </w:r>
+            <w:r>
+              <w:rPr>
+                <w:b w:val="0"/>
+                <w:i w:val="0"/>
+                <w:color w:val="1F2328"/>
+                <w:sz w:val="23"/>
+              </w:rPr>
+              <w:t>Lista do que o sistema precisa fazer (8 requisitos funcionais) e das restrições sob as quais precisa funcionar (7 requisitos não funcionais). Cada requisito diz em que etapa será atendido e como será verificado.</w:t>
+            </w:r>
+          </w:p>
+          <w:p>
+            <w:pPr>
+              <w:keepNext/>
+              <w:spacing w:before="0" w:after="80"/>
+            </w:pPr>
+            <w:r>
+              <w:rPr>
+                <w:b/>
+                <w:i w:val="0"/>
+                <w:color w:val="4A6FA5"/>
+                <w:sz w:val="22"/>
+              </w:rPr>
+              <w:t xml:space="preserve">Por que   </w:t>
+            </w:r>
+            <w:r>
+              <w:rPr>
+                <w:b w:val="0"/>
+                <w:i w:val="0"/>
+                <w:color w:val="1F2328"/>
+                <w:sz w:val="23"/>
+              </w:rPr>
+              <w:t>Sem requisitos com forma objetiva de verificação, nenhuma etapa teria critério de pronto; eles amarram cada entrega do cronograma a algo que pode ser testado.</w:t>
+            </w:r>
+          </w:p>
+          <w:p>
+            <w:pPr>
+              <w:pStyle w:val="ListBullet"/>
+              <w:keepNext/>
+              <w:spacing w:after="20"/>
+            </w:pPr>
+            <w:r>
+              <w:rPr>
+                <w:b w:val="0"/>
+                <w:i w:val="0"/>
+                <w:color w:val="1F2328"/>
+                <w:sz w:val="21"/>
+              </w:rPr>
+              <w:t>R1–R8: do pedido às tarefas, seis estados, dois julgamentos, retrabalho limitado, paralelismo, memória e acompanhamento ao vivo</w:t>
+            </w:r>
+          </w:p>
+          <w:p>
+            <w:pPr>
+              <w:pStyle w:val="ListBullet"/>
+              <w:keepNext/>
+              <w:spacing w:after="20"/>
+            </w:pPr>
+            <w:r>
+              <w:rPr>
+                <w:b w:val="0"/>
+                <w:i w:val="0"/>
+                <w:color w:val="1F2328"/>
+                <w:sz w:val="21"/>
+              </w:rPr>
+              <w:t>R9–R15: 8 GB de memória, custo em duas unidades, confinamento, testes sem internet, isolamento de falhas, teto de gasto, fornecedor trocável</w:t>
+            </w:r>
+          </w:p>
+          <w:p>
+            <w:pPr>
+              <w:pStyle w:val="ListBullet"/>
+              <w:keepNext/>
+              <w:spacing w:after="20"/>
+            </w:pPr>
+            <w:r>
+              <w:rPr>
+                <w:b w:val="0"/>
+                <w:i w:val="0"/>
+                <w:color w:val="1F2328"/>
+                <w:sz w:val="21"/>
+              </w:rPr>
+              <w:t>Cada linha traz a etapa responsável (E2–E7) e o teste que prova o requisito</w:t>
+            </w:r>
+          </w:p>
+          <w:p>
+            <w:pPr>
+              <w:keepNext/>
+              <w:spacing w:before="80" w:after="0"/>
+            </w:pPr>
+            <w:r>
+              <w:rPr>
+                <w:b/>
+                <w:i w:val="0"/>
+                <w:color w:val="4A6FA5"/>
+                <w:sz w:val="22"/>
+              </w:rPr>
+              <w:t xml:space="preserve">Verificar   </w:t>
+            </w:r>
+            <w:r>
+              <w:rPr>
+                <w:rFonts w:ascii="Consolas" w:hAnsi="Consolas"/>
+                <w:b w:val="0"/>
+                <w:i w:val="0"/>
+                <w:color w:val="1F2328"/>
                 <w:sz w:val="19"/>
               </w:rPr>
-              <w:t>FAB-102</w:t>
+              <w:t>docs/planejamento/requisitos.md</w:t>
             </w:r>
           </w:p>
         </w:tc>
+      </w:tr>
+    </w:tbl>
+    <w:p>
+      <w:pPr>
+        <w:spacing w:before="0" w:after="120"/>
+      </w:pPr>
+    </w:p>
+    <w:tbl>
+      <w:tblPr>
+        <w:tblW w:type="auto" w:w="0"/>
+        <w:jc w:val="center"/>
+        <w:tblLayout w:type="fixed"/>
+        <w:tblLook w:firstColumn="1" w:firstRow="1" w:lastColumn="0" w:lastRow="0" w:noHBand="0" w:noVBand="1" w:val="04A0"/>
+        <w:tblBorders>
+          <w:top w:val="nil"/>
+          <w:left w:val="nil"/>
+          <w:bottom w:val="nil"/>
+          <w:right w:val="nil"/>
+          <w:insideH w:val="nil"/>
+          <w:insideV w:val="nil"/>
+        </w:tblBorders>
+      </w:tblPr>
+      <w:tblGrid>
+        <w:gridCol w:w="11622"/>
+        <w:gridCol w:w="3402"/>
+      </w:tblGrid>
+      <w:tr>
+        <w:trPr>
+          <w:cantSplit/>
+        </w:trPr>
         <w:tc>
           <w:tcPr>
-            <w:tcW w:type="dxa" w:w="907"/>
+            <w:tcW w:type="dxa" w:w="11622"/>
+            <w:shd w:val="clear" w:color="auto" w:fill="1B2A41"/>
+            <w:tcMar>
+              <w:top w:w="158" w:type="dxa"/>
+              <w:left w:w="158" w:type="dxa"/>
+              <w:bottom w:w="158" w:type="dxa"/>
+              <w:right w:w="158" w:type="dxa"/>
+            </w:tcMar>
           </w:tcPr>
           <w:p>
+            <w:pPr>
+              <w:keepNext/>
+              <w:spacing w:before="0" w:after="0"/>
+            </w:pPr>
             <w:r>
               <w:rPr>
-                <w:sz w:val="19"/>
+                <w:rFonts w:ascii="Consolas" w:hAnsi="Consolas"/>
+                <w:b/>
+                <w:i w:val="0"/>
+                <w:color w:val="E9A23B"/>
+                <w:sz w:val="24"/>
               </w:rPr>
-              <w:t>1.2</w:t>
+              <w:t xml:space="preserve">FAB-102   </w:t>
             </w:r>
-          </w:p>
-        </w:tc>
-        <w:tc>
-          <w:tcPr>
-            <w:tcW w:type="dxa" w:w="5783"/>
-          </w:tcPr>
-          <w:p>
             <w:r>
               <w:rPr>
-                <w:sz w:val="19"/>
+                <w:b/>
+                <w:i w:val="0"/>
+                <w:color w:val="FFFFFF"/>
+                <w:sz w:val="27"/>
               </w:rPr>
               <w:t>Estudar o estado da arte</w:t>
             </w:r>
@@ -295,54 +1110,217 @@
         </w:tc>
         <w:tc>
           <w:tcPr>
-            <w:tcW w:type="dxa" w:w="1474"/>
-            <w:shd w:val="clear" w:color="auto" w:fill="E3F3E8"/>
+            <w:tcW w:type="dxa" w:w="3402"/>
+            <w:shd w:val="clear" w:color="auto" w:fill="2A9D8F"/>
+            <w:tcMar>
+              <w:top w:w="158" w:type="dxa"/>
+              <w:left w:w="158" w:type="dxa"/>
+              <w:bottom w:w="158" w:type="dxa"/>
+              <w:right w:w="158" w:type="dxa"/>
+            </w:tcMar>
           </w:tcPr>
           <w:p>
+            <w:pPr>
+              <w:keepNext/>
+              <w:spacing w:before="0" w:after="0"/>
+              <w:jc w:val="center"/>
+            </w:pPr>
             <w:r>
               <w:rPr>
-                <w:sz w:val="19"/>
+                <w:b/>
+                <w:i w:val="0"/>
+                <w:color w:val="FFFFFF"/>
+                <w:sz w:val="25"/>
               </w:rPr>
-              <w:t>Concluída</w:t>
+              <w:t>✓ Concluída</w:t>
             </w:r>
           </w:p>
         </w:tc>
       </w:tr>
       <w:tr>
+        <w:trPr>
+          <w:cantSplit/>
+        </w:trPr>
         <w:tc>
           <w:tcPr>
-            <w:tcW w:type="dxa" w:w="1247"/>
+            <w:tcW w:type="dxa" w:w="15024"/>
+            <w:gridSpan w:val="2"/>
+            <w:shd w:val="clear" w:color="auto" w:fill="F2F4F7"/>
+            <w:tcMar>
+              <w:top w:w="198" w:type="dxa"/>
+              <w:left w:w="198" w:type="dxa"/>
+              <w:bottom w:w="198" w:type="dxa"/>
+              <w:right w:w="198" w:type="dxa"/>
+            </w:tcMar>
           </w:tcPr>
           <w:p>
+            <w:pPr>
+              <w:keepNext/>
+              <w:spacing w:before="0" w:after="80"/>
+            </w:pPr>
             <w:r>
               <w:rPr>
+                <w:b/>
+                <w:i w:val="0"/>
+                <w:color w:val="4A6FA5"/>
+                <w:sz w:val="22"/>
+              </w:rPr>
+              <w:t xml:space="preserve">O que é   </w:t>
+            </w:r>
+            <w:r>
+              <w:rPr>
+                <w:b w:val="0"/>
+                <w:i w:val="0"/>
+                <w:color w:val="1F2328"/>
+                <w:sz w:val="23"/>
+              </w:rPr>
+              <w:t>Comparação arquitetural com os sistemas multi-agente que constroem software, com destaque para o mais próximo, e o que este trabalho faz de diferente.</w:t>
+            </w:r>
+          </w:p>
+          <w:p>
+            <w:pPr>
+              <w:keepNext/>
+              <w:spacing w:before="0" w:after="80"/>
+            </w:pPr>
+            <w:r>
+              <w:rPr>
+                <w:b/>
+                <w:i w:val="0"/>
+                <w:color w:val="4A6FA5"/>
+                <w:sz w:val="22"/>
+              </w:rPr>
+              <w:t xml:space="preserve">Por que   </w:t>
+            </w:r>
+            <w:r>
+              <w:rPr>
+                <w:b w:val="0"/>
+                <w:i w:val="0"/>
+                <w:color w:val="1F2328"/>
+                <w:sz w:val="23"/>
+              </w:rPr>
+              <w:t>Delimita a originalidade: a contribuição não é 'usar agentes', e sim mover as regras de governança do texto do pedido para a estrutura do programa.</w:t>
+            </w:r>
+          </w:p>
+          <w:p>
+            <w:pPr>
+              <w:pStyle w:val="ListBullet"/>
+              <w:keepNext/>
+              <w:spacing w:after="20"/>
+            </w:pPr>
+            <w:r>
+              <w:rPr>
+                <w:b w:val="0"/>
+                <w:i w:val="0"/>
+                <w:color w:val="1F2328"/>
+                <w:sz w:val="21"/>
+              </w:rPr>
+              <w:t>Quatro sistemas comparados pela arquitetura, não por recursos</w:t>
+            </w:r>
+          </w:p>
+          <w:p>
+            <w:pPr>
+              <w:pStyle w:val="ListBullet"/>
+              <w:keepNext/>
+              <w:spacing w:after="20"/>
+            </w:pPr>
+            <w:r>
+              <w:rPr>
+                <w:b w:val="0"/>
+                <w:i w:val="0"/>
+                <w:color w:val="1F2328"/>
+                <w:sz w:val="21"/>
+              </w:rPr>
+              <w:t>Diferenças centrais: dois portões com perguntas diferentes, autoridade como ausência de ferramenta, escada de resposta à falha</w:t>
+            </w:r>
+          </w:p>
+          <w:p>
+            <w:pPr>
+              <w:keepNext/>
+              <w:spacing w:before="80" w:after="0"/>
+            </w:pPr>
+            <w:r>
+              <w:rPr>
+                <w:b/>
+                <w:i w:val="0"/>
+                <w:color w:val="4A6FA5"/>
+                <w:sz w:val="22"/>
+              </w:rPr>
+              <w:t xml:space="preserve">Verificar   </w:t>
+            </w:r>
+            <w:r>
+              <w:rPr>
+                <w:rFonts w:ascii="Consolas" w:hAnsi="Consolas"/>
+                <w:b w:val="0"/>
+                <w:i w:val="0"/>
+                <w:color w:val="1F2328"/>
                 <w:sz w:val="19"/>
               </w:rPr>
-              <w:t>FAB-103</w:t>
+              <w:t>docs/planejamento/estado-da-arte-resumo.pdf    docs/planejamento/estado-da-arte-completo.pdf</w:t>
             </w:r>
           </w:p>
         </w:tc>
+      </w:tr>
+    </w:tbl>
+    <w:p>
+      <w:pPr>
+        <w:spacing w:before="0" w:after="120"/>
+      </w:pPr>
+    </w:p>
+    <w:tbl>
+      <w:tblPr>
+        <w:tblW w:type="auto" w:w="0"/>
+        <w:jc w:val="center"/>
+        <w:tblLayout w:type="fixed"/>
+        <w:tblLook w:firstColumn="1" w:firstRow="1" w:lastColumn="0" w:lastRow="0" w:noHBand="0" w:noVBand="1" w:val="04A0"/>
+        <w:tblBorders>
+          <w:top w:val="nil"/>
+          <w:left w:val="nil"/>
+          <w:bottom w:val="nil"/>
+          <w:right w:val="nil"/>
+          <w:insideH w:val="nil"/>
+          <w:insideV w:val="nil"/>
+        </w:tblBorders>
+      </w:tblPr>
+      <w:tblGrid>
+        <w:gridCol w:w="11622"/>
+        <w:gridCol w:w="3402"/>
+      </w:tblGrid>
+      <w:tr>
+        <w:trPr>
+          <w:cantSplit/>
+        </w:trPr>
         <w:tc>
           <w:tcPr>
-            <w:tcW w:type="dxa" w:w="907"/>
+            <w:tcW w:type="dxa" w:w="11622"/>
+            <w:shd w:val="clear" w:color="auto" w:fill="1B2A41"/>
+            <w:tcMar>
+              <w:top w:w="158" w:type="dxa"/>
+              <w:left w:w="158" w:type="dxa"/>
+              <w:bottom w:w="158" w:type="dxa"/>
+              <w:right w:w="158" w:type="dxa"/>
+            </w:tcMar>
           </w:tcPr>
           <w:p>
+            <w:pPr>
+              <w:keepNext/>
+              <w:spacing w:before="0" w:after="0"/>
+            </w:pPr>
             <w:r>
               <w:rPr>
-                <w:sz w:val="19"/>
+                <w:rFonts w:ascii="Consolas" w:hAnsi="Consolas"/>
+                <w:b/>
+                <w:i w:val="0"/>
+                <w:color w:val="E9A23B"/>
+                <w:sz w:val="24"/>
               </w:rPr>
-              <w:t>1.3</w:t>
+              <w:t xml:space="preserve">FAB-103   </w:t>
             </w:r>
-          </w:p>
-        </w:tc>
-        <w:tc>
-          <w:tcPr>
-            <w:tcW w:type="dxa" w:w="5783"/>
-          </w:tcPr>
-          <w:p>
             <w:r>
               <w:rPr>
-                <w:sz w:val="19"/>
+                <w:b/>
+                <w:i w:val="0"/>
+                <w:color w:val="FFFFFF"/>
+                <w:sz w:val="27"/>
               </w:rPr>
               <w:t>Desenhar a arquitetura</w:t>
             </w:r>
@@ -350,54 +1328,233 @@
         </w:tc>
         <w:tc>
           <w:tcPr>
-            <w:tcW w:type="dxa" w:w="1474"/>
-            <w:shd w:val="clear" w:color="auto" w:fill="E3F3E8"/>
+            <w:tcW w:type="dxa" w:w="3402"/>
+            <w:shd w:val="clear" w:color="auto" w:fill="2A9D8F"/>
+            <w:tcMar>
+              <w:top w:w="158" w:type="dxa"/>
+              <w:left w:w="158" w:type="dxa"/>
+              <w:bottom w:w="158" w:type="dxa"/>
+              <w:right w:w="158" w:type="dxa"/>
+            </w:tcMar>
           </w:tcPr>
           <w:p>
+            <w:pPr>
+              <w:keepNext/>
+              <w:spacing w:before="0" w:after="0"/>
+              <w:jc w:val="center"/>
+            </w:pPr>
             <w:r>
               <w:rPr>
-                <w:sz w:val="19"/>
+                <w:b/>
+                <w:i w:val="0"/>
+                <w:color w:val="FFFFFF"/>
+                <w:sz w:val="25"/>
               </w:rPr>
-              <w:t>Concluída</w:t>
+              <w:t>✓ Concluída</w:t>
             </w:r>
           </w:p>
         </w:tc>
       </w:tr>
       <w:tr>
+        <w:trPr>
+          <w:cantSplit/>
+        </w:trPr>
         <w:tc>
           <w:tcPr>
-            <w:tcW w:type="dxa" w:w="1247"/>
+            <w:tcW w:type="dxa" w:w="15024"/>
+            <w:gridSpan w:val="2"/>
+            <w:shd w:val="clear" w:color="auto" w:fill="F2F4F7"/>
+            <w:tcMar>
+              <w:top w:w="198" w:type="dxa"/>
+              <w:left w:w="198" w:type="dxa"/>
+              <w:bottom w:w="198" w:type="dxa"/>
+              <w:right w:w="198" w:type="dxa"/>
+            </w:tcMar>
           </w:tcPr>
           <w:p>
+            <w:pPr>
+              <w:keepNext/>
+              <w:spacing w:before="0" w:after="80"/>
+            </w:pPr>
             <w:r>
               <w:rPr>
+                <w:b/>
+                <w:i w:val="0"/>
+                <w:color w:val="4A6FA5"/>
+                <w:sz w:val="22"/>
+              </w:rPr>
+              <w:t xml:space="preserve">O que é   </w:t>
+            </w:r>
+            <w:r>
+              <w:rPr>
+                <w:b w:val="0"/>
+                <w:i w:val="0"/>
+                <w:color w:val="1F2328"/>
+                <w:sz w:val="23"/>
+              </w:rPr>
+              <w:t>Desenho do sistema: quatro camadas (tela, motor, agentes, fronteiras), o ciclo de vida da tarefa em seis estados com dois portões, a escada de resposta à falha e a pilha de tecnologia.</w:t>
+            </w:r>
+          </w:p>
+          <w:p>
+            <w:pPr>
+              <w:keepNext/>
+              <w:spacing w:before="0" w:after="80"/>
+            </w:pPr>
+            <w:r>
+              <w:rPr>
+                <w:b/>
+                <w:i w:val="0"/>
+                <w:color w:val="4A6FA5"/>
+                <w:sz w:val="22"/>
+              </w:rPr>
+              <w:t xml:space="preserve">Por que   </w:t>
+            </w:r>
+            <w:r>
+              <w:rPr>
+                <w:b w:val="0"/>
+                <w:i w:val="0"/>
+                <w:color w:val="1F2328"/>
+                <w:sz w:val="23"/>
+              </w:rPr>
+              <w:t>É a arquitetura que torna as regras estruturais: cada regra tem um lugar no desenho onde ela é imposta, e não pedida.</w:t>
+            </w:r>
+          </w:p>
+          <w:p>
+            <w:pPr>
+              <w:pStyle w:val="ListBullet"/>
+              <w:keepNext/>
+              <w:spacing w:after="20"/>
+            </w:pPr>
+            <w:r>
+              <w:rPr>
+                <w:b w:val="0"/>
+                <w:i w:val="0"/>
+                <w:color w:val="1F2328"/>
+                <w:sz w:val="21"/>
+              </w:rPr>
+              <w:t>Diagramas das camadas e da máquina de estados (Mermaid, renderizados no GitHub)</w:t>
+            </w:r>
+          </w:p>
+          <w:p>
+            <w:pPr>
+              <w:pStyle w:val="ListBullet"/>
+              <w:keepNext/>
+              <w:spacing w:after="20"/>
+            </w:pPr>
+            <w:r>
+              <w:rPr>
+                <w:b w:val="0"/>
+                <w:i w:val="0"/>
+                <w:color w:val="1F2328"/>
+                <w:sz w:val="21"/>
+              </w:rPr>
+              <w:t>Tabela 'a regra × onde ela mora'</w:t>
+            </w:r>
+          </w:p>
+          <w:p>
+            <w:pPr>
+              <w:pStyle w:val="ListBullet"/>
+              <w:keepNext/>
+              <w:spacing w:after="20"/>
+            </w:pPr>
+            <w:r>
+              <w:rPr>
+                <w:b w:val="0"/>
+                <w:i w:val="0"/>
+                <w:color w:val="1F2328"/>
+                <w:sz w:val="21"/>
+              </w:rPr>
+              <w:t>Escolha do Elixir/OTP justificada pela supervisão de processos</w:t>
+            </w:r>
+          </w:p>
+          <w:p>
+            <w:pPr>
+              <w:keepNext/>
+              <w:spacing w:before="80" w:after="0"/>
+            </w:pPr>
+            <w:r>
+              <w:rPr>
+                <w:b/>
+                <w:i w:val="0"/>
+                <w:color w:val="4A6FA5"/>
+                <w:sz w:val="22"/>
+              </w:rPr>
+              <w:t xml:space="preserve">Verificar   </w:t>
+            </w:r>
+            <w:r>
+              <w:rPr>
+                <w:rFonts w:ascii="Consolas" w:hAnsi="Consolas"/>
+                <w:b w:val="0"/>
+                <w:i w:val="0"/>
+                <w:color w:val="1F2328"/>
                 <w:sz w:val="19"/>
               </w:rPr>
-              <w:t>FAB-104</w:t>
+              <w:t>docs/planejamento/arquitetura.md</w:t>
             </w:r>
           </w:p>
         </w:tc>
+      </w:tr>
+    </w:tbl>
+    <w:p>
+      <w:pPr>
+        <w:spacing w:before="0" w:after="120"/>
+      </w:pPr>
+    </w:p>
+    <w:tbl>
+      <w:tblPr>
+        <w:tblW w:type="auto" w:w="0"/>
+        <w:jc w:val="center"/>
+        <w:tblLayout w:type="fixed"/>
+        <w:tblLook w:firstColumn="1" w:firstRow="1" w:lastColumn="0" w:lastRow="0" w:noHBand="0" w:noVBand="1" w:val="04A0"/>
+        <w:tblBorders>
+          <w:top w:val="nil"/>
+          <w:left w:val="nil"/>
+          <w:bottom w:val="nil"/>
+          <w:right w:val="nil"/>
+          <w:insideH w:val="nil"/>
+          <w:insideV w:val="nil"/>
+        </w:tblBorders>
+      </w:tblPr>
+      <w:tblGrid>
+        <w:gridCol w:w="11622"/>
+        <w:gridCol w:w="3402"/>
+      </w:tblGrid>
+      <w:tr>
+        <w:trPr>
+          <w:cantSplit/>
+        </w:trPr>
         <w:tc>
           <w:tcPr>
-            <w:tcW w:type="dxa" w:w="907"/>
+            <w:tcW w:type="dxa" w:w="11622"/>
+            <w:shd w:val="clear" w:color="auto" w:fill="1B2A41"/>
+            <w:tcMar>
+              <w:top w:w="158" w:type="dxa"/>
+              <w:left w:w="158" w:type="dxa"/>
+              <w:bottom w:w="158" w:type="dxa"/>
+              <w:right w:w="158" w:type="dxa"/>
+            </w:tcMar>
           </w:tcPr>
           <w:p>
+            <w:pPr>
+              <w:keepNext/>
+              <w:spacing w:before="0" w:after="0"/>
+            </w:pPr>
             <w:r>
               <w:rPr>
-                <w:sz w:val="19"/>
+                <w:rFonts w:ascii="Consolas" w:hAnsi="Consolas"/>
+                <w:b/>
+                <w:i w:val="0"/>
+                <w:color w:val="E9A23B"/>
+                <w:sz w:val="24"/>
               </w:rPr>
-              <w:t>1.4</w:t>
+              <w:t xml:space="preserve">FAB-104   </w:t>
             </w:r>
-          </w:p>
-        </w:tc>
-        <w:tc>
-          <w:tcPr>
-            <w:tcW w:type="dxa" w:w="5783"/>
-          </w:tcPr>
-          <w:p>
             <w:r>
               <w:rPr>
-                <w:sz w:val="19"/>
+                <w:b/>
+                <w:i w:val="0"/>
+                <w:color w:val="FFFFFF"/>
+                <w:sz w:val="27"/>
               </w:rPr>
               <w:t>Dividir o trabalho e definir os critérios de desempenho</w:t>
             </w:r>
@@ -405,54 +1562,233 @@
         </w:tc>
         <w:tc>
           <w:tcPr>
-            <w:tcW w:type="dxa" w:w="1474"/>
-            <w:shd w:val="clear" w:color="auto" w:fill="E3F3E8"/>
+            <w:tcW w:type="dxa" w:w="3402"/>
+            <w:shd w:val="clear" w:color="auto" w:fill="2A9D8F"/>
+            <w:tcMar>
+              <w:top w:w="158" w:type="dxa"/>
+              <w:left w:w="158" w:type="dxa"/>
+              <w:bottom w:w="158" w:type="dxa"/>
+              <w:right w:w="158" w:type="dxa"/>
+            </w:tcMar>
           </w:tcPr>
           <w:p>
+            <w:pPr>
+              <w:keepNext/>
+              <w:spacing w:before="0" w:after="0"/>
+              <w:jc w:val="center"/>
+            </w:pPr>
             <w:r>
               <w:rPr>
-                <w:sz w:val="19"/>
+                <w:b/>
+                <w:i w:val="0"/>
+                <w:color w:val="FFFFFF"/>
+                <w:sz w:val="25"/>
               </w:rPr>
-              <w:t>Concluída</w:t>
+              <w:t>✓ Concluída</w:t>
             </w:r>
           </w:p>
         </w:tc>
       </w:tr>
       <w:tr>
+        <w:trPr>
+          <w:cantSplit/>
+        </w:trPr>
         <w:tc>
           <w:tcPr>
-            <w:tcW w:type="dxa" w:w="1247"/>
+            <w:tcW w:type="dxa" w:w="15024"/>
+            <w:gridSpan w:val="2"/>
+            <w:shd w:val="clear" w:color="auto" w:fill="F2F4F7"/>
+            <w:tcMar>
+              <w:top w:w="198" w:type="dxa"/>
+              <w:left w:w="198" w:type="dxa"/>
+              <w:bottom w:w="198" w:type="dxa"/>
+              <w:right w:w="198" w:type="dxa"/>
+            </w:tcMar>
           </w:tcPr>
           <w:p>
+            <w:pPr>
+              <w:keepNext/>
+              <w:spacing w:before="0" w:after="80"/>
+            </w:pPr>
             <w:r>
               <w:rPr>
+                <w:b/>
+                <w:i w:val="0"/>
+                <w:color w:val="4A6FA5"/>
+                <w:sz w:val="22"/>
+              </w:rPr>
+              <w:t xml:space="preserve">O que é   </w:t>
+            </w:r>
+            <w:r>
+              <w:rPr>
+                <w:b w:val="0"/>
+                <w:i w:val="0"/>
+                <w:color w:val="1F2328"/>
+                <w:sz w:val="23"/>
+              </w:rPr>
+              <w:t>O plano de desenvolvimento (10 etapas em cascata), os 8 critérios de desempenho com limite numérico e o quadro de tarefas de E2 a E7, uma tarefa por pacote do plano.</w:t>
+            </w:r>
+          </w:p>
+          <w:p>
+            <w:pPr>
+              <w:keepNext/>
+              <w:spacing w:before="0" w:after="80"/>
+            </w:pPr>
+            <w:r>
+              <w:rPr>
+                <w:b/>
+                <w:i w:val="0"/>
+                <w:color w:val="4A6FA5"/>
+                <w:sz w:val="22"/>
+              </w:rPr>
+              <w:t xml:space="preserve">Por que   </w:t>
+            </w:r>
+            <w:r>
+              <w:rPr>
+                <w:b w:val="0"/>
+                <w:i w:val="0"/>
+                <w:color w:val="1F2328"/>
+                <w:sz w:val="23"/>
+              </w:rPr>
+              <w:t>Os critérios são a régua da validação (E8–E10) e não mudam; o quadro de tarefas transforma cada etapa em entregas pequenas e verificáveis.</w:t>
+            </w:r>
+          </w:p>
+          <w:p>
+            <w:pPr>
+              <w:pStyle w:val="ListBullet"/>
+              <w:keepNext/>
+              <w:spacing w:after="20"/>
+            </w:pPr>
+            <w:r>
+              <w:rPr>
+                <w:b w:val="0"/>
+                <w:i w:val="0"/>
+                <w:color w:val="1F2328"/>
+                <w:sz w:val="21"/>
+              </w:rPr>
+              <w:t>Plano de desenvolvimento em Word</w:t>
+            </w:r>
+          </w:p>
+          <w:p>
+            <w:pPr>
+              <w:pStyle w:val="ListBullet"/>
+              <w:keepNext/>
+              <w:spacing w:after="20"/>
+            </w:pPr>
+            <w:r>
+              <w:rPr>
+                <w:b w:val="0"/>
+                <w:i w:val="0"/>
+                <w:color w:val="1F2328"/>
+                <w:sz w:val="21"/>
+              </w:rPr>
+              <w:t>8 critérios: constrói sozinho, conclui tarefas, pouco retrabalho, não aprova errado, governa de verdade, aguenta falha, custo sob controle, cabe na máquina</w:t>
+            </w:r>
+          </w:p>
+          <w:p>
+            <w:pPr>
+              <w:pStyle w:val="ListBullet"/>
+              <w:keepNext/>
+              <w:spacing w:after="20"/>
+            </w:pPr>
+            <w:r>
+              <w:rPr>
+                <w:b w:val="0"/>
+                <w:i w:val="0"/>
+                <w:color w:val="1F2328"/>
+                <w:sz w:val="21"/>
+              </w:rPr>
+              <w:t>39 tarefas de código distribuídas de E2 a E7</w:t>
+            </w:r>
+          </w:p>
+          <w:p>
+            <w:pPr>
+              <w:keepNext/>
+              <w:spacing w:before="80" w:after="0"/>
+            </w:pPr>
+            <w:r>
+              <w:rPr>
+                <w:b/>
+                <w:i w:val="0"/>
+                <w:color w:val="4A6FA5"/>
+                <w:sz w:val="22"/>
+              </w:rPr>
+              <w:t xml:space="preserve">Verificar   </w:t>
+            </w:r>
+            <w:r>
+              <w:rPr>
+                <w:rFonts w:ascii="Consolas" w:hAnsi="Consolas"/>
+                <w:b w:val="0"/>
+                <w:i w:val="0"/>
+                <w:color w:val="1F2328"/>
                 <w:sz w:val="19"/>
               </w:rPr>
-              <w:t>FAB-105</w:t>
+              <w:t>docs/planejamento/plano-de-desenvolvimento.docx    docs/planejamento/criterios-de-desempenho.md    docs/tasks/</w:t>
             </w:r>
           </w:p>
         </w:tc>
+      </w:tr>
+    </w:tbl>
+    <w:p>
+      <w:pPr>
+        <w:spacing w:before="0" w:after="120"/>
+      </w:pPr>
+    </w:p>
+    <w:tbl>
+      <w:tblPr>
+        <w:tblW w:type="auto" w:w="0"/>
+        <w:jc w:val="center"/>
+        <w:tblLayout w:type="fixed"/>
+        <w:tblLook w:firstColumn="1" w:firstRow="1" w:lastColumn="0" w:lastRow="0" w:noHBand="0" w:noVBand="1" w:val="04A0"/>
+        <w:tblBorders>
+          <w:top w:val="nil"/>
+          <w:left w:val="nil"/>
+          <w:bottom w:val="nil"/>
+          <w:right w:val="nil"/>
+          <w:insideH w:val="nil"/>
+          <w:insideV w:val="nil"/>
+        </w:tblBorders>
+      </w:tblPr>
+      <w:tblGrid>
+        <w:gridCol w:w="11622"/>
+        <w:gridCol w:w="3402"/>
+      </w:tblGrid>
+      <w:tr>
+        <w:trPr>
+          <w:cantSplit/>
+        </w:trPr>
         <w:tc>
           <w:tcPr>
-            <w:tcW w:type="dxa" w:w="907"/>
+            <w:tcW w:type="dxa" w:w="11622"/>
+            <w:shd w:val="clear" w:color="auto" w:fill="1B2A41"/>
+            <w:tcMar>
+              <w:top w:w="158" w:type="dxa"/>
+              <w:left w:w="158" w:type="dxa"/>
+              <w:bottom w:w="158" w:type="dxa"/>
+              <w:right w:w="158" w:type="dxa"/>
+            </w:tcMar>
           </w:tcPr>
           <w:p>
+            <w:pPr>
+              <w:keepNext/>
+              <w:spacing w:before="0" w:after="0"/>
+            </w:pPr>
             <w:r>
               <w:rPr>
-                <w:sz w:val="19"/>
+                <w:rFonts w:ascii="Consolas" w:hAnsi="Consolas"/>
+                <w:b/>
+                <w:i w:val="0"/>
+                <w:color w:val="E9A23B"/>
+                <w:sz w:val="24"/>
               </w:rPr>
-              <w:t>1.4</w:t>
+              <w:t xml:space="preserve">FAB-105   </w:t>
             </w:r>
-          </w:p>
-        </w:tc>
-        <w:tc>
-          <w:tcPr>
-            <w:tcW w:type="dxa" w:w="5783"/>
-          </w:tcPr>
-          <w:p>
             <w:r>
               <w:rPr>
-                <w:sz w:val="19"/>
+                <w:b/>
+                <w:i w:val="0"/>
+                <w:color w:val="FFFFFF"/>
+                <w:sz w:val="27"/>
               </w:rPr>
               <w:t>Definir os cinco projetos de teste</w:t>
             </w:r>
@@ -460,15 +1796,152 @@
         </w:tc>
         <w:tc>
           <w:tcPr>
-            <w:tcW w:type="dxa" w:w="1474"/>
-            <w:shd w:val="clear" w:color="auto" w:fill="FBF0DC"/>
+            <w:tcW w:type="dxa" w:w="3402"/>
+            <w:shd w:val="clear" w:color="auto" w:fill="E9A23B"/>
+            <w:tcMar>
+              <w:top w:w="158" w:type="dxa"/>
+              <w:left w:w="158" w:type="dxa"/>
+              <w:bottom w:w="158" w:type="dxa"/>
+              <w:right w:w="158" w:type="dxa"/>
+            </w:tcMar>
           </w:tcPr>
           <w:p>
+            <w:pPr>
+              <w:keepNext/>
+              <w:spacing w:before="0" w:after="0"/>
+              <w:jc w:val="center"/>
+            </w:pPr>
             <w:r>
               <w:rPr>
+                <w:b/>
+                <w:i w:val="0"/>
+                <w:color w:val="FFFFFF"/>
+                <w:sz w:val="25"/>
+              </w:rPr>
+              <w:t>■ Em andamento</w:t>
+            </w:r>
+          </w:p>
+        </w:tc>
+      </w:tr>
+      <w:tr>
+        <w:trPr>
+          <w:cantSplit/>
+        </w:trPr>
+        <w:tc>
+          <w:tcPr>
+            <w:tcW w:type="dxa" w:w="15024"/>
+            <w:gridSpan w:val="2"/>
+            <w:shd w:val="clear" w:color="auto" w:fill="F2F4F7"/>
+            <w:tcMar>
+              <w:top w:w="198" w:type="dxa"/>
+              <w:left w:w="198" w:type="dxa"/>
+              <w:bottom w:w="198" w:type="dxa"/>
+              <w:right w:w="198" w:type="dxa"/>
+            </w:tcMar>
+          </w:tcPr>
+          <w:p>
+            <w:pPr>
+              <w:keepNext/>
+              <w:spacing w:before="0" w:after="80"/>
+            </w:pPr>
+            <w:r>
+              <w:rPr>
+                <w:b/>
+                <w:i w:val="0"/>
+                <w:color w:val="4A6FA5"/>
+                <w:sz w:val="22"/>
+              </w:rPr>
+              <w:t xml:space="preserve">O que é   </w:t>
+            </w:r>
+            <w:r>
+              <w:rPr>
+                <w:b w:val="0"/>
+                <w:i w:val="0"/>
+                <w:color w:val="1F2328"/>
+                <w:sz w:val="23"/>
+              </w:rPr>
+              <w:t>Proposta de cinco projetos reais, de tamanhos e tipos diferentes, que a validação vai executar do pedido à entrega sem intervenção humana.</w:t>
+            </w:r>
+          </w:p>
+          <w:p>
+            <w:pPr>
+              <w:keepNext/>
+              <w:spacing w:before="0" w:after="80"/>
+            </w:pPr>
+            <w:r>
+              <w:rPr>
+                <w:b/>
+                <w:i w:val="0"/>
+                <w:color w:val="4A6FA5"/>
+                <w:sz w:val="22"/>
+              </w:rPr>
+              <w:t xml:space="preserve">Por que   </w:t>
+            </w:r>
+            <w:r>
+              <w:rPr>
+                <w:b w:val="0"/>
+                <w:i w:val="0"/>
+                <w:color w:val="1F2328"/>
+                <w:sz w:val="23"/>
+              </w:rPr>
+              <w:t>Os critérios de desempenho são medidos nesses projetos; escolhê-los antes da construção evita ajustar a régua ao sistema.</w:t>
+            </w:r>
+          </w:p>
+          <w:p>
+            <w:pPr>
+              <w:pStyle w:val="ListBullet"/>
+              <w:keepNext/>
+              <w:spacing w:after="20"/>
+            </w:pPr>
+            <w:r>
+              <w:rPr>
+                <w:b w:val="0"/>
+                <w:i w:val="0"/>
+                <w:color w:val="1F2328"/>
+                <w:sz w:val="21"/>
+              </w:rPr>
+              <w:t>P1 lista de tarefas em terminal · P2 API de biblioteca · P3 relatório a partir de planilha · P4 site de portfólio · P5 apresentação a partir de dados</w:t>
+            </w:r>
+          </w:p>
+          <w:p>
+            <w:pPr>
+              <w:pStyle w:val="ListBullet"/>
+              <w:keepNext/>
+              <w:spacing w:after="20"/>
+            </w:pPr>
+            <w:r>
+              <w:rPr>
+                <w:b w:val="0"/>
+                <w:i w:val="0"/>
+                <w:color w:val="1F2328"/>
+                <w:sz w:val="21"/>
+              </w:rPr>
+              <w:t>Cada projeto tem o pedido em linguagem natural e o que conta como entregue</w:t>
+            </w:r>
+          </w:p>
+          <w:p>
+            <w:pPr>
+              <w:keepNext/>
+              <w:spacing w:before="80" w:after="0"/>
+            </w:pPr>
+            <w:r>
+              <w:rPr>
+                <w:b/>
+                <w:i w:val="0"/>
+                <w:color w:val="4A6FA5"/>
+                <w:sz w:val="22"/>
+              </w:rPr>
+              <w:t xml:space="preserve">Verificar   </w:t>
+            </w:r>
+            <w:r>
+              <w:rPr>
+                <w:rFonts w:ascii="Consolas" w:hAnsi="Consolas"/>
+                <w:b w:val="0"/>
+                <w:i w:val="0"/>
+                <w:color w:val="1F2328"/>
                 <w:sz w:val="19"/>
               </w:rPr>
-              <w:t>Em andamento</w:t>
+              <w:t>docs/planejamento/projetos-de-teste.md</w:t>
             </w:r>
           </w:p>
         </w:tc>
@@ -476,13 +1949,201 @@
     </w:tbl>
     <w:p>
       <w:pPr>
-        <w:pStyle w:val="Heading1"/>
+        <w:spacing w:before="0" w:after="120"/>
+      </w:pPr>
+    </w:p>
+    <w:p>
+      <w:pPr>
+        <w:pageBreakBefore/>
+        <w:spacing w:before="0" w:after="40"/>
       </w:pPr>
       <w:r>
         <w:rPr>
-          <w:color w:val="2A78D6"/>
+          <w:rFonts w:ascii="Cambria" w:hAnsi="Cambria"/>
+          <w:b/>
+          <w:i w:val="0"/>
+          <w:color w:val="1B2A41"/>
+          <w:sz w:val="48"/>
         </w:rPr>
-        <w:t>Como foi feito</w:t>
+        <w:t>Como se prova a entrega</w:t>
+      </w:r>
+    </w:p>
+    <w:p>
+      <w:pPr>
+        <w:spacing w:before="0" w:after="200"/>
+      </w:pPr>
+      <w:r>
+        <w:rPr>
+          <w:b w:val="0"/>
+          <w:i w:val="0"/>
+          <w:color w:val="6B7480"/>
+          <w:sz w:val="25"/>
+        </w:rPr>
+        <w:t>A entrega combinada no plano, demonstrada por um teste ou execução real.</w:t>
+      </w:r>
+    </w:p>
+    <w:tbl>
+      <w:tblPr>
+        <w:tblW w:type="auto" w:w="0"/>
+        <w:jc w:val="center"/>
+        <w:tblLayout w:type="fixed"/>
+        <w:tblLook w:firstColumn="1" w:firstRow="1" w:lastColumn="0" w:lastRow="0" w:noHBand="0" w:noVBand="1" w:val="04A0"/>
+        <w:tblBorders>
+          <w:top w:val="nil"/>
+          <w:left w:val="nil"/>
+          <w:bottom w:val="nil"/>
+          <w:right w:val="nil"/>
+          <w:insideH w:val="nil"/>
+          <w:insideV w:val="nil"/>
+        </w:tblBorders>
+      </w:tblPr>
+      <w:tblGrid>
+        <w:gridCol w:w="15024"/>
+      </w:tblGrid>
+      <w:tr>
+        <w:tc>
+          <w:tcPr>
+            <w:tcW w:type="dxa" w:w="15024"/>
+            <w:shd w:val="clear" w:color="auto" w:fill="1B2A41"/>
+            <w:tcMar>
+              <w:top w:w="255" w:type="dxa"/>
+              <w:left w:w="255" w:type="dxa"/>
+              <w:bottom w:w="255" w:type="dxa"/>
+              <w:right w:w="255" w:type="dxa"/>
+            </w:tcMar>
+          </w:tcPr>
+          <w:p>
+            <w:pPr>
+              <w:spacing w:before="0" w:after="80"/>
+            </w:pPr>
+            <w:r>
+              <w:rPr>
+                <w:b/>
+                <w:i w:val="0"/>
+                <w:color w:val="FFFFFF"/>
+                <w:sz w:val="21"/>
+              </w:rPr>
+              <w:t>ENTREGA COMBINADA</w:t>
+            </w:r>
+          </w:p>
+          <w:p>
+            <w:pPr>
+              <w:spacing w:before="0" w:after="0"/>
+            </w:pPr>
+            <w:r>
+              <w:rPr>
+                <w:rFonts w:ascii="Cambria" w:hAnsi="Cambria"/>
+                <w:b/>
+                <w:i w:val="0"/>
+                <w:color w:val="FFFFFF"/>
+                <w:sz w:val="32"/>
+              </w:rPr>
+              <w:t>Requisitos, arquitetura, tarefas, critérios e projetos de teste aprovados.</w:t>
+            </w:r>
+          </w:p>
+        </w:tc>
+      </w:tr>
+    </w:tbl>
+    <w:p>
+      <w:pPr>
+        <w:spacing w:before="0" w:after="160"/>
+      </w:pPr>
+    </w:p>
+    <w:p>
+      <w:pPr>
+        <w:spacing w:before="0" w:after="120"/>
+      </w:pPr>
+    </w:p>
+    <w:tbl>
+      <w:tblPr>
+        <w:tblW w:type="auto" w:w="0"/>
+        <w:jc w:val="center"/>
+        <w:tblLayout w:type="fixed"/>
+        <w:tblLook w:firstColumn="1" w:firstRow="1" w:lastColumn="0" w:lastRow="0" w:noHBand="0" w:noVBand="1" w:val="04A0"/>
+        <w:tblBorders>
+          <w:top w:val="nil"/>
+          <w:left w:val="nil"/>
+          <w:bottom w:val="nil"/>
+          <w:right w:val="nil"/>
+          <w:insideH w:val="nil"/>
+          <w:insideV w:val="nil"/>
+        </w:tblBorders>
+      </w:tblPr>
+      <w:tblGrid>
+        <w:gridCol w:w="15024"/>
+      </w:tblGrid>
+      <w:tr>
+        <w:tc>
+          <w:tcPr>
+            <w:tcW w:type="dxa" w:w="15024"/>
+            <w:shd w:val="clear" w:color="auto" w:fill="EEF2F7"/>
+            <w:tcMar>
+              <w:top w:w="198" w:type="dxa"/>
+              <w:left w:w="198" w:type="dxa"/>
+              <w:bottom w:w="198" w:type="dxa"/>
+              <w:right w:w="198" w:type="dxa"/>
+            </w:tcMar>
+          </w:tcPr>
+          <w:p>
+            <w:pPr>
+              <w:spacing w:before="0" w:after="60"/>
+            </w:pPr>
+            <w:r>
+              <w:rPr>
+                <w:b/>
+                <w:i w:val="0"/>
+                <w:color w:val="4A6FA5"/>
+                <w:sz w:val="21"/>
+              </w:rPr>
+              <w:t>COMO DEMONSTRAR</w:t>
+            </w:r>
+          </w:p>
+          <w:p>
+            <w:pPr>
+              <w:spacing w:before="0" w:after="0"/>
+            </w:pPr>
+            <w:r>
+              <w:rPr>
+                <w:rFonts w:ascii="Consolas" w:hAnsi="Consolas"/>
+                <w:b w:val="0"/>
+                <w:i w:val="0"/>
+                <w:color w:val="1F2328"/>
+                <w:sz w:val="24"/>
+              </w:rPr>
+              <w:t>Documentos em docs/planejamento/ e o quadro de tarefas em docs/tasks/.</w:t>
+            </w:r>
+          </w:p>
+        </w:tc>
+      </w:tr>
+    </w:tbl>
+    <w:p>
+      <w:pPr>
+        <w:pageBreakBefore/>
+        <w:spacing w:before="0" w:after="40"/>
+      </w:pPr>
+      <w:r>
+        <w:rPr>
+          <w:rFonts w:ascii="Cambria" w:hAnsi="Cambria"/>
+          <w:b/>
+          <w:i w:val="0"/>
+          <w:color w:val="1B2A41"/>
+          <w:sz w:val="48"/>
+        </w:rPr>
+        <w:t>Requisitos, pendências e próxima etapa</w:t>
+      </w:r>
+    </w:p>
+    <w:p>
+      <w:pPr>
+        <w:spacing w:before="0" w:after="80"/>
+      </w:pPr>
+      <w:r>
+        <w:rPr>
+          <w:b/>
+          <w:i w:val="0"/>
+          <w:color w:val="1B2A41"/>
+          <w:sz w:val="28"/>
+        </w:rPr>
+        <w:t>O que ainda falta</w:t>
       </w:r>
     </w:p>
     <w:p>
@@ -490,115 +2151,156 @@
         <w:pStyle w:val="ListBullet"/>
       </w:pPr>
       <w:r>
-        <w:t>15 requisitos: 8 funcionais (R1–R8) e 7 restrições (R9–R15), cada um com etapa e forma de verificar.</w:t>
+        <w:rPr>
+          <w:b w:val="0"/>
+          <w:i w:val="0"/>
+          <w:color w:val="1F2328"/>
+          <w:sz w:val="24"/>
+        </w:rPr>
+        <w:t>Validar com o orientador a proposta dos cinco projetos de teste (FAB-105).</w:t>
       </w:r>
     </w:p>
     <w:p>
       <w:pPr>
-        <w:pStyle w:val="ListBullet"/>
+        <w:spacing w:before="0" w:after="200"/>
       </w:pPr>
-      <w:r>
-        <w:t>Arquitetura em 4 camadas (tela, motor, agentes, fronteiras) sobre um único banco PostgreSQL.</w:t>
-      </w:r>
     </w:p>
-    <w:p>
-      <w:pPr>
-        <w:pStyle w:val="ListBullet"/>
-      </w:pPr>
-      <w:r>
-        <w:t>Ciclo de vida da tarefa com 6 estados e 2 portões independentes; escada de 4 degraus para falhas.</w:t>
-      </w:r>
-    </w:p>
-    <w:p>
-      <w:pPr>
-        <w:pStyle w:val="ListBullet"/>
-      </w:pPr>
-      <w:r>
-        <w:t>Pilha Elixir/OTP escolhida pela supervisão de processos: cada agente é um processo isolado.</w:t>
-      </w:r>
-    </w:p>
-    <w:p>
-      <w:pPr>
-        <w:pStyle w:val="ListBullet"/>
-      </w:pPr>
-      <w:r>
-        <w:t>Trabalho de E2–E7 decomposto em 39 tarefas, uma por pacote do plano, com critérios executáveis.</w:t>
-      </w:r>
-    </w:p>
-    <w:p>
-      <w:pPr>
-        <w:pStyle w:val="Heading1"/>
-      </w:pPr>
-      <w:r>
-        <w:rPr>
-          <w:color w:val="2A78D6"/>
-        </w:rPr>
-        <w:t>Como se prova</w:t>
-      </w:r>
-    </w:p>
-    <w:p>
-      <w:r>
-        <w:rPr>
-          <w:rFonts w:ascii="Consolas" w:hAnsi="Consolas"/>
-          <w:sz w:val="19"/>
-        </w:rPr>
-        <w:t>Documentos em docs/planejamento/ e o quadro de tarefas em docs/tasks/.</w:t>
-      </w:r>
-    </w:p>
-    <w:p>
-      <w:pPr>
-        <w:pStyle w:val="Heading1"/>
-      </w:pPr>
-      <w:r>
-        <w:rPr>
-          <w:color w:val="2A78D6"/>
-        </w:rPr>
-        <w:t>Números da etapa</w:t>
-      </w:r>
-    </w:p>
-    <w:p>
-      <w:r>
-        <w:t>Etapa de documentos: sem código. Entregáveis em docs/planejamento/ e docs/tasks/.</w:t>
-      </w:r>
-    </w:p>
-    <w:p>
-      <w:pPr>
-        <w:pStyle w:val="Heading1"/>
-      </w:pPr>
-      <w:r>
-        <w:rPr>
-          <w:color w:val="2A78D6"/>
-        </w:rPr>
-        <w:t>Pendências e próxima etapa</w:t>
-      </w:r>
-    </w:p>
-    <w:p>
-      <w:pPr>
-        <w:pStyle w:val="ListBullet"/>
-      </w:pPr>
-      <w:r>
-        <w:t>Validar com o orientador a proposta dos cinco projetos de teste (FAB-105).</w:t>
-      </w:r>
-    </w:p>
-    <w:p>
-      <w:r>
-        <w:rPr>
-          <w:b/>
-        </w:rPr>
-        <w:t xml:space="preserve">Próxima etapa: </w:t>
-      </w:r>
-      <w:r>
-        <w:t>E2 — montar a fundação: ambiente, banco, custo, fronteiras e cópia de segurança.</w:t>
-      </w:r>
-    </w:p>
+    <w:tbl>
+      <w:tblPr>
+        <w:tblW w:type="auto" w:w="0"/>
+        <w:jc w:val="center"/>
+        <w:tblLayout w:type="fixed"/>
+        <w:tblLook w:firstColumn="1" w:firstRow="1" w:lastColumn="0" w:lastRow="0" w:noHBand="0" w:noVBand="1" w:val="04A0"/>
+        <w:tblBorders>
+          <w:top w:val="nil"/>
+          <w:left w:val="nil"/>
+          <w:bottom w:val="nil"/>
+          <w:right w:val="nil"/>
+          <w:insideH w:val="nil"/>
+          <w:insideV w:val="nil"/>
+        </w:tblBorders>
+      </w:tblPr>
+      <w:tblGrid>
+        <w:gridCol w:w="15024"/>
+      </w:tblGrid>
+      <w:tr>
+        <w:tc>
+          <w:tcPr>
+            <w:tcW w:type="dxa" w:w="15024"/>
+            <w:shd w:val="clear" w:color="auto" w:fill="1B2A41"/>
+            <w:tcMar>
+              <w:top w:w="255" w:type="dxa"/>
+              <w:left w:w="255" w:type="dxa"/>
+              <w:bottom w:w="255" w:type="dxa"/>
+              <w:right w:w="255" w:type="dxa"/>
+            </w:tcMar>
+          </w:tcPr>
+          <w:p>
+            <w:pPr>
+              <w:spacing w:before="0" w:after="80"/>
+            </w:pPr>
+            <w:r>
+              <w:rPr>
+                <w:b/>
+                <w:i w:val="0"/>
+                <w:color w:val="FFFFFF"/>
+                <w:sz w:val="21"/>
+              </w:rPr>
+              <w:t>PRÓXIMA ETAPA</w:t>
+            </w:r>
+          </w:p>
+          <w:p>
+            <w:pPr>
+              <w:spacing w:before="0" w:after="0"/>
+            </w:pPr>
+            <w:r>
+              <w:rPr>
+                <w:rFonts w:ascii="Cambria" w:hAnsi="Cambria"/>
+                <w:b/>
+                <w:i w:val="0"/>
+                <w:color w:val="FFFFFF"/>
+                <w:sz w:val="30"/>
+              </w:rPr>
+              <w:t>E2 — montar a fundação: ambiente, banco, custo, fronteiras e cópia de segurança.</w:t>
+            </w:r>
+          </w:p>
+        </w:tc>
+      </w:tr>
+    </w:tbl>
     <w:sectPr>
-      <w:pgSz w:w="12240" w:h="15840"/>
-      <w:pgMar w:top="1134" w:right="1247" w:bottom="1134" w:left="1247" w:header="720" w:footer="720" w:gutter="0"/>
+      <w:headerReference w:type="default" r:id="rId9"/>
+      <w:footerReference w:type="default" r:id="rId10"/>
+      <w:pgSz w:w="16838" w:h="11906" w:orient="landscape"/>
+      <w:pgMar w:top="1871" w:right="907" w:bottom="794" w:left="907" w:header="340" w:footer="720" w:gutter="0"/>
       <w:cols w:space="720"/>
       <w:docGrid w:linePitch="360"/>
     </w:sectPr>
   </w:body>
 </w:document>
+</file>
+
+<file path=word/footer1.xml><?xml version="1.0" encoding="utf-8"?>
+<w:ftr xmlns:m="http://schemas.openxmlformats.org/officeDocument/2006/math" xmlns:mc="http://schemas.openxmlformats.org/markup-compatibility/2006" xmlns:mo="http://schemas.microsoft.com/office/mac/office/2008/main" xmlns:mv="urn:schemas-microsoft-com:mac:vml" xmlns:o="urn:schemas-microsoft-com:office:office" xmlns:r="http://schemas.openxmlformats.org/officeDocument/2006/relationships" xmlns:v="urn:schemas-microsoft-com:vml" xmlns:w10="urn:schemas-microsoft-com:office:word" xmlns:w14="http://schemas.microsoft.com/office/word/2010/wordml" xmlns:w="http://schemas.openxmlformats.org/wordprocessingml/2006/main" xmlns:wne="http://schemas.microsoft.com/office/word/2006/wordml" xmlns:wp14="http://schemas.microsoft.com/office/word/2010/wordprocessingDrawing" xmlns:wp="http://schemas.openxmlformats.org/drawingml/2006/wordprocessingDrawing" xmlns:wpc="http://schemas.microsoft.com/office/word/2010/wordprocessingCanvas" xmlns:wpg="http://schemas.microsoft.com/office/word/2010/wordprocessingGroup" xmlns:wpi="http://schemas.microsoft.com/office/word/2010/wordprocessingInk" xmlns:wps="http://schemas.microsoft.com/office/word/2010/wordprocessingShape" mc:Ignorable="w14 wp14">
+  <w:p>
+    <w:pPr>
+      <w:pStyle w:val="Footer"/>
+    </w:pPr>
+    <w:r>
+      <w:rPr>
+        <w:b w:val="0"/>
+        <w:i w:val="0"/>
+        <w:color w:val="8C96A3"/>
+        <w:sz w:val="18"/>
+      </w:rPr>
+      <w:t>Fábrica de Software Multi-Agente · TCC · Enzo Consulo   —   Etapa 1: Planejamento e arquitetura</w:t>
+    </w:r>
+  </w:p>
+</w:ftr>
+</file>
+
+<file path=word/header1.xml><?xml version="1.0" encoding="utf-8"?>
+<w:hdr xmlns:m="http://schemas.openxmlformats.org/officeDocument/2006/math" xmlns:mc="http://schemas.openxmlformats.org/markup-compatibility/2006" xmlns:mo="http://schemas.microsoft.com/office/mac/office/2008/main" xmlns:mv="urn:schemas-microsoft-com:mac:vml" xmlns:o="urn:schemas-microsoft-com:office:office" xmlns:r="http://schemas.openxmlformats.org/officeDocument/2006/relationships" xmlns:v="urn:schemas-microsoft-com:vml" xmlns:w10="urn:schemas-microsoft-com:office:word" xmlns:w14="http://schemas.microsoft.com/office/word/2010/wordml" xmlns:w="http://schemas.openxmlformats.org/wordprocessingml/2006/main" xmlns:wne="http://schemas.microsoft.com/office/word/2006/wordml" xmlns:wp14="http://schemas.microsoft.com/office/word/2010/wordprocessingDrawing" xmlns:wp="http://schemas.openxmlformats.org/drawingml/2006/wordprocessingDrawing" xmlns:wpc="http://schemas.microsoft.com/office/word/2010/wordprocessingCanvas" xmlns:wpg="http://schemas.microsoft.com/office/word/2010/wordprocessingGroup" xmlns:wpi="http://schemas.microsoft.com/office/word/2010/wordprocessingInk" xmlns:wps="http://schemas.microsoft.com/office/word/2010/wordprocessingShape" mc:Ignorable="w14 wp14">
+  <w:p>
+    <w:pPr>
+      <w:pStyle w:val="Header"/>
+      <w:jc w:val="center"/>
+    </w:pPr>
+    <w:r>
+      <w:drawing>
+        <wp:inline xmlns:a="http://schemas.openxmlformats.org/drawingml/2006/main" xmlns:pic="http://schemas.openxmlformats.org/drawingml/2006/picture">
+          <wp:extent cx="9540000" cy="796965"/>
+          <wp:docPr id="1" name="Picture 1"/>
+          <wp:cNvGraphicFramePr>
+            <a:graphicFrameLocks noChangeAspect="1"/>
+          </wp:cNvGraphicFramePr>
+          <a:graphic>
+            <a:graphicData uri="http://schemas.openxmlformats.org/drawingml/2006/picture">
+              <pic:pic>
+                <pic:nvPicPr>
+                  <pic:cNvPr id="0" name="faixa.png"/>
+                  <pic:cNvPicPr/>
+                </pic:nvPicPr>
+                <pic:blipFill>
+                  <a:blip r:embed="rId1"/>
+                  <a:stretch>
+                    <a:fillRect/>
+                  </a:stretch>
+                </pic:blipFill>
+                <pic:spPr>
+                  <a:xfrm>
+                    <a:off x="0" y="0"/>
+                    <a:ext cx="9540000" cy="796965"/>
+                  </a:xfrm>
+                  <a:prstGeom prst="rect"/>
+                </pic:spPr>
+              </pic:pic>
+            </a:graphicData>
+          </a:graphic>
+        </wp:inline>
+      </w:drawing>
+    </w:r>
+  </w:p>
+</w:hdr>
 </file>
 
 <file path=word/numbering.xml><?xml version="1.0" encoding="utf-8"?>
@@ -966,7 +2668,7 @@
     <w:rsid w:val="00FC693F"/>
     <w:rPr>
       <w:rFonts w:ascii="Calibri" w:hAnsi="Calibri"/>
-      <w:sz w:val="21"/>
+      <w:sz w:val="24"/>
     </w:rPr>
   </w:style>
   <w:style w:type="paragraph" w:styleId="Header">

</xml_diff>

<commit_message>
chore: TCC — documentos por etapa enxutos e só com dados do sistema; backlog com resumo de todas as tarefas
</commit_message>
<xml_diff>
--- a/apresentacao-orientador/relatorios-por-etapa/E1-planejamento.docx
+++ b/apresentacao-orientador/relatorios-por-etapa/E1-planejamento.docx
@@ -797,7 +797,7 @@
           <w:color w:val="1B2A41"/>
           <w:sz w:val="48"/>
         </w:rPr>
-        <w:t>O que foi feito, tarefa por tarefa</w:t>
+        <w:t>Tarefas da etapa</w:t>
       </w:r>
     </w:p>
     <w:p>
@@ -811,7 +811,7 @@
           <w:color w:val="6B7480"/>
           <w:sz w:val="25"/>
         </w:rPr>
-        <w:t>Cada tarefa é um pacote do plano de desenvolvimento. Detalhes completos em docs/tasks/pt/.</w:t>
+        <w:t>Uma tarefa por pacote do plano. A descrição completa de cada uma está em docs/tasks/pt/.</w:t>
       </w:r>
     </w:p>
     <w:tbl>
@@ -830,8 +830,9 @@
         </w:tblBorders>
       </w:tblPr>
       <w:tblGrid>
-        <w:gridCol w:w="11622"/>
-        <w:gridCol w:w="3402"/>
+        <w:gridCol w:w="1701"/>
+        <w:gridCol w:w="10772"/>
+        <w:gridCol w:w="2551"/>
       </w:tblGrid>
       <w:tr>
         <w:trPr>
@@ -839,18 +840,100 @@
         </w:trPr>
         <w:tc>
           <w:tcPr>
-            <w:tcW w:type="dxa" w:w="11622"/>
+            <w:tcW w:type="dxa" w:w="1701"/>
             <w:shd w:val="clear" w:color="auto" w:fill="1B2A41"/>
             <w:tcMar>
-              <w:top w:w="158" w:type="dxa"/>
-              <w:left w:w="158" w:type="dxa"/>
-              <w:bottom w:w="158" w:type="dxa"/>
-              <w:right w:w="158" w:type="dxa"/>
+              <w:top w:w="113" w:type="dxa"/>
+              <w:left w:w="113" w:type="dxa"/>
+              <w:bottom w:w="113" w:type="dxa"/>
+              <w:right w:w="113" w:type="dxa"/>
             </w:tcMar>
           </w:tcPr>
           <w:p>
             <w:pPr>
-              <w:keepNext/>
+              <w:spacing w:before="0" w:after="0"/>
+            </w:pPr>
+            <w:r>
+              <w:rPr>
+                <w:b/>
+                <w:i w:val="0"/>
+                <w:color w:val="FFFFFF"/>
+                <w:sz w:val="22"/>
+              </w:rPr>
+              <w:t>Tarefa</w:t>
+            </w:r>
+          </w:p>
+        </w:tc>
+        <w:tc>
+          <w:tcPr>
+            <w:tcW w:type="dxa" w:w="10772"/>
+            <w:shd w:val="clear" w:color="auto" w:fill="1B2A41"/>
+            <w:tcMar>
+              <w:top w:w="113" w:type="dxa"/>
+              <w:left w:w="113" w:type="dxa"/>
+              <w:bottom w:w="113" w:type="dxa"/>
+              <w:right w:w="113" w:type="dxa"/>
+            </w:tcMar>
+          </w:tcPr>
+          <w:p>
+            <w:pPr>
+              <w:spacing w:before="0" w:after="0"/>
+            </w:pPr>
+            <w:r>
+              <w:rPr>
+                <w:b/>
+                <w:i w:val="0"/>
+                <w:color w:val="FFFFFF"/>
+                <w:sz w:val="22"/>
+              </w:rPr>
+              <w:t>O que foi feito</w:t>
+            </w:r>
+          </w:p>
+        </w:tc>
+        <w:tc>
+          <w:tcPr>
+            <w:tcW w:type="dxa" w:w="2551"/>
+            <w:shd w:val="clear" w:color="auto" w:fill="1B2A41"/>
+            <w:tcMar>
+              <w:top w:w="113" w:type="dxa"/>
+              <w:left w:w="113" w:type="dxa"/>
+              <w:bottom w:w="113" w:type="dxa"/>
+              <w:right w:w="113" w:type="dxa"/>
+            </w:tcMar>
+          </w:tcPr>
+          <w:p>
+            <w:pPr>
+              <w:spacing w:before="0" w:after="0"/>
+            </w:pPr>
+            <w:r>
+              <w:rPr>
+                <w:b/>
+                <w:i w:val="0"/>
+                <w:color w:val="FFFFFF"/>
+                <w:sz w:val="22"/>
+              </w:rPr>
+              <w:t>Status</w:t>
+            </w:r>
+          </w:p>
+        </w:tc>
+      </w:tr>
+      <w:tr>
+        <w:trPr>
+          <w:cantSplit/>
+        </w:trPr>
+        <w:tc>
+          <w:tcPr>
+            <w:tcW w:type="dxa" w:w="1701"/>
+            <w:shd w:val="clear" w:color="auto" w:fill="F2F4F7"/>
+            <w:tcMar>
+              <w:top w:w="68" w:type="dxa"/>
+              <w:left w:w="68" w:type="dxa"/>
+              <w:bottom w:w="68" w:type="dxa"/>
+              <w:right w:w="68" w:type="dxa"/>
+            </w:tcMar>
+          </w:tcPr>
+          <w:p>
+            <w:pPr>
               <w:spacing w:before="0" w:after="0"/>
             </w:pPr>
             <w:r>
@@ -858,36 +941,66 @@
                 <w:rFonts w:ascii="Consolas" w:hAnsi="Consolas"/>
                 <w:b/>
                 <w:i w:val="0"/>
-                <w:color w:val="E9A23B"/>
-                <w:sz w:val="24"/>
+                <w:color w:val="4A6FA5"/>
+                <w:sz w:val="23"/>
               </w:rPr>
-              <w:t xml:space="preserve">FAB-101   </w:t>
-            </w:r>
-            <w:r>
-              <w:rPr>
-                <w:b/>
-                <w:i w:val="0"/>
-                <w:color w:val="FFFFFF"/>
-                <w:sz w:val="27"/>
-              </w:rPr>
-              <w:t>Levantar os requisitos R1–R15</w:t>
+              <w:t>FAB-101</w:t>
             </w:r>
           </w:p>
         </w:tc>
         <w:tc>
           <w:tcPr>
-            <w:tcW w:type="dxa" w:w="3402"/>
-            <w:shd w:val="clear" w:color="auto" w:fill="2A9D8F"/>
+            <w:tcW w:type="dxa" w:w="10772"/>
+            <w:shd w:val="clear" w:color="auto" w:fill="F2F4F7"/>
             <w:tcMar>
-              <w:top w:w="158" w:type="dxa"/>
-              <w:left w:w="158" w:type="dxa"/>
-              <w:bottom w:w="158" w:type="dxa"/>
-              <w:right w:w="158" w:type="dxa"/>
+              <w:top w:w="68" w:type="dxa"/>
+              <w:left w:w="68" w:type="dxa"/>
+              <w:bottom w:w="68" w:type="dxa"/>
+              <w:right w:w="68" w:type="dxa"/>
             </w:tcMar>
           </w:tcPr>
           <w:p>
             <w:pPr>
-              <w:keepNext/>
+              <w:spacing w:before="0" w:after="20"/>
+            </w:pPr>
+            <w:r>
+              <w:rPr>
+                <w:b/>
+                <w:i w:val="0"/>
+                <w:color w:val="1B2A41"/>
+                <w:sz w:val="23"/>
+              </w:rPr>
+              <w:t>Levantar os requisitos R1–R15</w:t>
+            </w:r>
+          </w:p>
+          <w:p>
+            <w:pPr>
+              <w:spacing w:before="0" w:after="0"/>
+            </w:pPr>
+            <w:r>
+              <w:rPr>
+                <w:b w:val="0"/>
+                <w:i w:val="0"/>
+                <w:color w:val="4A5160"/>
+                <w:sz w:val="20"/>
+              </w:rPr>
+              <w:t>Definir o que o sistema precisa fazer (R1–R8) e sob quais restrições (R9–R15), cada um com etapa e forma de verificar.</w:t>
+            </w:r>
+          </w:p>
+        </w:tc>
+        <w:tc>
+          <w:tcPr>
+            <w:tcW w:type="dxa" w:w="2551"/>
+            <w:shd w:val="clear" w:color="auto" w:fill="2A9D8F"/>
+            <w:tcMar>
+              <w:top w:w="68" w:type="dxa"/>
+              <w:left w:w="68" w:type="dxa"/>
+              <w:bottom w:w="68" w:type="dxa"/>
+              <w:right w:w="68" w:type="dxa"/>
+            </w:tcMar>
+          </w:tcPr>
+          <w:p>
+            <w:pPr>
               <w:spacing w:before="0" w:after="0"/>
               <w:jc w:val="center"/>
             </w:pPr>
@@ -896,7 +1009,7 @@
                 <w:b/>
                 <w:i w:val="0"/>
                 <w:color w:val="FFFFFF"/>
-                <w:sz w:val="25"/>
+                <w:sz w:val="23"/>
               </w:rPr>
               <w:t>✓ Concluída</w:t>
             </w:r>
@@ -909,182 +1022,17 @@
         </w:trPr>
         <w:tc>
           <w:tcPr>
-            <w:tcW w:type="dxa" w:w="15024"/>
-            <w:gridSpan w:val="2"/>
-            <w:shd w:val="clear" w:color="auto" w:fill="F2F4F7"/>
+            <w:tcW w:type="dxa" w:w="1701"/>
+            <w:shd w:val="clear" w:color="auto" w:fill="FFFFFF"/>
             <w:tcMar>
-              <w:top w:w="198" w:type="dxa"/>
-              <w:left w:w="198" w:type="dxa"/>
-              <w:bottom w:w="198" w:type="dxa"/>
-              <w:right w:w="198" w:type="dxa"/>
+              <w:top w:w="68" w:type="dxa"/>
+              <w:left w:w="68" w:type="dxa"/>
+              <w:bottom w:w="68" w:type="dxa"/>
+              <w:right w:w="68" w:type="dxa"/>
             </w:tcMar>
           </w:tcPr>
           <w:p>
             <w:pPr>
-              <w:keepNext/>
-              <w:spacing w:before="0" w:after="80"/>
-            </w:pPr>
-            <w:r>
-              <w:rPr>
-                <w:b/>
-                <w:i w:val="0"/>
-                <w:color w:val="4A6FA5"/>
-                <w:sz w:val="22"/>
-              </w:rPr>
-              <w:t xml:space="preserve">O que é   </w:t>
-            </w:r>
-            <w:r>
-              <w:rPr>
-                <w:b w:val="0"/>
-                <w:i w:val="0"/>
-                <w:color w:val="1F2328"/>
-                <w:sz w:val="23"/>
-              </w:rPr>
-              <w:t>Lista do que o sistema precisa fazer (8 requisitos funcionais) e das restrições sob as quais precisa funcionar (7 requisitos não funcionais). Cada requisito diz em que etapa será atendido e como será verificado.</w:t>
-            </w:r>
-          </w:p>
-          <w:p>
-            <w:pPr>
-              <w:keepNext/>
-              <w:spacing w:before="0" w:after="80"/>
-            </w:pPr>
-            <w:r>
-              <w:rPr>
-                <w:b/>
-                <w:i w:val="0"/>
-                <w:color w:val="4A6FA5"/>
-                <w:sz w:val="22"/>
-              </w:rPr>
-              <w:t xml:space="preserve">Por que   </w:t>
-            </w:r>
-            <w:r>
-              <w:rPr>
-                <w:b w:val="0"/>
-                <w:i w:val="0"/>
-                <w:color w:val="1F2328"/>
-                <w:sz w:val="23"/>
-              </w:rPr>
-              <w:t>Sem requisitos com forma objetiva de verificação, nenhuma etapa teria critério de pronto; eles amarram cada entrega do cronograma a algo que pode ser testado.</w:t>
-            </w:r>
-          </w:p>
-          <w:p>
-            <w:pPr>
-              <w:pStyle w:val="ListBullet"/>
-              <w:keepNext/>
-              <w:spacing w:after="20"/>
-            </w:pPr>
-            <w:r>
-              <w:rPr>
-                <w:b w:val="0"/>
-                <w:i w:val="0"/>
-                <w:color w:val="1F2328"/>
-                <w:sz w:val="21"/>
-              </w:rPr>
-              <w:t>R1–R8: do pedido às tarefas, seis estados, dois julgamentos, retrabalho limitado, paralelismo, memória e acompanhamento ao vivo</w:t>
-            </w:r>
-          </w:p>
-          <w:p>
-            <w:pPr>
-              <w:pStyle w:val="ListBullet"/>
-              <w:keepNext/>
-              <w:spacing w:after="20"/>
-            </w:pPr>
-            <w:r>
-              <w:rPr>
-                <w:b w:val="0"/>
-                <w:i w:val="0"/>
-                <w:color w:val="1F2328"/>
-                <w:sz w:val="21"/>
-              </w:rPr>
-              <w:t>R9–R15: 8 GB de memória, custo em duas unidades, confinamento, testes sem internet, isolamento de falhas, teto de gasto, fornecedor trocável</w:t>
-            </w:r>
-          </w:p>
-          <w:p>
-            <w:pPr>
-              <w:pStyle w:val="ListBullet"/>
-              <w:keepNext/>
-              <w:spacing w:after="20"/>
-            </w:pPr>
-            <w:r>
-              <w:rPr>
-                <w:b w:val="0"/>
-                <w:i w:val="0"/>
-                <w:color w:val="1F2328"/>
-                <w:sz w:val="21"/>
-              </w:rPr>
-              <w:t>Cada linha traz a etapa responsável (E2–E7) e o teste que prova o requisito</w:t>
-            </w:r>
-          </w:p>
-          <w:p>
-            <w:pPr>
-              <w:keepNext/>
-              <w:spacing w:before="80" w:after="0"/>
-            </w:pPr>
-            <w:r>
-              <w:rPr>
-                <w:b/>
-                <w:i w:val="0"/>
-                <w:color w:val="4A6FA5"/>
-                <w:sz w:val="22"/>
-              </w:rPr>
-              <w:t xml:space="preserve">Verificar   </w:t>
-            </w:r>
-            <w:r>
-              <w:rPr>
-                <w:rFonts w:ascii="Consolas" w:hAnsi="Consolas"/>
-                <w:b w:val="0"/>
-                <w:i w:val="0"/>
-                <w:color w:val="1F2328"/>
-                <w:sz w:val="19"/>
-              </w:rPr>
-              <w:t>docs/planejamento/requisitos.md</w:t>
-            </w:r>
-          </w:p>
-        </w:tc>
-      </w:tr>
-    </w:tbl>
-    <w:p>
-      <w:pPr>
-        <w:spacing w:before="0" w:after="120"/>
-      </w:pPr>
-    </w:p>
-    <w:tbl>
-      <w:tblPr>
-        <w:tblW w:type="auto" w:w="0"/>
-        <w:jc w:val="center"/>
-        <w:tblLayout w:type="fixed"/>
-        <w:tblLook w:firstColumn="1" w:firstRow="1" w:lastColumn="0" w:lastRow="0" w:noHBand="0" w:noVBand="1" w:val="04A0"/>
-        <w:tblBorders>
-          <w:top w:val="nil"/>
-          <w:left w:val="nil"/>
-          <w:bottom w:val="nil"/>
-          <w:right w:val="nil"/>
-          <w:insideH w:val="nil"/>
-          <w:insideV w:val="nil"/>
-        </w:tblBorders>
-      </w:tblPr>
-      <w:tblGrid>
-        <w:gridCol w:w="11622"/>
-        <w:gridCol w:w="3402"/>
-      </w:tblGrid>
-      <w:tr>
-        <w:trPr>
-          <w:cantSplit/>
-        </w:trPr>
-        <w:tc>
-          <w:tcPr>
-            <w:tcW w:type="dxa" w:w="11622"/>
-            <w:shd w:val="clear" w:color="auto" w:fill="1B2A41"/>
-            <w:tcMar>
-              <w:top w:w="158" w:type="dxa"/>
-              <w:left w:w="158" w:type="dxa"/>
-              <w:bottom w:w="158" w:type="dxa"/>
-              <w:right w:w="158" w:type="dxa"/>
-            </w:tcMar>
-          </w:tcPr>
-          <w:p>
-            <w:pPr>
-              <w:keepNext/>
               <w:spacing w:before="0" w:after="0"/>
             </w:pPr>
             <w:r>
@@ -1092,36 +1040,66 @@
                 <w:rFonts w:ascii="Consolas" w:hAnsi="Consolas"/>
                 <w:b/>
                 <w:i w:val="0"/>
-                <w:color w:val="E9A23B"/>
-                <w:sz w:val="24"/>
+                <w:color w:val="4A6FA5"/>
+                <w:sz w:val="23"/>
               </w:rPr>
-              <w:t xml:space="preserve">FAB-102   </w:t>
-            </w:r>
-            <w:r>
-              <w:rPr>
-                <w:b/>
-                <w:i w:val="0"/>
-                <w:color w:val="FFFFFF"/>
-                <w:sz w:val="27"/>
-              </w:rPr>
-              <w:t>Estudar o estado da arte</w:t>
+              <w:t>FAB-102</w:t>
             </w:r>
           </w:p>
         </w:tc>
         <w:tc>
           <w:tcPr>
-            <w:tcW w:type="dxa" w:w="3402"/>
-            <w:shd w:val="clear" w:color="auto" w:fill="2A9D8F"/>
+            <w:tcW w:type="dxa" w:w="10772"/>
+            <w:shd w:val="clear" w:color="auto" w:fill="FFFFFF"/>
             <w:tcMar>
-              <w:top w:w="158" w:type="dxa"/>
-              <w:left w:w="158" w:type="dxa"/>
-              <w:bottom w:w="158" w:type="dxa"/>
-              <w:right w:w="158" w:type="dxa"/>
+              <w:top w:w="68" w:type="dxa"/>
+              <w:left w:w="68" w:type="dxa"/>
+              <w:bottom w:w="68" w:type="dxa"/>
+              <w:right w:w="68" w:type="dxa"/>
             </w:tcMar>
           </w:tcPr>
           <w:p>
             <w:pPr>
-              <w:keepNext/>
+              <w:spacing w:before="0" w:after="20"/>
+            </w:pPr>
+            <w:r>
+              <w:rPr>
+                <w:b/>
+                <w:i w:val="0"/>
+                <w:color w:val="1B2A41"/>
+                <w:sz w:val="23"/>
+              </w:rPr>
+              <w:t>Estudar o estado da arte</w:t>
+            </w:r>
+          </w:p>
+          <w:p>
+            <w:pPr>
+              <w:spacing w:before="0" w:after="0"/>
+            </w:pPr>
+            <w:r>
+              <w:rPr>
+                <w:b w:val="0"/>
+                <w:i w:val="0"/>
+                <w:color w:val="4A5160"/>
+                <w:sz w:val="20"/>
+              </w:rPr>
+              <w:t>Comparar os sistemas multi-agente existentes e mostrar onde a governança por estrutura é original.</w:t>
+            </w:r>
+          </w:p>
+        </w:tc>
+        <w:tc>
+          <w:tcPr>
+            <w:tcW w:type="dxa" w:w="2551"/>
+            <w:shd w:val="clear" w:color="auto" w:fill="2A9D8F"/>
+            <w:tcMar>
+              <w:top w:w="68" w:type="dxa"/>
+              <w:left w:w="68" w:type="dxa"/>
+              <w:bottom w:w="68" w:type="dxa"/>
+              <w:right w:w="68" w:type="dxa"/>
+            </w:tcMar>
+          </w:tcPr>
+          <w:p>
+            <w:pPr>
               <w:spacing w:before="0" w:after="0"/>
               <w:jc w:val="center"/>
             </w:pPr>
@@ -1130,7 +1108,7 @@
                 <w:b/>
                 <w:i w:val="0"/>
                 <w:color w:val="FFFFFF"/>
-                <w:sz w:val="25"/>
+                <w:sz w:val="23"/>
               </w:rPr>
               <w:t>✓ Concluída</w:t>
             </w:r>
@@ -1143,166 +1121,17 @@
         </w:trPr>
         <w:tc>
           <w:tcPr>
-            <w:tcW w:type="dxa" w:w="15024"/>
-            <w:gridSpan w:val="2"/>
+            <w:tcW w:type="dxa" w:w="1701"/>
             <w:shd w:val="clear" w:color="auto" w:fill="F2F4F7"/>
             <w:tcMar>
-              <w:top w:w="198" w:type="dxa"/>
-              <w:left w:w="198" w:type="dxa"/>
-              <w:bottom w:w="198" w:type="dxa"/>
-              <w:right w:w="198" w:type="dxa"/>
+              <w:top w:w="68" w:type="dxa"/>
+              <w:left w:w="68" w:type="dxa"/>
+              <w:bottom w:w="68" w:type="dxa"/>
+              <w:right w:w="68" w:type="dxa"/>
             </w:tcMar>
           </w:tcPr>
           <w:p>
             <w:pPr>
-              <w:keepNext/>
-              <w:spacing w:before="0" w:after="80"/>
-            </w:pPr>
-            <w:r>
-              <w:rPr>
-                <w:b/>
-                <w:i w:val="0"/>
-                <w:color w:val="4A6FA5"/>
-                <w:sz w:val="22"/>
-              </w:rPr>
-              <w:t xml:space="preserve">O que é   </w:t>
-            </w:r>
-            <w:r>
-              <w:rPr>
-                <w:b w:val="0"/>
-                <w:i w:val="0"/>
-                <w:color w:val="1F2328"/>
-                <w:sz w:val="23"/>
-              </w:rPr>
-              <w:t>Comparação arquitetural com os sistemas multi-agente que constroem software, com destaque para o mais próximo, e o que este trabalho faz de diferente.</w:t>
-            </w:r>
-          </w:p>
-          <w:p>
-            <w:pPr>
-              <w:keepNext/>
-              <w:spacing w:before="0" w:after="80"/>
-            </w:pPr>
-            <w:r>
-              <w:rPr>
-                <w:b/>
-                <w:i w:val="0"/>
-                <w:color w:val="4A6FA5"/>
-                <w:sz w:val="22"/>
-              </w:rPr>
-              <w:t xml:space="preserve">Por que   </w:t>
-            </w:r>
-            <w:r>
-              <w:rPr>
-                <w:b w:val="0"/>
-                <w:i w:val="0"/>
-                <w:color w:val="1F2328"/>
-                <w:sz w:val="23"/>
-              </w:rPr>
-              <w:t>Delimita a originalidade: a contribuição não é 'usar agentes', e sim mover as regras de governança do texto do pedido para a estrutura do programa.</w:t>
-            </w:r>
-          </w:p>
-          <w:p>
-            <w:pPr>
-              <w:pStyle w:val="ListBullet"/>
-              <w:keepNext/>
-              <w:spacing w:after="20"/>
-            </w:pPr>
-            <w:r>
-              <w:rPr>
-                <w:b w:val="0"/>
-                <w:i w:val="0"/>
-                <w:color w:val="1F2328"/>
-                <w:sz w:val="21"/>
-              </w:rPr>
-              <w:t>Quatro sistemas comparados pela arquitetura, não por recursos</w:t>
-            </w:r>
-          </w:p>
-          <w:p>
-            <w:pPr>
-              <w:pStyle w:val="ListBullet"/>
-              <w:keepNext/>
-              <w:spacing w:after="20"/>
-            </w:pPr>
-            <w:r>
-              <w:rPr>
-                <w:b w:val="0"/>
-                <w:i w:val="0"/>
-                <w:color w:val="1F2328"/>
-                <w:sz w:val="21"/>
-              </w:rPr>
-              <w:t>Diferenças centrais: dois portões com perguntas diferentes, autoridade como ausência de ferramenta, escada de resposta à falha</w:t>
-            </w:r>
-          </w:p>
-          <w:p>
-            <w:pPr>
-              <w:keepNext/>
-              <w:spacing w:before="80" w:after="0"/>
-            </w:pPr>
-            <w:r>
-              <w:rPr>
-                <w:b/>
-                <w:i w:val="0"/>
-                <w:color w:val="4A6FA5"/>
-                <w:sz w:val="22"/>
-              </w:rPr>
-              <w:t xml:space="preserve">Verificar   </w:t>
-            </w:r>
-            <w:r>
-              <w:rPr>
-                <w:rFonts w:ascii="Consolas" w:hAnsi="Consolas"/>
-                <w:b w:val="0"/>
-                <w:i w:val="0"/>
-                <w:color w:val="1F2328"/>
-                <w:sz w:val="19"/>
-              </w:rPr>
-              <w:t>docs/planejamento/estado-da-arte-resumo.pdf    docs/planejamento/estado-da-arte-completo.pdf</w:t>
-            </w:r>
-          </w:p>
-        </w:tc>
-      </w:tr>
-    </w:tbl>
-    <w:p>
-      <w:pPr>
-        <w:spacing w:before="0" w:after="120"/>
-      </w:pPr>
-    </w:p>
-    <w:tbl>
-      <w:tblPr>
-        <w:tblW w:type="auto" w:w="0"/>
-        <w:jc w:val="center"/>
-        <w:tblLayout w:type="fixed"/>
-        <w:tblLook w:firstColumn="1" w:firstRow="1" w:lastColumn="0" w:lastRow="0" w:noHBand="0" w:noVBand="1" w:val="04A0"/>
-        <w:tblBorders>
-          <w:top w:val="nil"/>
-          <w:left w:val="nil"/>
-          <w:bottom w:val="nil"/>
-          <w:right w:val="nil"/>
-          <w:insideH w:val="nil"/>
-          <w:insideV w:val="nil"/>
-        </w:tblBorders>
-      </w:tblPr>
-      <w:tblGrid>
-        <w:gridCol w:w="11622"/>
-        <w:gridCol w:w="3402"/>
-      </w:tblGrid>
-      <w:tr>
-        <w:trPr>
-          <w:cantSplit/>
-        </w:trPr>
-        <w:tc>
-          <w:tcPr>
-            <w:tcW w:type="dxa" w:w="11622"/>
-            <w:shd w:val="clear" w:color="auto" w:fill="1B2A41"/>
-            <w:tcMar>
-              <w:top w:w="158" w:type="dxa"/>
-              <w:left w:w="158" w:type="dxa"/>
-              <w:bottom w:w="158" w:type="dxa"/>
-              <w:right w:w="158" w:type="dxa"/>
-            </w:tcMar>
-          </w:tcPr>
-          <w:p>
-            <w:pPr>
-              <w:keepNext/>
               <w:spacing w:before="0" w:after="0"/>
             </w:pPr>
             <w:r>
@@ -1310,36 +1139,66 @@
                 <w:rFonts w:ascii="Consolas" w:hAnsi="Consolas"/>
                 <w:b/>
                 <w:i w:val="0"/>
-                <w:color w:val="E9A23B"/>
-                <w:sz w:val="24"/>
+                <w:color w:val="4A6FA5"/>
+                <w:sz w:val="23"/>
               </w:rPr>
-              <w:t xml:space="preserve">FAB-103   </w:t>
-            </w:r>
-            <w:r>
-              <w:rPr>
-                <w:b/>
-                <w:i w:val="0"/>
-                <w:color w:val="FFFFFF"/>
-                <w:sz w:val="27"/>
-              </w:rPr>
-              <w:t>Desenhar a arquitetura</w:t>
+              <w:t>FAB-103</w:t>
             </w:r>
           </w:p>
         </w:tc>
         <w:tc>
           <w:tcPr>
-            <w:tcW w:type="dxa" w:w="3402"/>
-            <w:shd w:val="clear" w:color="auto" w:fill="2A9D8F"/>
+            <w:tcW w:type="dxa" w:w="10772"/>
+            <w:shd w:val="clear" w:color="auto" w:fill="F2F4F7"/>
             <w:tcMar>
-              <w:top w:w="158" w:type="dxa"/>
-              <w:left w:w="158" w:type="dxa"/>
-              <w:bottom w:w="158" w:type="dxa"/>
-              <w:right w:w="158" w:type="dxa"/>
+              <w:top w:w="68" w:type="dxa"/>
+              <w:left w:w="68" w:type="dxa"/>
+              <w:bottom w:w="68" w:type="dxa"/>
+              <w:right w:w="68" w:type="dxa"/>
             </w:tcMar>
           </w:tcPr>
           <w:p>
             <w:pPr>
-              <w:keepNext/>
+              <w:spacing w:before="0" w:after="20"/>
+            </w:pPr>
+            <w:r>
+              <w:rPr>
+                <w:b/>
+                <w:i w:val="0"/>
+                <w:color w:val="1B2A41"/>
+                <w:sz w:val="23"/>
+              </w:rPr>
+              <w:t>Desenhar a arquitetura</w:t>
+            </w:r>
+          </w:p>
+          <w:p>
+            <w:pPr>
+              <w:spacing w:before="0" w:after="0"/>
+            </w:pPr>
+            <w:r>
+              <w:rPr>
+                <w:b w:val="0"/>
+                <w:i w:val="0"/>
+                <w:color w:val="4A5160"/>
+                <w:sz w:val="20"/>
+              </w:rPr>
+              <w:t>Quatro camadas, os seis estados da tarefa, os dois portões e a escada de resposta à falha; escolher a pilha (Elixir/OTP).</w:t>
+            </w:r>
+          </w:p>
+        </w:tc>
+        <w:tc>
+          <w:tcPr>
+            <w:tcW w:type="dxa" w:w="2551"/>
+            <w:shd w:val="clear" w:color="auto" w:fill="2A9D8F"/>
+            <w:tcMar>
+              <w:top w:w="68" w:type="dxa"/>
+              <w:left w:w="68" w:type="dxa"/>
+              <w:bottom w:w="68" w:type="dxa"/>
+              <w:right w:w="68" w:type="dxa"/>
+            </w:tcMar>
+          </w:tcPr>
+          <w:p>
+            <w:pPr>
               <w:spacing w:before="0" w:after="0"/>
               <w:jc w:val="center"/>
             </w:pPr>
@@ -1348,7 +1207,7 @@
                 <w:b/>
                 <w:i w:val="0"/>
                 <w:color w:val="FFFFFF"/>
-                <w:sz w:val="25"/>
+                <w:sz w:val="23"/>
               </w:rPr>
               <w:t>✓ Concluída</w:t>
             </w:r>
@@ -1361,182 +1220,17 @@
         </w:trPr>
         <w:tc>
           <w:tcPr>
-            <w:tcW w:type="dxa" w:w="15024"/>
-            <w:gridSpan w:val="2"/>
-            <w:shd w:val="clear" w:color="auto" w:fill="F2F4F7"/>
+            <w:tcW w:type="dxa" w:w="1701"/>
+            <w:shd w:val="clear" w:color="auto" w:fill="FFFFFF"/>
             <w:tcMar>
-              <w:top w:w="198" w:type="dxa"/>
-              <w:left w:w="198" w:type="dxa"/>
-              <w:bottom w:w="198" w:type="dxa"/>
-              <w:right w:w="198" w:type="dxa"/>
+              <w:top w:w="68" w:type="dxa"/>
+              <w:left w:w="68" w:type="dxa"/>
+              <w:bottom w:w="68" w:type="dxa"/>
+              <w:right w:w="68" w:type="dxa"/>
             </w:tcMar>
           </w:tcPr>
           <w:p>
             <w:pPr>
-              <w:keepNext/>
-              <w:spacing w:before="0" w:after="80"/>
-            </w:pPr>
-            <w:r>
-              <w:rPr>
-                <w:b/>
-                <w:i w:val="0"/>
-                <w:color w:val="4A6FA5"/>
-                <w:sz w:val="22"/>
-              </w:rPr>
-              <w:t xml:space="preserve">O que é   </w:t>
-            </w:r>
-            <w:r>
-              <w:rPr>
-                <w:b w:val="0"/>
-                <w:i w:val="0"/>
-                <w:color w:val="1F2328"/>
-                <w:sz w:val="23"/>
-              </w:rPr>
-              <w:t>Desenho do sistema: quatro camadas (tela, motor, agentes, fronteiras), o ciclo de vida da tarefa em seis estados com dois portões, a escada de resposta à falha e a pilha de tecnologia.</w:t>
-            </w:r>
-          </w:p>
-          <w:p>
-            <w:pPr>
-              <w:keepNext/>
-              <w:spacing w:before="0" w:after="80"/>
-            </w:pPr>
-            <w:r>
-              <w:rPr>
-                <w:b/>
-                <w:i w:val="0"/>
-                <w:color w:val="4A6FA5"/>
-                <w:sz w:val="22"/>
-              </w:rPr>
-              <w:t xml:space="preserve">Por que   </w:t>
-            </w:r>
-            <w:r>
-              <w:rPr>
-                <w:b w:val="0"/>
-                <w:i w:val="0"/>
-                <w:color w:val="1F2328"/>
-                <w:sz w:val="23"/>
-              </w:rPr>
-              <w:t>É a arquitetura que torna as regras estruturais: cada regra tem um lugar no desenho onde ela é imposta, e não pedida.</w:t>
-            </w:r>
-          </w:p>
-          <w:p>
-            <w:pPr>
-              <w:pStyle w:val="ListBullet"/>
-              <w:keepNext/>
-              <w:spacing w:after="20"/>
-            </w:pPr>
-            <w:r>
-              <w:rPr>
-                <w:b w:val="0"/>
-                <w:i w:val="0"/>
-                <w:color w:val="1F2328"/>
-                <w:sz w:val="21"/>
-              </w:rPr>
-              <w:t>Diagramas das camadas e da máquina de estados (Mermaid, renderizados no GitHub)</w:t>
-            </w:r>
-          </w:p>
-          <w:p>
-            <w:pPr>
-              <w:pStyle w:val="ListBullet"/>
-              <w:keepNext/>
-              <w:spacing w:after="20"/>
-            </w:pPr>
-            <w:r>
-              <w:rPr>
-                <w:b w:val="0"/>
-                <w:i w:val="0"/>
-                <w:color w:val="1F2328"/>
-                <w:sz w:val="21"/>
-              </w:rPr>
-              <w:t>Tabela 'a regra × onde ela mora'</w:t>
-            </w:r>
-          </w:p>
-          <w:p>
-            <w:pPr>
-              <w:pStyle w:val="ListBullet"/>
-              <w:keepNext/>
-              <w:spacing w:after="20"/>
-            </w:pPr>
-            <w:r>
-              <w:rPr>
-                <w:b w:val="0"/>
-                <w:i w:val="0"/>
-                <w:color w:val="1F2328"/>
-                <w:sz w:val="21"/>
-              </w:rPr>
-              <w:t>Escolha do Elixir/OTP justificada pela supervisão de processos</w:t>
-            </w:r>
-          </w:p>
-          <w:p>
-            <w:pPr>
-              <w:keepNext/>
-              <w:spacing w:before="80" w:after="0"/>
-            </w:pPr>
-            <w:r>
-              <w:rPr>
-                <w:b/>
-                <w:i w:val="0"/>
-                <w:color w:val="4A6FA5"/>
-                <w:sz w:val="22"/>
-              </w:rPr>
-              <w:t xml:space="preserve">Verificar   </w:t>
-            </w:r>
-            <w:r>
-              <w:rPr>
-                <w:rFonts w:ascii="Consolas" w:hAnsi="Consolas"/>
-                <w:b w:val="0"/>
-                <w:i w:val="0"/>
-                <w:color w:val="1F2328"/>
-                <w:sz w:val="19"/>
-              </w:rPr>
-              <w:t>docs/planejamento/arquitetura.md</w:t>
-            </w:r>
-          </w:p>
-        </w:tc>
-      </w:tr>
-    </w:tbl>
-    <w:p>
-      <w:pPr>
-        <w:spacing w:before="0" w:after="120"/>
-      </w:pPr>
-    </w:p>
-    <w:tbl>
-      <w:tblPr>
-        <w:tblW w:type="auto" w:w="0"/>
-        <w:jc w:val="center"/>
-        <w:tblLayout w:type="fixed"/>
-        <w:tblLook w:firstColumn="1" w:firstRow="1" w:lastColumn="0" w:lastRow="0" w:noHBand="0" w:noVBand="1" w:val="04A0"/>
-        <w:tblBorders>
-          <w:top w:val="nil"/>
-          <w:left w:val="nil"/>
-          <w:bottom w:val="nil"/>
-          <w:right w:val="nil"/>
-          <w:insideH w:val="nil"/>
-          <w:insideV w:val="nil"/>
-        </w:tblBorders>
-      </w:tblPr>
-      <w:tblGrid>
-        <w:gridCol w:w="11622"/>
-        <w:gridCol w:w="3402"/>
-      </w:tblGrid>
-      <w:tr>
-        <w:trPr>
-          <w:cantSplit/>
-        </w:trPr>
-        <w:tc>
-          <w:tcPr>
-            <w:tcW w:type="dxa" w:w="11622"/>
-            <w:shd w:val="clear" w:color="auto" w:fill="1B2A41"/>
-            <w:tcMar>
-              <w:top w:w="158" w:type="dxa"/>
-              <w:left w:w="158" w:type="dxa"/>
-              <w:bottom w:w="158" w:type="dxa"/>
-              <w:right w:w="158" w:type="dxa"/>
-            </w:tcMar>
-          </w:tcPr>
-          <w:p>
-            <w:pPr>
-              <w:keepNext/>
               <w:spacing w:before="0" w:after="0"/>
             </w:pPr>
             <w:r>
@@ -1544,36 +1238,66 @@
                 <w:rFonts w:ascii="Consolas" w:hAnsi="Consolas"/>
                 <w:b/>
                 <w:i w:val="0"/>
-                <w:color w:val="E9A23B"/>
-                <w:sz w:val="24"/>
+                <w:color w:val="4A6FA5"/>
+                <w:sz w:val="23"/>
               </w:rPr>
-              <w:t xml:space="preserve">FAB-104   </w:t>
-            </w:r>
-            <w:r>
-              <w:rPr>
-                <w:b/>
-                <w:i w:val="0"/>
-                <w:color w:val="FFFFFF"/>
-                <w:sz w:val="27"/>
-              </w:rPr>
-              <w:t>Dividir o trabalho e definir os critérios de desempenho</w:t>
+              <w:t>FAB-104</w:t>
             </w:r>
           </w:p>
         </w:tc>
         <w:tc>
           <w:tcPr>
-            <w:tcW w:type="dxa" w:w="3402"/>
-            <w:shd w:val="clear" w:color="auto" w:fill="2A9D8F"/>
+            <w:tcW w:type="dxa" w:w="10772"/>
+            <w:shd w:val="clear" w:color="auto" w:fill="FFFFFF"/>
             <w:tcMar>
-              <w:top w:w="158" w:type="dxa"/>
-              <w:left w:w="158" w:type="dxa"/>
-              <w:bottom w:w="158" w:type="dxa"/>
-              <w:right w:w="158" w:type="dxa"/>
+              <w:top w:w="68" w:type="dxa"/>
+              <w:left w:w="68" w:type="dxa"/>
+              <w:bottom w:w="68" w:type="dxa"/>
+              <w:right w:w="68" w:type="dxa"/>
             </w:tcMar>
           </w:tcPr>
           <w:p>
             <w:pPr>
-              <w:keepNext/>
+              <w:spacing w:before="0" w:after="20"/>
+            </w:pPr>
+            <w:r>
+              <w:rPr>
+                <w:b/>
+                <w:i w:val="0"/>
+                <w:color w:val="1B2A41"/>
+                <w:sz w:val="23"/>
+              </w:rPr>
+              <w:t>Dividir o trabalho e definir os critérios de desempenho</w:t>
+            </w:r>
+          </w:p>
+          <w:p>
+            <w:pPr>
+              <w:spacing w:before="0" w:after="0"/>
+            </w:pPr>
+            <w:r>
+              <w:rPr>
+                <w:b w:val="0"/>
+                <w:i w:val="0"/>
+                <w:color w:val="4A5160"/>
+                <w:sz w:val="20"/>
+              </w:rPr>
+              <w:t>Quebrar E2–E7 em tarefas com critérios de aceite executáveis e fixar os 8 critérios de desempenho da validação.</w:t>
+            </w:r>
+          </w:p>
+        </w:tc>
+        <w:tc>
+          <w:tcPr>
+            <w:tcW w:type="dxa" w:w="2551"/>
+            <w:shd w:val="clear" w:color="auto" w:fill="2A9D8F"/>
+            <w:tcMar>
+              <w:top w:w="68" w:type="dxa"/>
+              <w:left w:w="68" w:type="dxa"/>
+              <w:bottom w:w="68" w:type="dxa"/>
+              <w:right w:w="68" w:type="dxa"/>
+            </w:tcMar>
+          </w:tcPr>
+          <w:p>
+            <w:pPr>
               <w:spacing w:before="0" w:after="0"/>
               <w:jc w:val="center"/>
             </w:pPr>
@@ -1582,7 +1306,7 @@
                 <w:b/>
                 <w:i w:val="0"/>
                 <w:color w:val="FFFFFF"/>
-                <w:sz w:val="25"/>
+                <w:sz w:val="23"/>
               </w:rPr>
               <w:t>✓ Concluída</w:t>
             </w:r>
@@ -1595,182 +1319,17 @@
         </w:trPr>
         <w:tc>
           <w:tcPr>
-            <w:tcW w:type="dxa" w:w="15024"/>
-            <w:gridSpan w:val="2"/>
+            <w:tcW w:type="dxa" w:w="1701"/>
             <w:shd w:val="clear" w:color="auto" w:fill="F2F4F7"/>
             <w:tcMar>
-              <w:top w:w="198" w:type="dxa"/>
-              <w:left w:w="198" w:type="dxa"/>
-              <w:bottom w:w="198" w:type="dxa"/>
-              <w:right w:w="198" w:type="dxa"/>
+              <w:top w:w="68" w:type="dxa"/>
+              <w:left w:w="68" w:type="dxa"/>
+              <w:bottom w:w="68" w:type="dxa"/>
+              <w:right w:w="68" w:type="dxa"/>
             </w:tcMar>
           </w:tcPr>
           <w:p>
             <w:pPr>
-              <w:keepNext/>
-              <w:spacing w:before="0" w:after="80"/>
-            </w:pPr>
-            <w:r>
-              <w:rPr>
-                <w:b/>
-                <w:i w:val="0"/>
-                <w:color w:val="4A6FA5"/>
-                <w:sz w:val="22"/>
-              </w:rPr>
-              <w:t xml:space="preserve">O que é   </w:t>
-            </w:r>
-            <w:r>
-              <w:rPr>
-                <w:b w:val="0"/>
-                <w:i w:val="0"/>
-                <w:color w:val="1F2328"/>
-                <w:sz w:val="23"/>
-              </w:rPr>
-              <w:t>O plano de desenvolvimento (10 etapas em cascata), os 8 critérios de desempenho com limite numérico e o quadro de tarefas de E2 a E7, uma tarefa por pacote do plano.</w:t>
-            </w:r>
-          </w:p>
-          <w:p>
-            <w:pPr>
-              <w:keepNext/>
-              <w:spacing w:before="0" w:after="80"/>
-            </w:pPr>
-            <w:r>
-              <w:rPr>
-                <w:b/>
-                <w:i w:val="0"/>
-                <w:color w:val="4A6FA5"/>
-                <w:sz w:val="22"/>
-              </w:rPr>
-              <w:t xml:space="preserve">Por que   </w:t>
-            </w:r>
-            <w:r>
-              <w:rPr>
-                <w:b w:val="0"/>
-                <w:i w:val="0"/>
-                <w:color w:val="1F2328"/>
-                <w:sz w:val="23"/>
-              </w:rPr>
-              <w:t>Os critérios são a régua da validação (E8–E10) e não mudam; o quadro de tarefas transforma cada etapa em entregas pequenas e verificáveis.</w:t>
-            </w:r>
-          </w:p>
-          <w:p>
-            <w:pPr>
-              <w:pStyle w:val="ListBullet"/>
-              <w:keepNext/>
-              <w:spacing w:after="20"/>
-            </w:pPr>
-            <w:r>
-              <w:rPr>
-                <w:b w:val="0"/>
-                <w:i w:val="0"/>
-                <w:color w:val="1F2328"/>
-                <w:sz w:val="21"/>
-              </w:rPr>
-              <w:t>Plano de desenvolvimento em Word</w:t>
-            </w:r>
-          </w:p>
-          <w:p>
-            <w:pPr>
-              <w:pStyle w:val="ListBullet"/>
-              <w:keepNext/>
-              <w:spacing w:after="20"/>
-            </w:pPr>
-            <w:r>
-              <w:rPr>
-                <w:b w:val="0"/>
-                <w:i w:val="0"/>
-                <w:color w:val="1F2328"/>
-                <w:sz w:val="21"/>
-              </w:rPr>
-              <w:t>8 critérios: constrói sozinho, conclui tarefas, pouco retrabalho, não aprova errado, governa de verdade, aguenta falha, custo sob controle, cabe na máquina</w:t>
-            </w:r>
-          </w:p>
-          <w:p>
-            <w:pPr>
-              <w:pStyle w:val="ListBullet"/>
-              <w:keepNext/>
-              <w:spacing w:after="20"/>
-            </w:pPr>
-            <w:r>
-              <w:rPr>
-                <w:b w:val="0"/>
-                <w:i w:val="0"/>
-                <w:color w:val="1F2328"/>
-                <w:sz w:val="21"/>
-              </w:rPr>
-              <w:t>39 tarefas de código distribuídas de E2 a E7</w:t>
-            </w:r>
-          </w:p>
-          <w:p>
-            <w:pPr>
-              <w:keepNext/>
-              <w:spacing w:before="80" w:after="0"/>
-            </w:pPr>
-            <w:r>
-              <w:rPr>
-                <w:b/>
-                <w:i w:val="0"/>
-                <w:color w:val="4A6FA5"/>
-                <w:sz w:val="22"/>
-              </w:rPr>
-              <w:t xml:space="preserve">Verificar   </w:t>
-            </w:r>
-            <w:r>
-              <w:rPr>
-                <w:rFonts w:ascii="Consolas" w:hAnsi="Consolas"/>
-                <w:b w:val="0"/>
-                <w:i w:val="0"/>
-                <w:color w:val="1F2328"/>
-                <w:sz w:val="19"/>
-              </w:rPr>
-              <w:t>docs/planejamento/plano-de-desenvolvimento.docx    docs/planejamento/criterios-de-desempenho.md    docs/tasks/</w:t>
-            </w:r>
-          </w:p>
-        </w:tc>
-      </w:tr>
-    </w:tbl>
-    <w:p>
-      <w:pPr>
-        <w:spacing w:before="0" w:after="120"/>
-      </w:pPr>
-    </w:p>
-    <w:tbl>
-      <w:tblPr>
-        <w:tblW w:type="auto" w:w="0"/>
-        <w:jc w:val="center"/>
-        <w:tblLayout w:type="fixed"/>
-        <w:tblLook w:firstColumn="1" w:firstRow="1" w:lastColumn="0" w:lastRow="0" w:noHBand="0" w:noVBand="1" w:val="04A0"/>
-        <w:tblBorders>
-          <w:top w:val="nil"/>
-          <w:left w:val="nil"/>
-          <w:bottom w:val="nil"/>
-          <w:right w:val="nil"/>
-          <w:insideH w:val="nil"/>
-          <w:insideV w:val="nil"/>
-        </w:tblBorders>
-      </w:tblPr>
-      <w:tblGrid>
-        <w:gridCol w:w="11622"/>
-        <w:gridCol w:w="3402"/>
-      </w:tblGrid>
-      <w:tr>
-        <w:trPr>
-          <w:cantSplit/>
-        </w:trPr>
-        <w:tc>
-          <w:tcPr>
-            <w:tcW w:type="dxa" w:w="11622"/>
-            <w:shd w:val="clear" w:color="auto" w:fill="1B2A41"/>
-            <w:tcMar>
-              <w:top w:w="158" w:type="dxa"/>
-              <w:left w:w="158" w:type="dxa"/>
-              <w:bottom w:w="158" w:type="dxa"/>
-              <w:right w:w="158" w:type="dxa"/>
-            </w:tcMar>
-          </w:tcPr>
-          <w:p>
-            <w:pPr>
-              <w:keepNext/>
               <w:spacing w:before="0" w:after="0"/>
             </w:pPr>
             <w:r>
@@ -1778,36 +1337,66 @@
                 <w:rFonts w:ascii="Consolas" w:hAnsi="Consolas"/>
                 <w:b/>
                 <w:i w:val="0"/>
-                <w:color w:val="E9A23B"/>
-                <w:sz w:val="24"/>
+                <w:color w:val="4A6FA5"/>
+                <w:sz w:val="23"/>
               </w:rPr>
-              <w:t xml:space="preserve">FAB-105   </w:t>
-            </w:r>
-            <w:r>
-              <w:rPr>
-                <w:b/>
-                <w:i w:val="0"/>
-                <w:color w:val="FFFFFF"/>
-                <w:sz w:val="27"/>
-              </w:rPr>
-              <w:t>Definir os cinco projetos de teste</w:t>
+              <w:t>FAB-105</w:t>
             </w:r>
           </w:p>
         </w:tc>
         <w:tc>
           <w:tcPr>
-            <w:tcW w:type="dxa" w:w="3402"/>
-            <w:shd w:val="clear" w:color="auto" w:fill="E9A23B"/>
+            <w:tcW w:type="dxa" w:w="10772"/>
+            <w:shd w:val="clear" w:color="auto" w:fill="F2F4F7"/>
             <w:tcMar>
-              <w:top w:w="158" w:type="dxa"/>
-              <w:left w:w="158" w:type="dxa"/>
-              <w:bottom w:w="158" w:type="dxa"/>
-              <w:right w:w="158" w:type="dxa"/>
+              <w:top w:w="68" w:type="dxa"/>
+              <w:left w:w="68" w:type="dxa"/>
+              <w:bottom w:w="68" w:type="dxa"/>
+              <w:right w:w="68" w:type="dxa"/>
             </w:tcMar>
           </w:tcPr>
           <w:p>
             <w:pPr>
-              <w:keepNext/>
+              <w:spacing w:before="0" w:after="20"/>
+            </w:pPr>
+            <w:r>
+              <w:rPr>
+                <w:b/>
+                <w:i w:val="0"/>
+                <w:color w:val="1B2A41"/>
+                <w:sz w:val="23"/>
+              </w:rPr>
+              <w:t>Definir os cinco projetos de teste</w:t>
+            </w:r>
+          </w:p>
+          <w:p>
+            <w:pPr>
+              <w:spacing w:before="0" w:after="0"/>
+            </w:pPr>
+            <w:r>
+              <w:rPr>
+                <w:b w:val="0"/>
+                <w:i w:val="0"/>
+                <w:color w:val="4A5160"/>
+                <w:sz w:val="20"/>
+              </w:rPr>
+              <w:t>Escolher cinco pedidos reais, de tamanhos e domínios diferentes, que a validação (E8–E10) vai executar sem intervenção.</w:t>
+            </w:r>
+          </w:p>
+        </w:tc>
+        <w:tc>
+          <w:tcPr>
+            <w:tcW w:type="dxa" w:w="2551"/>
+            <w:shd w:val="clear" w:color="auto" w:fill="E9A23B"/>
+            <w:tcMar>
+              <w:top w:w="68" w:type="dxa"/>
+              <w:left w:w="68" w:type="dxa"/>
+              <w:bottom w:w="68" w:type="dxa"/>
+              <w:right w:w="68" w:type="dxa"/>
+            </w:tcMar>
+          </w:tcPr>
+          <w:p>
+            <w:pPr>
               <w:spacing w:before="0" w:after="0"/>
               <w:jc w:val="center"/>
             </w:pPr>
@@ -1816,142 +1405,14 @@
                 <w:b/>
                 <w:i w:val="0"/>
                 <w:color w:val="FFFFFF"/>
-                <w:sz w:val="25"/>
+                <w:sz w:val="23"/>
               </w:rPr>
               <w:t>■ Em andamento</w:t>
             </w:r>
           </w:p>
         </w:tc>
       </w:tr>
-      <w:tr>
-        <w:trPr>
-          <w:cantSplit/>
-        </w:trPr>
-        <w:tc>
-          <w:tcPr>
-            <w:tcW w:type="dxa" w:w="15024"/>
-            <w:gridSpan w:val="2"/>
-            <w:shd w:val="clear" w:color="auto" w:fill="F2F4F7"/>
-            <w:tcMar>
-              <w:top w:w="198" w:type="dxa"/>
-              <w:left w:w="198" w:type="dxa"/>
-              <w:bottom w:w="198" w:type="dxa"/>
-              <w:right w:w="198" w:type="dxa"/>
-            </w:tcMar>
-          </w:tcPr>
-          <w:p>
-            <w:pPr>
-              <w:keepNext/>
-              <w:spacing w:before="0" w:after="80"/>
-            </w:pPr>
-            <w:r>
-              <w:rPr>
-                <w:b/>
-                <w:i w:val="0"/>
-                <w:color w:val="4A6FA5"/>
-                <w:sz w:val="22"/>
-              </w:rPr>
-              <w:t xml:space="preserve">O que é   </w:t>
-            </w:r>
-            <w:r>
-              <w:rPr>
-                <w:b w:val="0"/>
-                <w:i w:val="0"/>
-                <w:color w:val="1F2328"/>
-                <w:sz w:val="23"/>
-              </w:rPr>
-              <w:t>Proposta de cinco projetos reais, de tamanhos e tipos diferentes, que a validação vai executar do pedido à entrega sem intervenção humana.</w:t>
-            </w:r>
-          </w:p>
-          <w:p>
-            <w:pPr>
-              <w:keepNext/>
-              <w:spacing w:before="0" w:after="80"/>
-            </w:pPr>
-            <w:r>
-              <w:rPr>
-                <w:b/>
-                <w:i w:val="0"/>
-                <w:color w:val="4A6FA5"/>
-                <w:sz w:val="22"/>
-              </w:rPr>
-              <w:t xml:space="preserve">Por que   </w:t>
-            </w:r>
-            <w:r>
-              <w:rPr>
-                <w:b w:val="0"/>
-                <w:i w:val="0"/>
-                <w:color w:val="1F2328"/>
-                <w:sz w:val="23"/>
-              </w:rPr>
-              <w:t>Os critérios de desempenho são medidos nesses projetos; escolhê-los antes da construção evita ajustar a régua ao sistema.</w:t>
-            </w:r>
-          </w:p>
-          <w:p>
-            <w:pPr>
-              <w:pStyle w:val="ListBullet"/>
-              <w:keepNext/>
-              <w:spacing w:after="20"/>
-            </w:pPr>
-            <w:r>
-              <w:rPr>
-                <w:b w:val="0"/>
-                <w:i w:val="0"/>
-                <w:color w:val="1F2328"/>
-                <w:sz w:val="21"/>
-              </w:rPr>
-              <w:t>P1 lista de tarefas em terminal · P2 API de biblioteca · P3 relatório a partir de planilha · P4 site de portfólio · P5 apresentação a partir de dados</w:t>
-            </w:r>
-          </w:p>
-          <w:p>
-            <w:pPr>
-              <w:pStyle w:val="ListBullet"/>
-              <w:keepNext/>
-              <w:spacing w:after="20"/>
-            </w:pPr>
-            <w:r>
-              <w:rPr>
-                <w:b w:val="0"/>
-                <w:i w:val="0"/>
-                <w:color w:val="1F2328"/>
-                <w:sz w:val="21"/>
-              </w:rPr>
-              <w:t>Cada projeto tem o pedido em linguagem natural e o que conta como entregue</w:t>
-            </w:r>
-          </w:p>
-          <w:p>
-            <w:pPr>
-              <w:keepNext/>
-              <w:spacing w:before="80" w:after="0"/>
-            </w:pPr>
-            <w:r>
-              <w:rPr>
-                <w:b/>
-                <w:i w:val="0"/>
-                <w:color w:val="4A6FA5"/>
-                <w:sz w:val="22"/>
-              </w:rPr>
-              <w:t xml:space="preserve">Verificar   </w:t>
-            </w:r>
-            <w:r>
-              <w:rPr>
-                <w:rFonts w:ascii="Consolas" w:hAnsi="Consolas"/>
-                <w:b w:val="0"/>
-                <w:i w:val="0"/>
-                <w:color w:val="1F2328"/>
-                <w:sz w:val="19"/>
-              </w:rPr>
-              <w:t>docs/planejamento/projetos-de-teste.md</w:t>
-            </w:r>
-          </w:p>
-        </w:tc>
-      </w:tr>
     </w:tbl>
-    <w:p>
-      <w:pPr>
-        <w:spacing w:before="0" w:after="120"/>
-      </w:pPr>
-    </w:p>
     <w:p>
       <w:pPr>
         <w:pageBreakBefore/>

</xml_diff>

<commit_message>
chore: E2 — roteiro de estudo didático, apresentação com conceitos e diagramas, tickets com ideia e visão geral
</commit_message>
<xml_diff>
--- a/apresentacao-orientador/relatorios-por-etapa/E1-planejamento.docx
+++ b/apresentacao-orientador/relatorios-por-etapa/E1-planejamento.docx
@@ -1497,7 +1497,7 @@
                 <w:b/>
                 <w:i w:val="0"/>
                 <w:color w:val="FFFFFF"/>
-                <w:sz w:val="32"/>
+                <w:sz w:val="30"/>
               </w:rPr>
               <w:t>Requisitos, arquitetura, tarefas, critérios e projetos de teste aprovados.</w:t>
             </w:r>
@@ -1507,7 +1507,7 @@
     </w:tbl>
     <w:p>
       <w:pPr>
-        <w:spacing w:before="0" w:after="160"/>
+        <w:spacing w:before="0" w:after="80"/>
       </w:pPr>
     </w:p>
     <w:p>

</xml_diff>

<commit_message>
tcc: relatorios Word E1-E7 e apresentacao principal regerados
Saida do gerador dos commits anteriores. Sai a copia 'E2-fundacao (NOVA - para aprovar).docx': a proposta foi aprovada e virou o E2-fundacao.docx. A apresentacao principal reflete a recontagem dos requisitos (8 atendidos, 6 parciais, 1 pendente).
</commit_message>
<xml_diff>
--- a/apresentacao-orientador/relatorios-por-etapa/E1-planejamento.docx
+++ b/apresentacao-orientador/relatorios-por-etapa/E1-planejamento.docx
@@ -387,16 +387,18 @@
         </w:tblBorders>
       </w:tblPr>
       <w:tblGrid>
-        <w:gridCol w:w="3005"/>
-        <w:gridCol w:w="3005"/>
-        <w:gridCol w:w="3005"/>
-        <w:gridCol w:w="3005"/>
-        <w:gridCol w:w="3005"/>
+        <w:gridCol w:w="2146"/>
+        <w:gridCol w:w="2146"/>
+        <w:gridCol w:w="2146"/>
+        <w:gridCol w:w="2146"/>
+        <w:gridCol w:w="2146"/>
+        <w:gridCol w:w="2146"/>
+        <w:gridCol w:w="2146"/>
       </w:tblGrid>
       <w:tr>
         <w:tc>
           <w:tcPr>
-            <w:tcW w:type="dxa" w:w="3005"/>
+            <w:tcW w:type="dxa" w:w="2146"/>
             <w:shd w:val="clear" w:color="auto" w:fill="FFFFFF"/>
             <w:tcMar>
               <w:top w:w="85" w:type="dxa"/>
@@ -431,7 +433,7 @@
         </w:tc>
         <w:tc>
           <w:tcPr>
-            <w:tcW w:type="dxa" w:w="3005"/>
+            <w:tcW w:type="dxa" w:w="2146"/>
             <w:shd w:val="clear" w:color="auto" w:fill="FFFFFF"/>
             <w:tcMar>
               <w:top w:w="85" w:type="dxa"/>
@@ -460,13 +462,13 @@
                 <w:color w:val="1B2A41"/>
                 <w:sz w:val="23"/>
               </w:rPr>
-              <w:t>Como funciona</w:t>
+              <w:t>O problema</w:t>
             </w:r>
           </w:p>
         </w:tc>
         <w:tc>
           <w:tcPr>
-            <w:tcW w:type="dxa" w:w="3005"/>
+            <w:tcW w:type="dxa" w:w="2146"/>
             <w:shd w:val="clear" w:color="auto" w:fill="FFFFFF"/>
             <w:tcMar>
               <w:top w:w="85" w:type="dxa"/>
@@ -495,13 +497,13 @@
                 <w:color w:val="1B2A41"/>
                 <w:sz w:val="23"/>
               </w:rPr>
-              <w:t>Tarefa por tarefa</w:t>
+              <w:t>Conceitos</w:t>
             </w:r>
           </w:p>
         </w:tc>
         <w:tc>
           <w:tcPr>
-            <w:tcW w:type="dxa" w:w="3005"/>
+            <w:tcW w:type="dxa" w:w="2146"/>
             <w:shd w:val="clear" w:color="auto" w:fill="FFFFFF"/>
             <w:tcMar>
               <w:top w:w="85" w:type="dxa"/>
@@ -530,13 +532,13 @@
                 <w:color w:val="1B2A41"/>
                 <w:sz w:val="23"/>
               </w:rPr>
-              <w:t>Como se prova</w:t>
+              <w:t>As 5 peças</w:t>
             </w:r>
           </w:p>
         </w:tc>
         <w:tc>
           <w:tcPr>
-            <w:tcW w:type="dxa" w:w="3005"/>
+            <w:tcW w:type="dxa" w:w="2146"/>
             <w:shd w:val="clear" w:color="auto" w:fill="FFFFFF"/>
             <w:tcMar>
               <w:top w:w="85" w:type="dxa"/>
@@ -557,6 +559,76 @@
                 <w:sz w:val="28"/>
               </w:rPr>
               <w:t xml:space="preserve">5  </w:t>
+            </w:r>
+            <w:r>
+              <w:rPr>
+                <w:b/>
+                <w:i w:val="0"/>
+                <w:color w:val="1B2A41"/>
+                <w:sz w:val="23"/>
+              </w:rPr>
+              <w:t>A prova</w:t>
+            </w:r>
+          </w:p>
+        </w:tc>
+        <w:tc>
+          <w:tcPr>
+            <w:tcW w:type="dxa" w:w="2146"/>
+            <w:shd w:val="clear" w:color="auto" w:fill="FFFFFF"/>
+            <w:tcMar>
+              <w:top w:w="85" w:type="dxa"/>
+              <w:left w:w="85" w:type="dxa"/>
+              <w:bottom w:w="85" w:type="dxa"/>
+              <w:right w:w="85" w:type="dxa"/>
+            </w:tcMar>
+          </w:tcPr>
+          <w:p>
+            <w:pPr>
+              <w:spacing w:before="0" w:after="0"/>
+            </w:pPr>
+            <w:r>
+              <w:rPr>
+                <w:b/>
+                <w:i w:val="0"/>
+                <w:color w:val="E9A23B"/>
+                <w:sz w:val="28"/>
+              </w:rPr>
+              <w:t xml:space="preserve">6  </w:t>
+            </w:r>
+            <w:r>
+              <w:rPr>
+                <w:b/>
+                <w:i w:val="0"/>
+                <w:color w:val="1B2A41"/>
+                <w:sz w:val="23"/>
+              </w:rPr>
+              <w:t>Números</w:t>
+            </w:r>
+          </w:p>
+        </w:tc>
+        <w:tc>
+          <w:tcPr>
+            <w:tcW w:type="dxa" w:w="2146"/>
+            <w:shd w:val="clear" w:color="auto" w:fill="FFFFFF"/>
+            <w:tcMar>
+              <w:top w:w="85" w:type="dxa"/>
+              <w:left w:w="85" w:type="dxa"/>
+              <w:bottom w:w="85" w:type="dxa"/>
+              <w:right w:w="85" w:type="dxa"/>
+            </w:tcMar>
+          </w:tcPr>
+          <w:p>
+            <w:pPr>
+              <w:spacing w:before="0" w:after="0"/>
+            </w:pPr>
+            <w:r>
+              <w:rPr>
+                <w:b/>
+                <w:i w:val="0"/>
+                <w:color w:val="E9A23B"/>
+                <w:sz w:val="28"/>
+              </w:rPr>
+              <w:t xml:space="preserve">7  </w:t>
             </w:r>
             <w:r>
               <w:rPr>
@@ -598,7 +670,7 @@
           <w:color w:val="6B7480"/>
           <w:sz w:val="25"/>
         </w:rPr>
-        <w:t>A E1 não constrói camada: ela desenha o sistema inteiro. A construção começa pela base, na E2, e sobe uma camada por etapa.</w:t>
+        <w:t>O sistema é construído em degraus, um por etapa. A E1 não constrói um degrau: desenha a planta de todos eles.</w:t>
       </w:r>
     </w:p>
     <w:p>
@@ -608,7 +680,7 @@
       <w:r>
         <w:drawing>
           <wp:inline xmlns:a="http://schemas.openxmlformats.org/drawingml/2006/main" xmlns:pic="http://schemas.openxmlformats.org/drawingml/2006/picture">
-            <wp:extent cx="7560000" cy="3190539"/>
+            <wp:extent cx="8640000" cy="3481473"/>
             <wp:docPr id="1" name="Picture 1"/>
             <wp:cNvGraphicFramePr>
               <a:graphicFrameLocks noChangeAspect="1"/>
@@ -629,7 +701,7 @@
                   <pic:spPr>
                     <a:xfrm>
                       <a:off x="0" y="0"/>
-                      <a:ext cx="7560000" cy="3190539"/>
+                      <a:ext cx="8640000" cy="3481473"/>
                     </a:xfrm>
                     <a:prstGeom prst="rect"/>
                   </pic:spPr>
@@ -653,7 +725,7 @@
           <w:color w:val="1B2A41"/>
           <w:sz w:val="48"/>
         </w:rPr>
-        <w:t>Como funciona</w:t>
+        <w:t>A ideia: que problema esta etapa resolve</w:t>
       </w:r>
     </w:p>
     <w:p>
@@ -667,7 +739,922 @@
           <w:color w:val="6B7480"/>
           <w:sz w:val="25"/>
         </w:rPr>
-        <w:t>O desenho mostra as peças desta etapa e como elas conversam.</w:t>
+        <w:t>Antes de construir os agentes, estes problemas precisavam estar resolvidos.</w:t>
+      </w:r>
+    </w:p>
+    <w:tbl>
+      <w:tblPr>
+        <w:tblW w:type="auto" w:w="0"/>
+        <w:jc w:val="center"/>
+        <w:tblLayout w:type="fixed"/>
+        <w:tblLook w:firstColumn="1" w:firstRow="1" w:lastColumn="0" w:lastRow="0" w:noHBand="0" w:noVBand="1" w:val="04A0"/>
+        <w:tblBorders>
+          <w:top w:val="nil"/>
+          <w:left w:val="nil"/>
+          <w:bottom w:val="nil"/>
+          <w:right w:val="nil"/>
+          <w:insideH w:val="nil"/>
+          <w:insideV w:val="nil"/>
+        </w:tblBorders>
+      </w:tblPr>
+      <w:tblGrid>
+        <w:gridCol w:w="5386"/>
+        <w:gridCol w:w="4535"/>
+        <w:gridCol w:w="5102"/>
+      </w:tblGrid>
+      <w:tr>
+        <w:trPr>
+          <w:cantSplit/>
+        </w:trPr>
+        <w:tc>
+          <w:tcPr>
+            <w:tcW w:type="dxa" w:w="5386"/>
+            <w:shd w:val="clear" w:color="auto" w:fill="1B2A41"/>
+            <w:tcMar>
+              <w:top w:w="124" w:type="dxa"/>
+              <w:left w:w="124" w:type="dxa"/>
+              <w:bottom w:w="124" w:type="dxa"/>
+              <w:right w:w="124" w:type="dxa"/>
+            </w:tcMar>
+          </w:tcPr>
+          <w:p>
+            <w:pPr>
+              <w:spacing w:before="0" w:after="0"/>
+            </w:pPr>
+            <w:r>
+              <w:rPr>
+                <w:b/>
+                <w:i w:val="0"/>
+                <w:color w:val="FFFFFF"/>
+                <w:sz w:val="23"/>
+              </w:rPr>
+              <w:t>Problema</w:t>
+            </w:r>
+          </w:p>
+        </w:tc>
+        <w:tc>
+          <w:tcPr>
+            <w:tcW w:type="dxa" w:w="4535"/>
+            <w:shd w:val="clear" w:color="auto" w:fill="1B2A41"/>
+            <w:tcMar>
+              <w:top w:w="124" w:type="dxa"/>
+              <w:left w:w="124" w:type="dxa"/>
+              <w:bottom w:w="124" w:type="dxa"/>
+              <w:right w:w="124" w:type="dxa"/>
+            </w:tcMar>
+          </w:tcPr>
+          <w:p>
+            <w:pPr>
+              <w:spacing w:before="0" w:after="0"/>
+            </w:pPr>
+            <w:r>
+              <w:rPr>
+                <w:b/>
+                <w:i w:val="0"/>
+                <w:color w:val="FFFFFF"/>
+                <w:sz w:val="23"/>
+              </w:rPr>
+              <w:t>Sem resolver agora…</w:t>
+            </w:r>
+          </w:p>
+        </w:tc>
+        <w:tc>
+          <w:tcPr>
+            <w:tcW w:type="dxa" w:w="5102"/>
+            <w:shd w:val="clear" w:color="auto" w:fill="1B2A41"/>
+            <w:tcMar>
+              <w:top w:w="124" w:type="dxa"/>
+              <w:left w:w="124" w:type="dxa"/>
+              <w:bottom w:w="124" w:type="dxa"/>
+              <w:right w:w="124" w:type="dxa"/>
+            </w:tcMar>
+          </w:tcPr>
+          <w:p>
+            <w:pPr>
+              <w:spacing w:before="0" w:after="0"/>
+            </w:pPr>
+            <w:r>
+              <w:rPr>
+                <w:b/>
+                <w:i w:val="0"/>
+                <w:color w:val="FFFFFF"/>
+                <w:sz w:val="23"/>
+              </w:rPr>
+              <w:t>O que a etapa constrói</w:t>
+            </w:r>
+          </w:p>
+        </w:tc>
+      </w:tr>
+      <w:tr>
+        <w:trPr>
+          <w:cantSplit/>
+        </w:trPr>
+        <w:tc>
+          <w:tcPr>
+            <w:tcW w:type="dxa" w:w="5386"/>
+            <w:shd w:val="clear" w:color="auto" w:fill="F2F4F7"/>
+            <w:tcMar>
+              <w:top w:w="124" w:type="dxa"/>
+              <w:left w:w="124" w:type="dxa"/>
+              <w:bottom w:w="124" w:type="dxa"/>
+              <w:right w:w="124" w:type="dxa"/>
+            </w:tcMar>
+          </w:tcPr>
+          <w:p>
+            <w:pPr>
+              <w:spacing w:before="0" w:after="0"/>
+            </w:pPr>
+            <w:r>
+              <w:rPr>
+                <w:b/>
+                <w:i w:val="0"/>
+                <w:color w:val="1F2328"/>
+                <w:sz w:val="24"/>
+              </w:rPr>
+              <w:t>Sistemas multi-agente coordenam os agentes com instruções no texto do pedido ("não saia da pasta", "no máximo três tentativas")</w:t>
+            </w:r>
+          </w:p>
+        </w:tc>
+        <w:tc>
+          <w:tcPr>
+            <w:tcW w:type="dxa" w:w="4535"/>
+            <w:shd w:val="clear" w:color="auto" w:fill="F2F4F7"/>
+            <w:tcMar>
+              <w:top w:w="124" w:type="dxa"/>
+              <w:left w:w="124" w:type="dxa"/>
+              <w:bottom w:w="124" w:type="dxa"/>
+              <w:right w:w="124" w:type="dxa"/>
+            </w:tcMar>
+          </w:tcPr>
+          <w:p>
+            <w:pPr>
+              <w:spacing w:before="0" w:after="0"/>
+            </w:pPr>
+            <w:r>
+              <w:rPr>
+                <w:b w:val="0"/>
+                <w:i w:val="0"/>
+                <w:color w:val="6B7480"/>
+                <w:sz w:val="24"/>
+              </w:rPr>
+              <w:t>instrução a um modelo é pedido, não garantia: ela pode ser ignorada</w:t>
+            </w:r>
+          </w:p>
+        </w:tc>
+        <w:tc>
+          <w:tcPr>
+            <w:tcW w:type="dxa" w:w="5102"/>
+            <w:shd w:val="clear" w:color="auto" w:fill="F2F4F7"/>
+            <w:tcMar>
+              <w:top w:w="124" w:type="dxa"/>
+              <w:left w:w="124" w:type="dxa"/>
+              <w:bottom w:w="124" w:type="dxa"/>
+              <w:right w:w="124" w:type="dxa"/>
+            </w:tcMar>
+          </w:tcPr>
+          <w:p>
+            <w:pPr>
+              <w:spacing w:before="0" w:after="0"/>
+            </w:pPr>
+            <w:r>
+              <w:rPr>
+                <w:b/>
+                <w:i w:val="0"/>
+                <w:color w:val="2A9D8F"/>
+                <w:sz w:val="24"/>
+              </w:rPr>
+              <w:t>uma arquitetura em que cada regra mora na estrutura do programa</w:t>
+            </w:r>
+          </w:p>
+        </w:tc>
+      </w:tr>
+      <w:tr>
+        <w:trPr>
+          <w:cantSplit/>
+        </w:trPr>
+        <w:tc>
+          <w:tcPr>
+            <w:tcW w:type="dxa" w:w="5386"/>
+            <w:shd w:val="clear" w:color="auto" w:fill="FFFFFF"/>
+            <w:tcMar>
+              <w:top w:w="124" w:type="dxa"/>
+              <w:left w:w="124" w:type="dxa"/>
+              <w:bottom w:w="124" w:type="dxa"/>
+              <w:right w:w="124" w:type="dxa"/>
+            </w:tcMar>
+          </w:tcPr>
+          <w:p>
+            <w:pPr>
+              <w:spacing w:before="0" w:after="0"/>
+            </w:pPr>
+            <w:r>
+              <w:rPr>
+                <w:b/>
+                <w:i w:val="0"/>
+                <w:color w:val="1F2328"/>
+                <w:sz w:val="24"/>
+              </w:rPr>
+              <w:t>Outros sistemas multi-agente já constroem software</w:t>
+            </w:r>
+          </w:p>
+        </w:tc>
+        <w:tc>
+          <w:tcPr>
+            <w:tcW w:type="dxa" w:w="4535"/>
+            <w:shd w:val="clear" w:color="auto" w:fill="FFFFFF"/>
+            <w:tcMar>
+              <w:top w:w="124" w:type="dxa"/>
+              <w:left w:w="124" w:type="dxa"/>
+              <w:bottom w:w="124" w:type="dxa"/>
+              <w:right w:w="124" w:type="dxa"/>
+            </w:tcMar>
+          </w:tcPr>
+          <w:p>
+            <w:pPr>
+              <w:spacing w:before="0" w:after="0"/>
+            </w:pPr>
+            <w:r>
+              <w:rPr>
+                <w:b w:val="0"/>
+                <w:i w:val="0"/>
+                <w:color w:val="6B7480"/>
+                <w:sz w:val="24"/>
+              </w:rPr>
+              <w:t>a contribuição do trabalho fica vaga</w:t>
+            </w:r>
+          </w:p>
+        </w:tc>
+        <w:tc>
+          <w:tcPr>
+            <w:tcW w:type="dxa" w:w="5102"/>
+            <w:shd w:val="clear" w:color="auto" w:fill="FFFFFF"/>
+            <w:tcMar>
+              <w:top w:w="124" w:type="dxa"/>
+              <w:left w:w="124" w:type="dxa"/>
+              <w:bottom w:w="124" w:type="dxa"/>
+              <w:right w:w="124" w:type="dxa"/>
+            </w:tcMar>
+          </w:tcPr>
+          <w:p>
+            <w:pPr>
+              <w:spacing w:before="0" w:after="0"/>
+            </w:pPr>
+            <w:r>
+              <w:rPr>
+                <w:b/>
+                <w:i w:val="0"/>
+                <w:color w:val="2A9D8F"/>
+                <w:sz w:val="24"/>
+              </w:rPr>
+              <w:t>comparação arquitetural com o sistema mais próximo</w:t>
+            </w:r>
+          </w:p>
+        </w:tc>
+      </w:tr>
+      <w:tr>
+        <w:trPr>
+          <w:cantSplit/>
+        </w:trPr>
+        <w:tc>
+          <w:tcPr>
+            <w:tcW w:type="dxa" w:w="5386"/>
+            <w:shd w:val="clear" w:color="auto" w:fill="F2F4F7"/>
+            <w:tcMar>
+              <w:top w:w="124" w:type="dxa"/>
+              <w:left w:w="124" w:type="dxa"/>
+              <w:bottom w:w="124" w:type="dxa"/>
+              <w:right w:w="124" w:type="dxa"/>
+            </w:tcMar>
+          </w:tcPr>
+          <w:p>
+            <w:pPr>
+              <w:spacing w:before="0" w:after="0"/>
+            </w:pPr>
+            <w:r>
+              <w:rPr>
+                <w:b/>
+                <w:i w:val="0"/>
+                <w:color w:val="1F2328"/>
+                <w:sz w:val="24"/>
+              </w:rPr>
+              <w:t>Um sistema grande, com muitas partes</w:t>
+            </w:r>
+          </w:p>
+        </w:tc>
+        <w:tc>
+          <w:tcPr>
+            <w:tcW w:type="dxa" w:w="4535"/>
+            <w:shd w:val="clear" w:color="auto" w:fill="F2F4F7"/>
+            <w:tcMar>
+              <w:top w:w="124" w:type="dxa"/>
+              <w:left w:w="124" w:type="dxa"/>
+              <w:bottom w:w="124" w:type="dxa"/>
+              <w:right w:w="124" w:type="dxa"/>
+            </w:tcMar>
+          </w:tcPr>
+          <w:p>
+            <w:pPr>
+              <w:spacing w:before="0" w:after="0"/>
+            </w:pPr>
+            <w:r>
+              <w:rPr>
+                <w:b w:val="0"/>
+                <w:i w:val="0"/>
+                <w:color w:val="6B7480"/>
+                <w:sz w:val="24"/>
+              </w:rPr>
+              <w:t>"pronto" vira opinião e nada diz quando cada parte está certa</w:t>
+            </w:r>
+          </w:p>
+        </w:tc>
+        <w:tc>
+          <w:tcPr>
+            <w:tcW w:type="dxa" w:w="5102"/>
+            <w:shd w:val="clear" w:color="auto" w:fill="F2F4F7"/>
+            <w:tcMar>
+              <w:top w:w="124" w:type="dxa"/>
+              <w:left w:w="124" w:type="dxa"/>
+              <w:bottom w:w="124" w:type="dxa"/>
+              <w:right w:w="124" w:type="dxa"/>
+            </w:tcMar>
+          </w:tcPr>
+          <w:p>
+            <w:pPr>
+              <w:spacing w:before="0" w:after="0"/>
+            </w:pPr>
+            <w:r>
+              <w:rPr>
+                <w:b/>
+                <w:i w:val="0"/>
+                <w:color w:val="2A9D8F"/>
+                <w:sz w:val="24"/>
+              </w:rPr>
+              <w:t>15 requisitos, cada um com a etapa responsável e a forma de verificar</w:t>
+            </w:r>
+          </w:p>
+        </w:tc>
+      </w:tr>
+      <w:tr>
+        <w:trPr>
+          <w:cantSplit/>
+        </w:trPr>
+        <w:tc>
+          <w:tcPr>
+            <w:tcW w:type="dxa" w:w="5386"/>
+            <w:shd w:val="clear" w:color="auto" w:fill="FFFFFF"/>
+            <w:tcMar>
+              <w:top w:w="124" w:type="dxa"/>
+              <w:left w:w="124" w:type="dxa"/>
+              <w:bottom w:w="124" w:type="dxa"/>
+              <w:right w:w="124" w:type="dxa"/>
+            </w:tcMar>
+          </w:tcPr>
+          <w:p>
+            <w:pPr>
+              <w:spacing w:before="0" w:after="0"/>
+            </w:pPr>
+            <w:r>
+              <w:rPr>
+                <w:b/>
+                <w:i w:val="0"/>
+                <w:color w:val="1F2328"/>
+                <w:sz w:val="24"/>
+              </w:rPr>
+              <w:t>A validação mede o sistema no fim</w:t>
+            </w:r>
+          </w:p>
+        </w:tc>
+        <w:tc>
+          <w:tcPr>
+            <w:tcW w:type="dxa" w:w="4535"/>
+            <w:shd w:val="clear" w:color="auto" w:fill="FFFFFF"/>
+            <w:tcMar>
+              <w:top w:w="124" w:type="dxa"/>
+              <w:left w:w="124" w:type="dxa"/>
+              <w:bottom w:w="124" w:type="dxa"/>
+              <w:right w:w="124" w:type="dxa"/>
+            </w:tcMar>
+          </w:tcPr>
+          <w:p>
+            <w:pPr>
+              <w:spacing w:before="0" w:after="0"/>
+            </w:pPr>
+            <w:r>
+              <w:rPr>
+                <w:b w:val="0"/>
+                <w:i w:val="0"/>
+                <w:color w:val="6B7480"/>
+                <w:sz w:val="24"/>
+              </w:rPr>
+              <w:t>a régua acaba ajustada ao resultado</w:t>
+            </w:r>
+          </w:p>
+        </w:tc>
+        <w:tc>
+          <w:tcPr>
+            <w:tcW w:type="dxa" w:w="5102"/>
+            <w:shd w:val="clear" w:color="auto" w:fill="FFFFFF"/>
+            <w:tcMar>
+              <w:top w:w="124" w:type="dxa"/>
+              <w:left w:w="124" w:type="dxa"/>
+              <w:bottom w:w="124" w:type="dxa"/>
+              <w:right w:w="124" w:type="dxa"/>
+            </w:tcMar>
+          </w:tcPr>
+          <w:p>
+            <w:pPr>
+              <w:spacing w:before="0" w:after="0"/>
+            </w:pPr>
+            <w:r>
+              <w:rPr>
+                <w:b/>
+                <w:i w:val="0"/>
+                <w:color w:val="2A9D8F"/>
+                <w:sz w:val="24"/>
+              </w:rPr>
+              <w:t>8 critérios com limite numérico e 5 projetos de teste, fixados antes de construir</w:t>
+            </w:r>
+          </w:p>
+        </w:tc>
+      </w:tr>
+    </w:tbl>
+    <w:p>
+      <w:pPr>
+        <w:pageBreakBefore/>
+        <w:spacing w:before="0" w:after="40"/>
+      </w:pPr>
+      <w:r>
+        <w:rPr>
+          <w:rFonts w:ascii="Cambria" w:hAnsi="Cambria"/>
+          <w:b/>
+          <w:i w:val="0"/>
+          <w:color w:val="1B2A41"/>
+          <w:sz w:val="48"/>
+        </w:rPr>
+        <w:t>Conceitos em 1 minuto</w:t>
+      </w:r>
+    </w:p>
+    <w:p>
+      <w:pPr>
+        <w:spacing w:before="0" w:after="200"/>
+      </w:pPr>
+      <w:r>
+        <w:rPr>
+          <w:b w:val="0"/>
+          <w:i w:val="0"/>
+          <w:color w:val="6B7480"/>
+          <w:sz w:val="25"/>
+        </w:rPr>
+        <w:t>Os termos que aparecem nesta etapa, explicados antes de serem usados.</w:t>
+      </w:r>
+    </w:p>
+    <w:tbl>
+      <w:tblPr>
+        <w:tblW w:type="auto" w:w="0"/>
+        <w:jc w:val="center"/>
+        <w:tblLayout w:type="fixed"/>
+        <w:tblLook w:firstColumn="1" w:firstRow="1" w:lastColumn="0" w:lastRow="0" w:noHBand="0" w:noVBand="1" w:val="04A0"/>
+        <w:tblBorders>
+          <w:top w:val="nil"/>
+          <w:left w:val="nil"/>
+          <w:bottom w:val="nil"/>
+          <w:right w:val="nil"/>
+          <w:insideH w:val="nil"/>
+          <w:insideV w:val="nil"/>
+        </w:tblBorders>
+      </w:tblPr>
+      <w:tblGrid>
+        <w:gridCol w:w="3402"/>
+        <w:gridCol w:w="11622"/>
+      </w:tblGrid>
+      <w:tr>
+        <w:trPr>
+          <w:cantSplit/>
+        </w:trPr>
+        <w:tc>
+          <w:tcPr>
+            <w:tcW w:type="dxa" w:w="3402"/>
+            <w:shd w:val="clear" w:color="auto" w:fill="1B2A41"/>
+            <w:tcMar>
+              <w:top w:w="124" w:type="dxa"/>
+              <w:left w:w="124" w:type="dxa"/>
+              <w:bottom w:w="124" w:type="dxa"/>
+              <w:right w:w="124" w:type="dxa"/>
+            </w:tcMar>
+          </w:tcPr>
+          <w:p>
+            <w:pPr>
+              <w:spacing w:before="0" w:after="0"/>
+            </w:pPr>
+            <w:r>
+              <w:rPr>
+                <w:b/>
+                <w:i w:val="0"/>
+                <w:color w:val="FFFFFF"/>
+                <w:sz w:val="25"/>
+              </w:rPr>
+              <w:t>Agente</w:t>
+            </w:r>
+          </w:p>
+        </w:tc>
+        <w:tc>
+          <w:tcPr>
+            <w:tcW w:type="dxa" w:w="11622"/>
+            <w:shd w:val="clear" w:color="auto" w:fill="F2F4F7"/>
+            <w:tcMar>
+              <w:top w:w="124" w:type="dxa"/>
+              <w:left w:w="124" w:type="dxa"/>
+              <w:bottom w:w="124" w:type="dxa"/>
+              <w:right w:w="124" w:type="dxa"/>
+            </w:tcMar>
+          </w:tcPr>
+          <w:p>
+            <w:pPr>
+              <w:spacing w:before="0" w:after="0"/>
+            </w:pPr>
+            <w:r>
+              <w:rPr>
+                <w:b w:val="0"/>
+                <w:i w:val="0"/>
+                <w:color w:val="1F2328"/>
+                <w:sz w:val="24"/>
+              </w:rPr>
+              <w:t>Um modelo de linguagem que, além de responder, usa ferramentas (ler e escrever arquivos, rodar comandos) em laço até terminar uma tarefa. Multi-agente: vários, com papéis distintos.</w:t>
+            </w:r>
+          </w:p>
+        </w:tc>
+      </w:tr>
+      <w:tr>
+        <w:trPr>
+          <w:cantSplit/>
+        </w:trPr>
+        <w:tc>
+          <w:tcPr>
+            <w:tcW w:type="dxa" w:w="3402"/>
+            <w:shd w:val="clear" w:color="auto" w:fill="1B2A41"/>
+            <w:tcMar>
+              <w:top w:w="124" w:type="dxa"/>
+              <w:left w:w="124" w:type="dxa"/>
+              <w:bottom w:w="124" w:type="dxa"/>
+              <w:right w:w="124" w:type="dxa"/>
+            </w:tcMar>
+          </w:tcPr>
+          <w:p>
+            <w:pPr>
+              <w:spacing w:before="0" w:after="0"/>
+            </w:pPr>
+            <w:r>
+              <w:rPr>
+                <w:b/>
+                <w:i w:val="0"/>
+                <w:color w:val="FFFFFF"/>
+                <w:sz w:val="25"/>
+              </w:rPr>
+              <w:t>Governança</w:t>
+            </w:r>
+          </w:p>
+        </w:tc>
+        <w:tc>
+          <w:tcPr>
+            <w:tcW w:type="dxa" w:w="11622"/>
+            <w:shd w:val="clear" w:color="auto" w:fill="FFFFFF"/>
+            <w:tcMar>
+              <w:top w:w="124" w:type="dxa"/>
+              <w:left w:w="124" w:type="dxa"/>
+              <w:bottom w:w="124" w:type="dxa"/>
+              <w:right w:w="124" w:type="dxa"/>
+            </w:tcMar>
+          </w:tcPr>
+          <w:p>
+            <w:pPr>
+              <w:spacing w:before="0" w:after="0"/>
+            </w:pPr>
+            <w:r>
+              <w:rPr>
+                <w:b w:val="0"/>
+                <w:i w:val="0"/>
+                <w:color w:val="1F2328"/>
+                <w:sz w:val="24"/>
+              </w:rPr>
+              <w:t>As regras que limitam cada agente: onde pode escrever, quantas vezes tenta, quem aprova o trabalho e quanto pode gastar.</w:t>
+            </w:r>
+          </w:p>
+        </w:tc>
+      </w:tr>
+      <w:tr>
+        <w:trPr>
+          <w:cantSplit/>
+        </w:trPr>
+        <w:tc>
+          <w:tcPr>
+            <w:tcW w:type="dxa" w:w="3402"/>
+            <w:shd w:val="clear" w:color="auto" w:fill="1B2A41"/>
+            <w:tcMar>
+              <w:top w:w="124" w:type="dxa"/>
+              <w:left w:w="124" w:type="dxa"/>
+              <w:bottom w:w="124" w:type="dxa"/>
+              <w:right w:w="124" w:type="dxa"/>
+            </w:tcMar>
+          </w:tcPr>
+          <w:p>
+            <w:pPr>
+              <w:spacing w:before="0" w:after="0"/>
+            </w:pPr>
+            <w:r>
+              <w:rPr>
+                <w:b/>
+                <w:i w:val="0"/>
+                <w:color w:val="FFFFFF"/>
+                <w:sz w:val="25"/>
+              </w:rPr>
+              <w:t>Regra estrutural</w:t>
+            </w:r>
+          </w:p>
+        </w:tc>
+        <w:tc>
+          <w:tcPr>
+            <w:tcW w:type="dxa" w:w="11622"/>
+            <w:shd w:val="clear" w:color="auto" w:fill="F2F4F7"/>
+            <w:tcMar>
+              <w:top w:w="124" w:type="dxa"/>
+              <w:left w:w="124" w:type="dxa"/>
+              <w:bottom w:w="124" w:type="dxa"/>
+              <w:right w:w="124" w:type="dxa"/>
+            </w:tcMar>
+          </w:tcPr>
+          <w:p>
+            <w:pPr>
+              <w:spacing w:before="0" w:after="0"/>
+            </w:pPr>
+            <w:r>
+              <w:rPr>
+                <w:b w:val="0"/>
+                <w:i w:val="0"/>
+                <w:color w:val="1F2328"/>
+                <w:sz w:val="24"/>
+              </w:rPr>
+              <w:t>Regra imposta pelo programa, e não pedida no texto: a ação proibida simplesmente não existe para o agente, então não há o que desobedecer.</w:t>
+            </w:r>
+          </w:p>
+        </w:tc>
+      </w:tr>
+      <w:tr>
+        <w:trPr>
+          <w:cantSplit/>
+        </w:trPr>
+        <w:tc>
+          <w:tcPr>
+            <w:tcW w:type="dxa" w:w="3402"/>
+            <w:shd w:val="clear" w:color="auto" w:fill="1B2A41"/>
+            <w:tcMar>
+              <w:top w:w="124" w:type="dxa"/>
+              <w:left w:w="124" w:type="dxa"/>
+              <w:bottom w:w="124" w:type="dxa"/>
+              <w:right w:w="124" w:type="dxa"/>
+            </w:tcMar>
+          </w:tcPr>
+          <w:p>
+            <w:pPr>
+              <w:spacing w:before="0" w:after="0"/>
+            </w:pPr>
+            <w:r>
+              <w:rPr>
+                <w:b/>
+                <w:i w:val="0"/>
+                <w:color w:val="FFFFFF"/>
+                <w:sz w:val="25"/>
+              </w:rPr>
+              <w:t>Portão</w:t>
+            </w:r>
+          </w:p>
+        </w:tc>
+        <w:tc>
+          <w:tcPr>
+            <w:tcW w:type="dxa" w:w="11622"/>
+            <w:shd w:val="clear" w:color="auto" w:fill="FFFFFF"/>
+            <w:tcMar>
+              <w:top w:w="124" w:type="dxa"/>
+              <w:left w:w="124" w:type="dxa"/>
+              <w:bottom w:w="124" w:type="dxa"/>
+              <w:right w:w="124" w:type="dxa"/>
+            </w:tcMar>
+          </w:tcPr>
+          <w:p>
+            <w:pPr>
+              <w:spacing w:before="0" w:after="0"/>
+            </w:pPr>
+            <w:r>
+              <w:rPr>
+                <w:b w:val="0"/>
+                <w:i w:val="0"/>
+                <w:color w:val="1F2328"/>
+                <w:sz w:val="24"/>
+              </w:rPr>
+              <w:t>Ponto de checagem que a entrega precisa passar para avançar. Aqui são dois, com perguntas diferentes: "funciona?" e "é o que foi pedido?".</w:t>
+            </w:r>
+          </w:p>
+        </w:tc>
+      </w:tr>
+      <w:tr>
+        <w:trPr>
+          <w:cantSplit/>
+        </w:trPr>
+        <w:tc>
+          <w:tcPr>
+            <w:tcW w:type="dxa" w:w="3402"/>
+            <w:shd w:val="clear" w:color="auto" w:fill="1B2A41"/>
+            <w:tcMar>
+              <w:top w:w="124" w:type="dxa"/>
+              <w:left w:w="124" w:type="dxa"/>
+              <w:bottom w:w="124" w:type="dxa"/>
+              <w:right w:w="124" w:type="dxa"/>
+            </w:tcMar>
+          </w:tcPr>
+          <w:p>
+            <w:pPr>
+              <w:spacing w:before="0" w:after="0"/>
+            </w:pPr>
+            <w:r>
+              <w:rPr>
+                <w:b/>
+                <w:i w:val="0"/>
+                <w:color w:val="FFFFFF"/>
+                <w:sz w:val="25"/>
+              </w:rPr>
+              <w:t>Requisito e restrição</w:t>
+            </w:r>
+          </w:p>
+        </w:tc>
+        <w:tc>
+          <w:tcPr>
+            <w:tcW w:type="dxa" w:w="11622"/>
+            <w:shd w:val="clear" w:color="auto" w:fill="F2F4F7"/>
+            <w:tcMar>
+              <w:top w:w="124" w:type="dxa"/>
+              <w:left w:w="124" w:type="dxa"/>
+              <w:bottom w:w="124" w:type="dxa"/>
+              <w:right w:w="124" w:type="dxa"/>
+            </w:tcMar>
+          </w:tcPr>
+          <w:p>
+            <w:pPr>
+              <w:spacing w:before="0" w:after="0"/>
+            </w:pPr>
+            <w:r>
+              <w:rPr>
+                <w:b w:val="0"/>
+                <w:i w:val="0"/>
+                <w:color w:val="1F2328"/>
+                <w:sz w:val="24"/>
+              </w:rPr>
+              <w:t>Requisito diz o que o sistema faz (R1–R8); restrição diz sob que condições ele precisa funcionar (R9–R15).</w:t>
+            </w:r>
+          </w:p>
+        </w:tc>
+      </w:tr>
+      <w:tr>
+        <w:trPr>
+          <w:cantSplit/>
+        </w:trPr>
+        <w:tc>
+          <w:tcPr>
+            <w:tcW w:type="dxa" w:w="3402"/>
+            <w:shd w:val="clear" w:color="auto" w:fill="1B2A41"/>
+            <w:tcMar>
+              <w:top w:w="124" w:type="dxa"/>
+              <w:left w:w="124" w:type="dxa"/>
+              <w:bottom w:w="124" w:type="dxa"/>
+              <w:right w:w="124" w:type="dxa"/>
+            </w:tcMar>
+          </w:tcPr>
+          <w:p>
+            <w:pPr>
+              <w:spacing w:before="0" w:after="0"/>
+            </w:pPr>
+            <w:r>
+              <w:rPr>
+                <w:b/>
+                <w:i w:val="0"/>
+                <w:color w:val="FFFFFF"/>
+                <w:sz w:val="25"/>
+              </w:rPr>
+              <w:t>Modelo em cascata</w:t>
+            </w:r>
+          </w:p>
+        </w:tc>
+        <w:tc>
+          <w:tcPr>
+            <w:tcW w:type="dxa" w:w="11622"/>
+            <w:shd w:val="clear" w:color="auto" w:fill="FFFFFF"/>
+            <w:tcMar>
+              <w:top w:w="124" w:type="dxa"/>
+              <w:left w:w="124" w:type="dxa"/>
+              <w:bottom w:w="124" w:type="dxa"/>
+              <w:right w:w="124" w:type="dxa"/>
+            </w:tcMar>
+          </w:tcPr>
+          <w:p>
+            <w:pPr>
+              <w:spacing w:before="0" w:after="0"/>
+            </w:pPr>
+            <w:r>
+              <w:rPr>
+                <w:b w:val="0"/>
+                <w:i w:val="0"/>
+                <w:color w:val="1F2328"/>
+                <w:sz w:val="24"/>
+              </w:rPr>
+              <w:t>Fases em sequência: cada etapa termina numa entrega que precisa estar pronta para a seguinte começar.</w:t>
+            </w:r>
+          </w:p>
+        </w:tc>
+      </w:tr>
+      <w:tr>
+        <w:trPr>
+          <w:cantSplit/>
+        </w:trPr>
+        <w:tc>
+          <w:tcPr>
+            <w:tcW w:type="dxa" w:w="3402"/>
+            <w:shd w:val="clear" w:color="auto" w:fill="1B2A41"/>
+            <w:tcMar>
+              <w:top w:w="124" w:type="dxa"/>
+              <w:left w:w="124" w:type="dxa"/>
+              <w:bottom w:w="124" w:type="dxa"/>
+              <w:right w:w="124" w:type="dxa"/>
+            </w:tcMar>
+          </w:tcPr>
+          <w:p>
+            <w:pPr>
+              <w:spacing w:before="0" w:after="0"/>
+            </w:pPr>
+            <w:r>
+              <w:rPr>
+                <w:b/>
+                <w:i w:val="0"/>
+                <w:color w:val="FFFFFF"/>
+                <w:sz w:val="25"/>
+              </w:rPr>
+              <w:t>Critério de desempenho</w:t>
+            </w:r>
+          </w:p>
+        </w:tc>
+        <w:tc>
+          <w:tcPr>
+            <w:tcW w:type="dxa" w:w="11622"/>
+            <w:shd w:val="clear" w:color="auto" w:fill="F2F4F7"/>
+            <w:tcMar>
+              <w:top w:w="124" w:type="dxa"/>
+              <w:left w:w="124" w:type="dxa"/>
+              <w:bottom w:w="124" w:type="dxa"/>
+              <w:right w:w="124" w:type="dxa"/>
+            </w:tcMar>
+          </w:tcPr>
+          <w:p>
+            <w:pPr>
+              <w:spacing w:before="0" w:after="0"/>
+            </w:pPr>
+            <w:r>
+              <w:rPr>
+                <w:b w:val="0"/>
+                <w:i w:val="0"/>
+                <w:color w:val="1F2328"/>
+                <w:sz w:val="24"/>
+              </w:rPr>
+              <w:t>Limite numérico que a validação precisa atingir. É fixado antes da construção e não muda: ajusta-se o sistema, nunca a régua.</w:t>
+            </w:r>
+          </w:p>
+        </w:tc>
+      </w:tr>
+    </w:tbl>
+    <w:p>
+      <w:pPr>
+        <w:pageBreakBefore/>
+        <w:spacing w:before="0" w:after="40"/>
+      </w:pPr>
+      <w:r>
+        <w:rPr>
+          <w:rFonts w:ascii="Cambria" w:hAnsi="Cambria"/>
+          <w:b/>
+          <w:i w:val="0"/>
+          <w:color w:val="1B2A41"/>
+          <w:sz w:val="48"/>
+        </w:rPr>
+        <w:t>Peça 1 · Requisitos R1–R15</w:t>
+      </w:r>
+    </w:p>
+    <w:p>
+      <w:pPr>
+        <w:spacing w:before="0" w:after="200"/>
+      </w:pPr>
+      <w:r>
+        <w:rPr>
+          <w:b w:val="0"/>
+          <w:i w:val="0"/>
+          <w:color w:val="6B7480"/>
+          <w:sz w:val="25"/>
+        </w:rPr>
+        <w:t>Quinze frases que dizem o que o sistema precisa fazer e sob que restrições — cada uma com a etapa que a entrega e a forma de provar.</w:t>
       </w:r>
     </w:p>
     <w:p>
@@ -677,7 +1664,7 @@
       <w:r>
         <w:drawing>
           <wp:inline xmlns:a="http://schemas.openxmlformats.org/drawingml/2006/main" xmlns:pic="http://schemas.openxmlformats.org/drawingml/2006/picture">
-            <wp:extent cx="8460000" cy="3689999"/>
+            <wp:extent cx="6676861" cy="2592000"/>
             <wp:docPr id="2" name="Picture 2"/>
             <wp:cNvGraphicFramePr>
               <a:graphicFrameLocks noChangeAspect="1"/>
@@ -686,7 +1673,7 @@
               <a:graphicData uri="http://schemas.openxmlformats.org/drawingml/2006/picture">
                 <pic:pic>
                   <pic:nvPicPr>
-                    <pic:cNvPr id="0" name="diag.png"/>
+                    <pic:cNvPr id="0" name="E1-requisitos.png"/>
                     <pic:cNvPicPr/>
                   </pic:nvPicPr>
                   <pic:blipFill>
@@ -698,7 +1685,7 @@
                   <pic:spPr>
                     <a:xfrm>
                       <a:off x="0" y="0"/>
-                      <a:ext cx="8460000" cy="3689999"/>
+                      <a:ext cx="6676861" cy="2592000"/>
                     </a:xfrm>
                     <a:prstGeom prst="rect"/>
                   </pic:spPr>
@@ -711,79 +1698,1798 @@
     </w:p>
     <w:p>
       <w:pPr>
-        <w:pStyle w:val="ListBullet"/>
-        <w:spacing w:after="40"/>
+        <w:spacing w:before="0" w:after="80"/>
+      </w:pPr>
+    </w:p>
+    <w:tbl>
+      <w:tblPr>
+        <w:tblW w:type="auto" w:w="0"/>
+        <w:jc w:val="center"/>
+        <w:tblLayout w:type="fixed"/>
+        <w:tblLook w:firstColumn="1" w:firstRow="1" w:lastColumn="0" w:lastRow="0" w:noHBand="0" w:noVBand="1" w:val="04A0"/>
+        <w:tblBorders>
+          <w:top w:val="nil"/>
+          <w:left w:val="nil"/>
+          <w:bottom w:val="nil"/>
+          <w:right w:val="nil"/>
+          <w:insideH w:val="nil"/>
+          <w:insideV w:val="nil"/>
+        </w:tblBorders>
+      </w:tblPr>
+      <w:tblGrid>
+        <w:gridCol w:w="9354"/>
+        <w:gridCol w:w="5669"/>
+      </w:tblGrid>
+      <w:tr>
+        <w:tc>
+          <w:tcPr>
+            <w:tcW w:type="dxa" w:w="9354"/>
+            <w:shd w:val="clear" w:color="auto" w:fill="F2F4F7"/>
+            <w:tcMar>
+              <w:top w:w="170" w:type="dxa"/>
+              <w:left w:w="170" w:type="dxa"/>
+              <w:bottom w:w="170" w:type="dxa"/>
+              <w:right w:w="170" w:type="dxa"/>
+            </w:tcMar>
+          </w:tcPr>
+          <w:p>
+            <w:pPr>
+              <w:spacing w:before="0" w:after="60"/>
+            </w:pPr>
+            <w:r>
+              <w:rPr>
+                <w:b/>
+                <w:i w:val="0"/>
+                <w:color w:val="4A6FA5"/>
+                <w:sz w:val="21"/>
+              </w:rPr>
+              <w:t>COMO FUNCIONA</w:t>
+            </w:r>
+          </w:p>
+          <w:p>
+            <w:pPr>
+              <w:pStyle w:val="ListBullet"/>
+              <w:spacing w:after="40"/>
+            </w:pPr>
+            <w:r>
+              <w:rPr>
+                <w:b w:val="0"/>
+                <w:i w:val="0"/>
+                <w:color w:val="1F2328"/>
+                <w:sz w:val="22"/>
+              </w:rPr>
+              <w:t>R1–R8 são o que o sistema faz: do pedido às tarefas, seis estados, dois julgamentos, retrabalho limitado, paralelismo, memória e tela ao vivo.</w:t>
+            </w:r>
+          </w:p>
+          <w:p>
+            <w:pPr>
+              <w:pStyle w:val="ListBullet"/>
+              <w:spacing w:after="40"/>
+            </w:pPr>
+            <w:r>
+              <w:rPr>
+                <w:b w:val="0"/>
+                <w:i w:val="0"/>
+                <w:color w:val="1F2328"/>
+                <w:sz w:val="22"/>
+              </w:rPr>
+              <w:t>R9–R15 são restrições: memória da máquina, custo, confinamento, testes sem internet, isolamento de falhas, teto de gasto, fornecedor trocável.</w:t>
+            </w:r>
+          </w:p>
+          <w:p>
+            <w:pPr>
+              <w:pStyle w:val="ListBullet"/>
+              <w:spacing w:after="40"/>
+            </w:pPr>
+            <w:r>
+              <w:rPr>
+                <w:b w:val="0"/>
+                <w:i w:val="0"/>
+                <w:color w:val="1F2328"/>
+                <w:sz w:val="22"/>
+              </w:rPr>
+              <w:t>Em cada restrição está escrito o mecanismo que a garante — uma restrição só é crível se algo no desenho a impõe.</w:t>
+            </w:r>
+          </w:p>
+        </w:tc>
+        <w:tc>
+          <w:tcPr>
+            <w:tcW w:type="dxa" w:w="5669"/>
+            <w:shd w:val="clear" w:color="auto" w:fill="2A9D8F"/>
+            <w:tcMar>
+              <w:top w:w="170" w:type="dxa"/>
+              <w:left w:w="170" w:type="dxa"/>
+              <w:bottom w:w="170" w:type="dxa"/>
+              <w:right w:w="170" w:type="dxa"/>
+            </w:tcMar>
+          </w:tcPr>
+          <w:p>
+            <w:pPr>
+              <w:spacing w:before="0" w:after="80"/>
+            </w:pPr>
+            <w:r>
+              <w:rPr>
+                <w:b/>
+                <w:i w:val="0"/>
+                <w:color w:val="FFFFFF"/>
+                <w:sz w:val="21"/>
+              </w:rPr>
+              <w:t>POR QUE É RELEVANTE</w:t>
+            </w:r>
+          </w:p>
+          <w:p>
+            <w:pPr>
+              <w:spacing w:before="0" w:after="0"/>
+            </w:pPr>
+            <w:r>
+              <w:rPr>
+                <w:b/>
+                <w:i w:val="0"/>
+                <w:color w:val="FFFFFF"/>
+                <w:sz w:val="24"/>
+              </w:rPr>
+              <w:t>Sem requisitos verificáveis, nenhuma etapa teria critério de pronto. Cada entrega do cronograma fica amarrada a algo que pode ser testado.</w:t>
+            </w:r>
+          </w:p>
+        </w:tc>
+      </w:tr>
+    </w:tbl>
+    <w:p>
+      <w:pPr>
+        <w:pageBreakBefore/>
+        <w:spacing w:before="0" w:after="40"/>
+      </w:pPr>
+      <w:r>
+        <w:rPr>
+          <w:rFonts w:ascii="Cambria" w:hAnsi="Cambria"/>
+          <w:b/>
+          <w:i w:val="0"/>
+          <w:color w:val="1B2A41"/>
+          <w:sz w:val="48"/>
+        </w:rPr>
+        <w:t>Os requisitos têm dono</w:t>
+      </w:r>
+    </w:p>
+    <w:p>
+      <w:pPr>
+        <w:spacing w:before="0" w:after="200"/>
       </w:pPr>
       <w:r>
         <w:rPr>
           <w:b w:val="0"/>
           <w:i w:val="0"/>
-          <w:color w:val="1F2328"/>
-          <w:sz w:val="24"/>
+          <w:color w:val="6B7480"/>
+          <w:sz w:val="25"/>
         </w:rPr>
-        <w:t>15 requisitos: 8 funcionais (R1–R8) e 7 restrições (R9–R15), cada um com etapa e forma de verificar.</w:t>
+        <w:t>Cada requisito é atendido por uma etapa da construção — é isso que transforma a lista num plano.</w:t>
       </w:r>
     </w:p>
     <w:p>
       <w:pPr>
-        <w:pStyle w:val="ListBullet"/>
-        <w:spacing w:after="40"/>
+        <w:jc w:val="center"/>
+      </w:pPr>
+      <w:r>
+        <w:drawing>
+          <wp:inline xmlns:a="http://schemas.openxmlformats.org/drawingml/2006/main" xmlns:pic="http://schemas.openxmlformats.org/drawingml/2006/picture">
+            <wp:extent cx="8639997" cy="1632093"/>
+            <wp:docPr id="3" name="Picture 3"/>
+            <wp:cNvGraphicFramePr>
+              <a:graphicFrameLocks noChangeAspect="1"/>
+            </wp:cNvGraphicFramePr>
+            <a:graphic>
+              <a:graphicData uri="http://schemas.openxmlformats.org/drawingml/2006/picture">
+                <pic:pic>
+                  <pic:nvPicPr>
+                    <pic:cNvPr id="0" name="E1-donos.png"/>
+                    <pic:cNvPicPr/>
+                  </pic:nvPicPr>
+                  <pic:blipFill>
+                    <a:blip r:embed="rId13"/>
+                    <a:stretch>
+                      <a:fillRect/>
+                    </a:stretch>
+                  </pic:blipFill>
+                  <pic:spPr>
+                    <a:xfrm>
+                      <a:off x="0" y="0"/>
+                      <a:ext cx="8639997" cy="1632093"/>
+                    </a:xfrm>
+                    <a:prstGeom prst="rect"/>
+                  </pic:spPr>
+                </pic:pic>
+              </a:graphicData>
+            </a:graphic>
+          </wp:inline>
+        </w:drawing>
+      </w:r>
+    </w:p>
+    <w:p>
+      <w:pPr>
+        <w:spacing w:before="0" w:after="80"/>
+      </w:pPr>
+    </w:p>
+    <w:tbl>
+      <w:tblPr>
+        <w:tblW w:type="auto" w:w="0"/>
+        <w:jc w:val="center"/>
+        <w:tblLayout w:type="fixed"/>
+        <w:tblLook w:firstColumn="1" w:firstRow="1" w:lastColumn="0" w:lastRow="0" w:noHBand="0" w:noVBand="1" w:val="04A0"/>
+        <w:tblBorders>
+          <w:top w:val="nil"/>
+          <w:left w:val="nil"/>
+          <w:bottom w:val="nil"/>
+          <w:right w:val="nil"/>
+          <w:insideH w:val="nil"/>
+          <w:insideV w:val="nil"/>
+        </w:tblBorders>
+      </w:tblPr>
+      <w:tblGrid>
+        <w:gridCol w:w="9354"/>
+        <w:gridCol w:w="5669"/>
+      </w:tblGrid>
+      <w:tr>
+        <w:tc>
+          <w:tcPr>
+            <w:tcW w:type="dxa" w:w="9354"/>
+            <w:shd w:val="clear" w:color="auto" w:fill="F2F4F7"/>
+            <w:tcMar>
+              <w:top w:w="170" w:type="dxa"/>
+              <w:left w:w="170" w:type="dxa"/>
+              <w:bottom w:w="170" w:type="dxa"/>
+              <w:right w:w="170" w:type="dxa"/>
+            </w:tcMar>
+          </w:tcPr>
+          <w:p>
+            <w:pPr>
+              <w:spacing w:before="0" w:after="60"/>
+            </w:pPr>
+            <w:r>
+              <w:rPr>
+                <w:b/>
+                <w:i w:val="0"/>
+                <w:color w:val="4A6FA5"/>
+                <w:sz w:val="21"/>
+              </w:rPr>
+              <w:t>COMO FUNCIONA</w:t>
+            </w:r>
+          </w:p>
+          <w:p>
+            <w:pPr>
+              <w:pStyle w:val="ListBullet"/>
+              <w:spacing w:after="40"/>
+            </w:pPr>
+            <w:r>
+              <w:rPr>
+                <w:b w:val="0"/>
+                <w:i w:val="0"/>
+                <w:color w:val="1F2328"/>
+                <w:sz w:val="22"/>
+              </w:rPr>
+              <w:t>A E2 cuida do custo (R10) e dos testes sem internet (R12); a E3, do confinamento (R11) e da troca de fornecedor (R15).</w:t>
+            </w:r>
+          </w:p>
+          <w:p>
+            <w:pPr>
+              <w:pStyle w:val="ListBullet"/>
+              <w:spacing w:after="40"/>
+            </w:pPr>
+            <w:r>
+              <w:rPr>
+                <w:b w:val="0"/>
+                <w:i w:val="0"/>
+                <w:color w:val="1F2328"/>
+                <w:sz w:val="22"/>
+              </w:rPr>
+              <w:t>A E4 concentra seis requisitos: é a linha de produção que leva a tarefa do pedido à conclusão, com teto de gasto.</w:t>
+            </w:r>
+          </w:p>
+          <w:p>
+            <w:pPr>
+              <w:pStyle w:val="ListBullet"/>
+              <w:spacing w:after="40"/>
+            </w:pPr>
+            <w:r>
+              <w:rPr>
+                <w:b w:val="0"/>
+                <w:i w:val="0"/>
+                <w:color w:val="1F2328"/>
+                <w:sz w:val="22"/>
+              </w:rPr>
+              <w:t>A E5 fecha paralelismo e falhas; a E6, a memória do projeto e o limite de 8 GB; a E7, a tela ao vivo.</w:t>
+            </w:r>
+          </w:p>
+        </w:tc>
+        <w:tc>
+          <w:tcPr>
+            <w:tcW w:type="dxa" w:w="5669"/>
+            <w:shd w:val="clear" w:color="auto" w:fill="2A9D8F"/>
+            <w:tcMar>
+              <w:top w:w="170" w:type="dxa"/>
+              <w:left w:w="170" w:type="dxa"/>
+              <w:bottom w:w="170" w:type="dxa"/>
+              <w:right w:w="170" w:type="dxa"/>
+            </w:tcMar>
+          </w:tcPr>
+          <w:p>
+            <w:pPr>
+              <w:spacing w:before="0" w:after="80"/>
+            </w:pPr>
+            <w:r>
+              <w:rPr>
+                <w:b/>
+                <w:i w:val="0"/>
+                <w:color w:val="FFFFFF"/>
+                <w:sz w:val="21"/>
+              </w:rPr>
+              <w:t>POR QUE É RELEVANTE</w:t>
+            </w:r>
+          </w:p>
+          <w:p>
+            <w:pPr>
+              <w:spacing w:before="0" w:after="0"/>
+            </w:pPr>
+            <w:r>
+              <w:rPr>
+                <w:b/>
+                <w:i w:val="0"/>
+                <w:color w:val="FFFFFF"/>
+                <w:sz w:val="24"/>
+              </w:rPr>
+              <w:t>Na apresentação de cada etapa, o orientador sabe de antemão quais requisitos devem aparecer provados.</w:t>
+            </w:r>
+          </w:p>
+        </w:tc>
+      </w:tr>
+    </w:tbl>
+    <w:p>
+      <w:pPr>
+        <w:pageBreakBefore/>
+        <w:spacing w:before="0" w:after="40"/>
+      </w:pPr>
+      <w:r>
+        <w:rPr>
+          <w:rFonts w:ascii="Cambria" w:hAnsi="Cambria"/>
+          <w:b/>
+          <w:i w:val="0"/>
+          <w:color w:val="1B2A41"/>
+          <w:sz w:val="48"/>
+        </w:rPr>
+        <w:t>Peça 2 · Estado da arte</w:t>
+      </w:r>
+    </w:p>
+    <w:p>
+      <w:pPr>
+        <w:spacing w:before="0" w:after="200"/>
       </w:pPr>
       <w:r>
         <w:rPr>
           <w:b w:val="0"/>
           <w:i w:val="0"/>
-          <w:color w:val="1F2328"/>
-          <w:sz w:val="24"/>
+          <w:color w:val="6B7480"/>
+          <w:sz w:val="25"/>
         </w:rPr>
-        <w:t>Arquitetura em 4 camadas (tela, motor, agentes, fronteiras) sobre um único banco PostgreSQL.</w:t>
+        <w:t>Quatro sistemas comparados pela arquitetura. O mais próximo, softwarefabrik.io, também guarda o estado fora da conversa — mas mantém a pessoa aprovando cada passo.</w:t>
       </w:r>
     </w:p>
     <w:p>
       <w:pPr>
-        <w:pStyle w:val="ListBullet"/>
-        <w:spacing w:after="40"/>
+        <w:jc w:val="center"/>
+      </w:pPr>
+      <w:r>
+        <w:drawing>
+          <wp:inline xmlns:a="http://schemas.openxmlformats.org/drawingml/2006/main" xmlns:pic="http://schemas.openxmlformats.org/drawingml/2006/picture">
+            <wp:extent cx="7641290" cy="2520000"/>
+            <wp:docPr id="4" name="Picture 4"/>
+            <wp:cNvGraphicFramePr>
+              <a:graphicFrameLocks noChangeAspect="1"/>
+            </wp:cNvGraphicFramePr>
+            <a:graphic>
+              <a:graphicData uri="http://schemas.openxmlformats.org/drawingml/2006/picture">
+                <pic:pic>
+                  <pic:nvPicPr>
+                    <pic:cNvPr id="0" name="E1-comparacao.png"/>
+                    <pic:cNvPicPr/>
+                  </pic:nvPicPr>
+                  <pic:blipFill>
+                    <a:blip r:embed="rId14"/>
+                    <a:stretch>
+                      <a:fillRect/>
+                    </a:stretch>
+                  </pic:blipFill>
+                  <pic:spPr>
+                    <a:xfrm>
+                      <a:off x="0" y="0"/>
+                      <a:ext cx="7641290" cy="2520000"/>
+                    </a:xfrm>
+                    <a:prstGeom prst="rect"/>
+                  </pic:spPr>
+                </pic:pic>
+              </a:graphicData>
+            </a:graphic>
+          </wp:inline>
+        </w:drawing>
+      </w:r>
+    </w:p>
+    <w:p>
+      <w:pPr>
+        <w:spacing w:before="0" w:after="80"/>
+      </w:pPr>
+    </w:p>
+    <w:tbl>
+      <w:tblPr>
+        <w:tblW w:type="auto" w:w="0"/>
+        <w:jc w:val="center"/>
+        <w:tblLayout w:type="fixed"/>
+        <w:tblLook w:firstColumn="1" w:firstRow="1" w:lastColumn="0" w:lastRow="0" w:noHBand="0" w:noVBand="1" w:val="04A0"/>
+        <w:tblBorders>
+          <w:top w:val="nil"/>
+          <w:left w:val="nil"/>
+          <w:bottom w:val="nil"/>
+          <w:right w:val="nil"/>
+          <w:insideH w:val="nil"/>
+          <w:insideV w:val="nil"/>
+        </w:tblBorders>
+      </w:tblPr>
+      <w:tblGrid>
+        <w:gridCol w:w="9354"/>
+        <w:gridCol w:w="5669"/>
+      </w:tblGrid>
+      <w:tr>
+        <w:tc>
+          <w:tcPr>
+            <w:tcW w:type="dxa" w:w="9354"/>
+            <w:shd w:val="clear" w:color="auto" w:fill="F2F4F7"/>
+            <w:tcMar>
+              <w:top w:w="170" w:type="dxa"/>
+              <w:left w:w="170" w:type="dxa"/>
+              <w:bottom w:w="170" w:type="dxa"/>
+              <w:right w:w="170" w:type="dxa"/>
+            </w:tcMar>
+          </w:tcPr>
+          <w:p>
+            <w:pPr>
+              <w:spacing w:before="0" w:after="60"/>
+            </w:pPr>
+            <w:r>
+              <w:rPr>
+                <w:b/>
+                <w:i w:val="0"/>
+                <w:color w:val="4A6FA5"/>
+                <w:sz w:val="21"/>
+              </w:rPr>
+              <w:t>COMO FUNCIONA</w:t>
+            </w:r>
+          </w:p>
+          <w:p>
+            <w:pPr>
+              <w:pStyle w:val="ListBullet"/>
+              <w:spacing w:after="40"/>
+            </w:pPr>
+            <w:r>
+              <w:rPr>
+                <w:b w:val="0"/>
+                <w:i w:val="0"/>
+                <w:color w:val="1F2328"/>
+                <w:sz w:val="22"/>
+              </w:rPr>
+              <w:t>Lá, a unidade é a execução inteira, e nada avança sem uma pessoa aprovar. Aqui, a unidade é a tarefa, e o avanço é decidido por código.</w:t>
+            </w:r>
+          </w:p>
+          <w:p>
+            <w:pPr>
+              <w:pStyle w:val="ListBullet"/>
+              <w:spacing w:after="40"/>
+            </w:pPr>
+            <w:r>
+              <w:rPr>
+                <w:b w:val="0"/>
+                <w:i w:val="0"/>
+                <w:color w:val="1F2328"/>
+                <w:sz w:val="22"/>
+              </w:rPr>
+              <w:t>Lá, a autoridade é imposta pela interface (a pessoa atrás do portão). Aqui, pela ferramenta: o revisor não recebe a ferramenta de escrever.</w:t>
+            </w:r>
+          </w:p>
+          <w:p>
+            <w:pPr>
+              <w:pStyle w:val="ListBullet"/>
+              <w:spacing w:after="40"/>
+            </w:pPr>
+            <w:r>
+              <w:rPr>
+                <w:b w:val="0"/>
+                <w:i w:val="0"/>
+                <w:color w:val="1F2328"/>
+                <w:sz w:val="22"/>
+              </w:rPr>
+              <w:t>ChatDev e MetaGPT guardam o estado dentro da execução — quando ela termina, não há a que voltar.</w:t>
+            </w:r>
+          </w:p>
+        </w:tc>
+        <w:tc>
+          <w:tcPr>
+            <w:tcW w:type="dxa" w:w="5669"/>
+            <w:shd w:val="clear" w:color="auto" w:fill="2A9D8F"/>
+            <w:tcMar>
+              <w:top w:w="170" w:type="dxa"/>
+              <w:left w:w="170" w:type="dxa"/>
+              <w:bottom w:w="170" w:type="dxa"/>
+              <w:right w:w="170" w:type="dxa"/>
+            </w:tcMar>
+          </w:tcPr>
+          <w:p>
+            <w:pPr>
+              <w:spacing w:before="0" w:after="80"/>
+            </w:pPr>
+            <w:r>
+              <w:rPr>
+                <w:b/>
+                <w:i w:val="0"/>
+                <w:color w:val="FFFFFF"/>
+                <w:sz w:val="21"/>
+              </w:rPr>
+              <w:t>POR QUE É RELEVANTE</w:t>
+            </w:r>
+          </w:p>
+          <w:p>
+            <w:pPr>
+              <w:spacing w:before="0" w:after="0"/>
+            </w:pPr>
+            <w:r>
+              <w:rPr>
+                <w:b/>
+                <w:i w:val="0"/>
+                <w:color w:val="FFFFFF"/>
+                <w:sz w:val="24"/>
+              </w:rPr>
+              <w:t>Delimita a originalidade: a contribuição não é usar agentes, e sim tirar a pessoa do laço sem perder a separação entre construir e aprovar.</w:t>
+            </w:r>
+          </w:p>
+        </w:tc>
+      </w:tr>
+    </w:tbl>
+    <w:p>
+      <w:pPr>
+        <w:pageBreakBefore/>
+        <w:spacing w:before="0" w:after="40"/>
+      </w:pPr>
+      <w:r>
+        <w:rPr>
+          <w:rFonts w:ascii="Cambria" w:hAnsi="Cambria"/>
+          <w:b/>
+          <w:i w:val="0"/>
+          <w:color w:val="1B2A41"/>
+          <w:sz w:val="48"/>
+        </w:rPr>
+        <w:t>Peça 3 · Arquitetura: as regras na estrutura</w:t>
+      </w:r>
+    </w:p>
+    <w:p>
+      <w:pPr>
+        <w:spacing w:before="0" w:after="200"/>
       </w:pPr>
       <w:r>
         <w:rPr>
           <w:b w:val="0"/>
           <w:i w:val="0"/>
-          <w:color w:val="1F2328"/>
-          <w:sz w:val="24"/>
+          <w:color w:val="6B7480"/>
+          <w:sz w:val="25"/>
         </w:rPr>
-        <w:t>Ciclo de vida da tarefa com 6 estados e 2 portões independentes; escada de 4 degraus para falhas.</w:t>
+        <w:t>A ideia central do trabalho: cada regra de governança sai do texto do pedido e ganha um lugar no programa onde é imposta.</w:t>
       </w:r>
     </w:p>
     <w:p>
       <w:pPr>
-        <w:pStyle w:val="ListBullet"/>
-        <w:spacing w:after="40"/>
+        <w:jc w:val="center"/>
+      </w:pPr>
+      <w:r>
+        <w:drawing>
+          <wp:inline xmlns:a="http://schemas.openxmlformats.org/drawingml/2006/main" xmlns:pic="http://schemas.openxmlformats.org/drawingml/2006/picture">
+            <wp:extent cx="4919078" cy="2340000"/>
+            <wp:docPr id="5" name="Picture 5"/>
+            <wp:cNvGraphicFramePr>
+              <a:graphicFrameLocks noChangeAspect="1"/>
+            </wp:cNvGraphicFramePr>
+            <a:graphic>
+              <a:graphicData uri="http://schemas.openxmlformats.org/drawingml/2006/picture">
+                <pic:pic>
+                  <pic:nvPicPr>
+                    <pic:cNvPr id="0" name="E1-regras.png"/>
+                    <pic:cNvPicPr/>
+                  </pic:nvPicPr>
+                  <pic:blipFill>
+                    <a:blip r:embed="rId15"/>
+                    <a:stretch>
+                      <a:fillRect/>
+                    </a:stretch>
+                  </pic:blipFill>
+                  <pic:spPr>
+                    <a:xfrm>
+                      <a:off x="0" y="0"/>
+                      <a:ext cx="4919078" cy="2340000"/>
+                    </a:xfrm>
+                    <a:prstGeom prst="rect"/>
+                  </pic:spPr>
+                </pic:pic>
+              </a:graphicData>
+            </a:graphic>
+          </wp:inline>
+        </w:drawing>
+      </w:r>
+    </w:p>
+    <w:p>
+      <w:pPr>
+        <w:spacing w:before="0" w:after="80"/>
+      </w:pPr>
+    </w:p>
+    <w:tbl>
+      <w:tblPr>
+        <w:tblW w:type="auto" w:w="0"/>
+        <w:jc w:val="center"/>
+        <w:tblLayout w:type="fixed"/>
+        <w:tblLook w:firstColumn="1" w:firstRow="1" w:lastColumn="0" w:lastRow="0" w:noHBand="0" w:noVBand="1" w:val="04A0"/>
+        <w:tblBorders>
+          <w:top w:val="nil"/>
+          <w:left w:val="nil"/>
+          <w:bottom w:val="nil"/>
+          <w:right w:val="nil"/>
+          <w:insideH w:val="nil"/>
+          <w:insideV w:val="nil"/>
+        </w:tblBorders>
+      </w:tblPr>
+      <w:tblGrid>
+        <w:gridCol w:w="9354"/>
+        <w:gridCol w:w="5669"/>
+      </w:tblGrid>
+      <w:tr>
+        <w:tc>
+          <w:tcPr>
+            <w:tcW w:type="dxa" w:w="9354"/>
+            <w:shd w:val="clear" w:color="auto" w:fill="F2F4F7"/>
+            <w:tcMar>
+              <w:top w:w="170" w:type="dxa"/>
+              <w:left w:w="170" w:type="dxa"/>
+              <w:bottom w:w="170" w:type="dxa"/>
+              <w:right w:w="170" w:type="dxa"/>
+            </w:tcMar>
+          </w:tcPr>
+          <w:p>
+            <w:pPr>
+              <w:spacing w:before="0" w:after="60"/>
+            </w:pPr>
+            <w:r>
+              <w:rPr>
+                <w:b/>
+                <w:i w:val="0"/>
+                <w:color w:val="4A6FA5"/>
+                <w:sz w:val="21"/>
+              </w:rPr>
+              <w:t>COMO FUNCIONA</w:t>
+            </w:r>
+          </w:p>
+          <w:p>
+            <w:pPr>
+              <w:pStyle w:val="ListBullet"/>
+              <w:spacing w:after="40"/>
+            </w:pPr>
+            <w:r>
+              <w:rPr>
+                <w:b w:val="0"/>
+                <w:i w:val="0"/>
+                <w:color w:val="1F2328"/>
+                <w:sz w:val="22"/>
+              </w:rPr>
+              <w:t>Confinamento: a própria ferramenta de escrita recusa caminhos fora da pasta do projeto (E3).</w:t>
+            </w:r>
+          </w:p>
+          <w:p>
+            <w:pPr>
+              <w:pStyle w:val="ListBullet"/>
+              <w:spacing w:after="40"/>
+            </w:pPr>
+            <w:r>
+              <w:rPr>
+                <w:b w:val="0"/>
+                <w:i w:val="0"/>
+                <w:color w:val="1F2328"/>
+                <w:sz w:val="22"/>
+              </w:rPr>
+              <w:t>Tentativas: o contador mora no banco e é escrito pelo sistema, não pelo agente (E4).</w:t>
+            </w:r>
+          </w:p>
+          <w:p>
+            <w:pPr>
+              <w:pStyle w:val="ListBullet"/>
+              <w:spacing w:after="40"/>
+            </w:pPr>
+            <w:r>
+              <w:rPr>
+                <w:b w:val="0"/>
+                <w:i w:val="0"/>
+                <w:color w:val="1F2328"/>
+                <w:sz w:val="22"/>
+              </w:rPr>
+              <w:t>Quem constrói não aprova: o revisor não tem ferramenta de escrita. Orçamento: o sistema não deixa começar o que não cabe (E4).</w:t>
+            </w:r>
+          </w:p>
+        </w:tc>
+        <w:tc>
+          <w:tcPr>
+            <w:tcW w:type="dxa" w:w="5669"/>
+            <w:shd w:val="clear" w:color="auto" w:fill="2A9D8F"/>
+            <w:tcMar>
+              <w:top w:w="170" w:type="dxa"/>
+              <w:left w:w="170" w:type="dxa"/>
+              <w:bottom w:w="170" w:type="dxa"/>
+              <w:right w:w="170" w:type="dxa"/>
+            </w:tcMar>
+          </w:tcPr>
+          <w:p>
+            <w:pPr>
+              <w:spacing w:before="0" w:after="80"/>
+            </w:pPr>
+            <w:r>
+              <w:rPr>
+                <w:b/>
+                <w:i w:val="0"/>
+                <w:color w:val="FFFFFF"/>
+                <w:sz w:val="21"/>
+              </w:rPr>
+              <w:t>POR QUE É RELEVANTE</w:t>
+            </w:r>
+          </w:p>
+          <w:p>
+            <w:pPr>
+              <w:spacing w:before="0" w:after="0"/>
+            </w:pPr>
+            <w:r>
+              <w:rPr>
+                <w:b/>
+                <w:i w:val="0"/>
+                <w:color w:val="FFFFFF"/>
+                <w:sz w:val="24"/>
+              </w:rPr>
+              <w:t>Instrução pode ser ignorada; ferramenta que não existe, não. É essa mudança que o resto do trabalho constrói e prova, etapa por etapa.</w:t>
+            </w:r>
+          </w:p>
+        </w:tc>
+      </w:tr>
+    </w:tbl>
+    <w:p>
+      <w:pPr>
+        <w:pageBreakBefore/>
+        <w:spacing w:before="0" w:after="40"/>
+      </w:pPr>
+      <w:r>
+        <w:rPr>
+          <w:rFonts w:ascii="Cambria" w:hAnsi="Cambria"/>
+          <w:b/>
+          <w:i w:val="0"/>
+          <w:color w:val="1B2A41"/>
+          <w:sz w:val="48"/>
+        </w:rPr>
+        <w:t>A arquitetura: quatro camadas</w:t>
+      </w:r>
+    </w:p>
+    <w:p>
+      <w:pPr>
+        <w:spacing w:before="0" w:after="200"/>
       </w:pPr>
       <w:r>
         <w:rPr>
           <w:b w:val="0"/>
           <w:i w:val="0"/>
-          <w:color w:val="1F2328"/>
-          <w:sz w:val="24"/>
+          <w:color w:val="6B7480"/>
+          <w:sz w:val="25"/>
         </w:rPr>
-        <w:t>Pilha Elixir/OTP escolhida pela supervisão de processos: cada agente é um processo isolado.</w:t>
+        <w:t>Cada camada só conhece a de baixo. As fronteiras permitem trocar o fornecedor do modelo e a busca sem mexer no motor.</w:t>
       </w:r>
     </w:p>
     <w:p>
       <w:pPr>
-        <w:pStyle w:val="ListBullet"/>
-        <w:spacing w:after="40"/>
+        <w:jc w:val="center"/>
+      </w:pPr>
+      <w:r>
+        <w:drawing>
+          <wp:inline xmlns:a="http://schemas.openxmlformats.org/drawingml/2006/main" xmlns:pic="http://schemas.openxmlformats.org/drawingml/2006/picture">
+            <wp:extent cx="2462332" cy="3060000"/>
+            <wp:docPr id="6" name="Picture 6"/>
+            <wp:cNvGraphicFramePr>
+              <a:graphicFrameLocks noChangeAspect="1"/>
+            </wp:cNvGraphicFramePr>
+            <a:graphic>
+              <a:graphicData uri="http://schemas.openxmlformats.org/drawingml/2006/picture">
+                <pic:pic>
+                  <pic:nvPicPr>
+                    <pic:cNvPr id="0" name="E1-camadas.png"/>
+                    <pic:cNvPicPr/>
+                  </pic:nvPicPr>
+                  <pic:blipFill>
+                    <a:blip r:embed="rId16"/>
+                    <a:stretch>
+                      <a:fillRect/>
+                    </a:stretch>
+                  </pic:blipFill>
+                  <pic:spPr>
+                    <a:xfrm>
+                      <a:off x="0" y="0"/>
+                      <a:ext cx="2462332" cy="3060000"/>
+                    </a:xfrm>
+                    <a:prstGeom prst="rect"/>
+                  </pic:spPr>
+                </pic:pic>
+              </a:graphicData>
+            </a:graphic>
+          </wp:inline>
+        </w:drawing>
+      </w:r>
+    </w:p>
+    <w:p>
+      <w:pPr>
+        <w:spacing w:before="0" w:after="80"/>
+      </w:pPr>
+    </w:p>
+    <w:tbl>
+      <w:tblPr>
+        <w:tblW w:type="auto" w:w="0"/>
+        <w:jc w:val="center"/>
+        <w:tblLayout w:type="fixed"/>
+        <w:tblLook w:firstColumn="1" w:firstRow="1" w:lastColumn="0" w:lastRow="0" w:noHBand="0" w:noVBand="1" w:val="04A0"/>
+        <w:tblBorders>
+          <w:top w:val="nil"/>
+          <w:left w:val="nil"/>
+          <w:bottom w:val="nil"/>
+          <w:right w:val="nil"/>
+          <w:insideH w:val="nil"/>
+          <w:insideV w:val="nil"/>
+        </w:tblBorders>
+      </w:tblPr>
+      <w:tblGrid>
+        <w:gridCol w:w="9354"/>
+        <w:gridCol w:w="5669"/>
+      </w:tblGrid>
+      <w:tr>
+        <w:tc>
+          <w:tcPr>
+            <w:tcW w:type="dxa" w:w="9354"/>
+            <w:shd w:val="clear" w:color="auto" w:fill="F2F4F7"/>
+            <w:tcMar>
+              <w:top w:w="170" w:type="dxa"/>
+              <w:left w:w="170" w:type="dxa"/>
+              <w:bottom w:w="170" w:type="dxa"/>
+              <w:right w:w="170" w:type="dxa"/>
+            </w:tcMar>
+          </w:tcPr>
+          <w:p>
+            <w:pPr>
+              <w:spacing w:before="0" w:after="60"/>
+            </w:pPr>
+            <w:r>
+              <w:rPr>
+                <w:b/>
+                <w:i w:val="0"/>
+                <w:color w:val="4A6FA5"/>
+                <w:sz w:val="21"/>
+              </w:rPr>
+              <w:t>COMO FUNCIONA</w:t>
+            </w:r>
+          </w:p>
+          <w:p>
+            <w:pPr>
+              <w:pStyle w:val="ListBullet"/>
+              <w:spacing w:after="40"/>
+            </w:pPr>
+            <w:r>
+              <w:rPr>
+                <w:b w:val="0"/>
+                <w:i w:val="0"/>
+                <w:color w:val="1F2328"/>
+                <w:sz w:val="22"/>
+              </w:rPr>
+              <w:t>Tela: o que a pessoa vê, ao vivo. Motor: estados, fila, portões, escada de falha e orçamento.</w:t>
+            </w:r>
+          </w:p>
+          <w:p>
+            <w:pPr>
+              <w:pStyle w:val="ListBullet"/>
+              <w:spacing w:after="40"/>
+            </w:pPr>
+            <w:r>
+              <w:rPr>
+                <w:b w:val="0"/>
+                <w:i w:val="0"/>
+                <w:color w:val="1F2328"/>
+                <w:sz w:val="22"/>
+              </w:rPr>
+              <w:t>Agentes: o laço de ferramentas, confinado ao projeto. Fronteiras: Provider (fala com o modelo) e Embedder (texto vira vetor), com substitutos falsos para teste.</w:t>
+            </w:r>
+          </w:p>
+          <w:p>
+            <w:pPr>
+              <w:pStyle w:val="ListBullet"/>
+              <w:spacing w:after="40"/>
+            </w:pPr>
+            <w:r>
+              <w:rPr>
+                <w:b w:val="0"/>
+                <w:i w:val="0"/>
+                <w:color w:val="1F2328"/>
+                <w:sz w:val="22"/>
+              </w:rPr>
+              <w:t>Um único banco PostgreSQL guarda estado, fila, custo e memória — numa transação, e ocupando pouca memória (R9).</w:t>
+            </w:r>
+          </w:p>
+        </w:tc>
+        <w:tc>
+          <w:tcPr>
+            <w:tcW w:type="dxa" w:w="5669"/>
+            <w:shd w:val="clear" w:color="auto" w:fill="2A9D8F"/>
+            <w:tcMar>
+              <w:top w:w="170" w:type="dxa"/>
+              <w:left w:w="170" w:type="dxa"/>
+              <w:bottom w:w="170" w:type="dxa"/>
+              <w:right w:w="170" w:type="dxa"/>
+            </w:tcMar>
+          </w:tcPr>
+          <w:p>
+            <w:pPr>
+              <w:spacing w:before="0" w:after="80"/>
+            </w:pPr>
+            <w:r>
+              <w:rPr>
+                <w:b/>
+                <w:i w:val="0"/>
+                <w:color w:val="FFFFFF"/>
+                <w:sz w:val="21"/>
+              </w:rPr>
+              <w:t>POR QUE É RELEVANTE</w:t>
+            </w:r>
+          </w:p>
+          <w:p>
+            <w:pPr>
+              <w:spacing w:before="0" w:after="0"/>
+            </w:pPr>
+            <w:r>
+              <w:rPr>
+                <w:b/>
+                <w:i w:val="0"/>
+                <w:color w:val="FFFFFF"/>
+                <w:sz w:val="24"/>
+              </w:rPr>
+              <w:t>O desenho em camadas é o que permite construir uma parte por etapa (E2 → E7), cada uma testável sobre a anterior.</w:t>
+            </w:r>
+          </w:p>
+        </w:tc>
+      </w:tr>
+    </w:tbl>
+    <w:p>
+      <w:pPr>
+        <w:pageBreakBefore/>
+        <w:spacing w:before="0" w:after="40"/>
+      </w:pPr>
+      <w:r>
+        <w:rPr>
+          <w:rFonts w:ascii="Cambria" w:hAnsi="Cambria"/>
+          <w:b/>
+          <w:i w:val="0"/>
+          <w:color w:val="1B2A41"/>
+          <w:sz w:val="48"/>
+        </w:rPr>
+        <w:t>A arquitetura: o caminho de uma tarefa</w:t>
+      </w:r>
+    </w:p>
+    <w:p>
+      <w:pPr>
+        <w:spacing w:before="0" w:after="200"/>
       </w:pPr>
       <w:r>
         <w:rPr>
           <w:b w:val="0"/>
           <w:i w:val="0"/>
-          <w:color w:val="1F2328"/>
-          <w:sz w:val="24"/>
+          <w:color w:val="6B7480"/>
+          <w:sz w:val="25"/>
         </w:rPr>
-        <w:t>Trabalho de E2–E7 decomposto em 39 tarefas, uma por pacote do plano, com critérios executáveis.</w:t>
+        <w:t>A tarefa é a unidade de trabalho: passa por seis estados e dois portões, e cada passagem é feita por um agente diferente de quem construiu.</w:t>
       </w:r>
     </w:p>
+    <w:p>
+      <w:pPr>
+        <w:jc w:val="center"/>
+      </w:pPr>
+      <w:r>
+        <w:drawing>
+          <wp:inline xmlns:a="http://schemas.openxmlformats.org/drawingml/2006/main" xmlns:pic="http://schemas.openxmlformats.org/drawingml/2006/picture">
+            <wp:extent cx="8639997" cy="1488727"/>
+            <wp:docPr id="7" name="Picture 7"/>
+            <wp:cNvGraphicFramePr>
+              <a:graphicFrameLocks noChangeAspect="1"/>
+            </wp:cNvGraphicFramePr>
+            <a:graphic>
+              <a:graphicData uri="http://schemas.openxmlformats.org/drawingml/2006/picture">
+                <pic:pic>
+                  <pic:nvPicPr>
+                    <pic:cNvPr id="0" name="E1-estados.png"/>
+                    <pic:cNvPicPr/>
+                  </pic:nvPicPr>
+                  <pic:blipFill>
+                    <a:blip r:embed="rId17"/>
+                    <a:stretch>
+                      <a:fillRect/>
+                    </a:stretch>
+                  </pic:blipFill>
+                  <pic:spPr>
+                    <a:xfrm>
+                      <a:off x="0" y="0"/>
+                      <a:ext cx="8639997" cy="1488727"/>
+                    </a:xfrm>
+                    <a:prstGeom prst="rect"/>
+                  </pic:spPr>
+                </pic:pic>
+              </a:graphicData>
+            </a:graphic>
+          </wp:inline>
+        </w:drawing>
+      </w:r>
+    </w:p>
+    <w:p>
+      <w:pPr>
+        <w:spacing w:before="0" w:after="80"/>
+      </w:pPr>
+    </w:p>
+    <w:tbl>
+      <w:tblPr>
+        <w:tblW w:type="auto" w:w="0"/>
+        <w:jc w:val="center"/>
+        <w:tblLayout w:type="fixed"/>
+        <w:tblLook w:firstColumn="1" w:firstRow="1" w:lastColumn="0" w:lastRow="0" w:noHBand="0" w:noVBand="1" w:val="04A0"/>
+        <w:tblBorders>
+          <w:top w:val="nil"/>
+          <w:left w:val="nil"/>
+          <w:bottom w:val="nil"/>
+          <w:right w:val="nil"/>
+          <w:insideH w:val="nil"/>
+          <w:insideV w:val="nil"/>
+        </w:tblBorders>
+      </w:tblPr>
+      <w:tblGrid>
+        <w:gridCol w:w="9354"/>
+        <w:gridCol w:w="5669"/>
+      </w:tblGrid>
+      <w:tr>
+        <w:tc>
+          <w:tcPr>
+            <w:tcW w:type="dxa" w:w="9354"/>
+            <w:shd w:val="clear" w:color="auto" w:fill="F2F4F7"/>
+            <w:tcMar>
+              <w:top w:w="170" w:type="dxa"/>
+              <w:left w:w="170" w:type="dxa"/>
+              <w:bottom w:w="170" w:type="dxa"/>
+              <w:right w:w="170" w:type="dxa"/>
+            </w:tcMar>
+          </w:tcPr>
+          <w:p>
+            <w:pPr>
+              <w:spacing w:before="0" w:after="60"/>
+            </w:pPr>
+            <w:r>
+              <w:rPr>
+                <w:b/>
+                <w:i w:val="0"/>
+                <w:color w:val="4A6FA5"/>
+                <w:sz w:val="21"/>
+              </w:rPr>
+              <w:t>COMO FUNCIONA</w:t>
+            </w:r>
+          </w:p>
+          <w:p>
+            <w:pPr>
+              <w:pStyle w:val="ListBullet"/>
+              <w:spacing w:after="40"/>
+            </w:pPr>
+            <w:r>
+              <w:rPr>
+                <w:b w:val="0"/>
+                <w:i w:val="0"/>
+                <w:color w:val="1F2328"/>
+                <w:sz w:val="22"/>
+              </w:rPr>
+              <w:t>backlog → ready quando as dependências terminam; ready → in_progress quando o construtor pega a tarefa.</w:t>
+            </w:r>
+          </w:p>
+          <w:p>
+            <w:pPr>
+              <w:pStyle w:val="ListBullet"/>
+              <w:spacing w:after="40"/>
+            </w:pPr>
+            <w:r>
+              <w:rPr>
+                <w:b w:val="0"/>
+                <w:i w:val="0"/>
+                <w:color w:val="1F2328"/>
+                <w:sz w:val="22"/>
+              </w:rPr>
+              <w:t>Dois portões em série: o verificador pergunta "funciona?"; o revisor, "é o que foi pedido?". Qualquer reprovação volta ao construtor.</w:t>
+            </w:r>
+          </w:p>
+          <w:p>
+            <w:pPr>
+              <w:pStyle w:val="ListBullet"/>
+              <w:spacing w:after="40"/>
+            </w:pPr>
+            <w:r>
+              <w:rPr>
+                <w:b w:val="0"/>
+                <w:i w:val="0"/>
+                <w:color w:val="1F2328"/>
+                <w:sz w:val="22"/>
+              </w:rPr>
+              <w:t>Quem conta os ciclos é o sistema. No 4º ciclo a tarefa vai para blocked e passa ao humano.</w:t>
+            </w:r>
+          </w:p>
+        </w:tc>
+        <w:tc>
+          <w:tcPr>
+            <w:tcW w:type="dxa" w:w="5669"/>
+            <w:shd w:val="clear" w:color="auto" w:fill="2A9D8F"/>
+            <w:tcMar>
+              <w:top w:w="170" w:type="dxa"/>
+              <w:left w:w="170" w:type="dxa"/>
+              <w:bottom w:w="170" w:type="dxa"/>
+              <w:right w:w="170" w:type="dxa"/>
+            </w:tcMar>
+          </w:tcPr>
+          <w:p>
+            <w:pPr>
+              <w:spacing w:before="0" w:after="80"/>
+            </w:pPr>
+            <w:r>
+              <w:rPr>
+                <w:b/>
+                <w:i w:val="0"/>
+                <w:color w:val="FFFFFF"/>
+                <w:sz w:val="21"/>
+              </w:rPr>
+              <w:t>POR QUE É RELEVANTE</w:t>
+            </w:r>
+          </w:p>
+          <w:p>
+            <w:pPr>
+              <w:spacing w:before="0" w:after="0"/>
+            </w:pPr>
+            <w:r>
+              <w:rPr>
+                <w:b/>
+                <w:i w:val="0"/>
+                <w:color w:val="FFFFFF"/>
+                <w:sz w:val="24"/>
+              </w:rPr>
+              <w:t>Uma entrega pode passar em todos os testes e não ser a tarefa. Dois portões com perguntas diferentes pegam os dois tipos de erro.</w:t>
+            </w:r>
+          </w:p>
+        </w:tc>
+      </w:tr>
+    </w:tbl>
+    <w:p>
+      <w:pPr>
+        <w:pageBreakBefore/>
+        <w:spacing w:before="0" w:after="40"/>
+      </w:pPr>
+      <w:r>
+        <w:rPr>
+          <w:rFonts w:ascii="Cambria" w:hAnsi="Cambria"/>
+          <w:b/>
+          <w:i w:val="0"/>
+          <w:color w:val="1B2A41"/>
+          <w:sz w:val="48"/>
+        </w:rPr>
+        <w:t>A arquitetura: a escada de falha</w:t>
+      </w:r>
+    </w:p>
+    <w:p>
+      <w:pPr>
+        <w:spacing w:before="0" w:after="200"/>
+      </w:pPr>
+      <w:r>
+        <w:rPr>
+          <w:b w:val="0"/>
+          <w:i w:val="0"/>
+          <w:color w:val="6B7480"/>
+          <w:sz w:val="25"/>
+        </w:rPr>
+        <w:t>Repetir a mesma tentativa raramente resolve. Cada reprovação muda uma variável da estratégia.</w:t>
+      </w:r>
+    </w:p>
+    <w:p>
+      <w:pPr>
+        <w:jc w:val="center"/>
+      </w:pPr>
+      <w:r>
+        <w:drawing>
+          <wp:inline xmlns:a="http://schemas.openxmlformats.org/drawingml/2006/main" xmlns:pic="http://schemas.openxmlformats.org/drawingml/2006/picture">
+            <wp:extent cx="8639998" cy="814897"/>
+            <wp:docPr id="8" name="Picture 8"/>
+            <wp:cNvGraphicFramePr>
+              <a:graphicFrameLocks noChangeAspect="1"/>
+            </wp:cNvGraphicFramePr>
+            <a:graphic>
+              <a:graphicData uri="http://schemas.openxmlformats.org/drawingml/2006/picture">
+                <pic:pic>
+                  <pic:nvPicPr>
+                    <pic:cNvPr id="0" name="E1-escada-falha.png"/>
+                    <pic:cNvPicPr/>
+                  </pic:nvPicPr>
+                  <pic:blipFill>
+                    <a:blip r:embed="rId18"/>
+                    <a:stretch>
+                      <a:fillRect/>
+                    </a:stretch>
+                  </pic:blipFill>
+                  <pic:spPr>
+                    <a:xfrm>
+                      <a:off x="0" y="0"/>
+                      <a:ext cx="8639998" cy="814897"/>
+                    </a:xfrm>
+                    <a:prstGeom prst="rect"/>
+                  </pic:spPr>
+                </pic:pic>
+              </a:graphicData>
+            </a:graphic>
+          </wp:inline>
+        </w:drawing>
+      </w:r>
+    </w:p>
+    <w:p>
+      <w:pPr>
+        <w:spacing w:before="0" w:after="80"/>
+      </w:pPr>
+    </w:p>
+    <w:tbl>
+      <w:tblPr>
+        <w:tblW w:type="auto" w:w="0"/>
+        <w:jc w:val="center"/>
+        <w:tblLayout w:type="fixed"/>
+        <w:tblLook w:firstColumn="1" w:firstRow="1" w:lastColumn="0" w:lastRow="0" w:noHBand="0" w:noVBand="1" w:val="04A0"/>
+        <w:tblBorders>
+          <w:top w:val="nil"/>
+          <w:left w:val="nil"/>
+          <w:bottom w:val="nil"/>
+          <w:right w:val="nil"/>
+          <w:insideH w:val="nil"/>
+          <w:insideV w:val="nil"/>
+        </w:tblBorders>
+      </w:tblPr>
+      <w:tblGrid>
+        <w:gridCol w:w="9354"/>
+        <w:gridCol w:w="5669"/>
+      </w:tblGrid>
+      <w:tr>
+        <w:tc>
+          <w:tcPr>
+            <w:tcW w:type="dxa" w:w="9354"/>
+            <w:shd w:val="clear" w:color="auto" w:fill="F2F4F7"/>
+            <w:tcMar>
+              <w:top w:w="170" w:type="dxa"/>
+              <w:left w:w="170" w:type="dxa"/>
+              <w:bottom w:w="170" w:type="dxa"/>
+              <w:right w:w="170" w:type="dxa"/>
+            </w:tcMar>
+          </w:tcPr>
+          <w:p>
+            <w:pPr>
+              <w:spacing w:before="0" w:after="60"/>
+            </w:pPr>
+            <w:r>
+              <w:rPr>
+                <w:b/>
+                <w:i w:val="0"/>
+                <w:color w:val="4A6FA5"/>
+                <w:sz w:val="21"/>
+              </w:rPr>
+              <w:t>COMO FUNCIONA</w:t>
+            </w:r>
+          </w:p>
+          <w:p>
+            <w:pPr>
+              <w:pStyle w:val="ListBullet"/>
+              <w:spacing w:after="40"/>
+            </w:pPr>
+            <w:r>
+              <w:rPr>
+                <w:b w:val="0"/>
+                <w:i w:val="0"/>
+                <w:color w:val="1F2328"/>
+                <w:sz w:val="22"/>
+              </w:rPr>
+              <w:t>1ª reprovação: refaz com um modelo mais forte — o gatilho é a reprovação, não um palpite.</w:t>
+            </w:r>
+          </w:p>
+          <w:p>
+            <w:pPr>
+              <w:pStyle w:val="ListBullet"/>
+              <w:spacing w:after="40"/>
+            </w:pPr>
+            <w:r>
+              <w:rPr>
+                <w:b w:val="0"/>
+                <w:i w:val="0"/>
+                <w:color w:val="1F2328"/>
+                <w:sz w:val="22"/>
+              </w:rPr>
+              <w:t>2ª: troca o agente especializado — duas reprovações seguidas indicam viés da abordagem.</w:t>
+            </w:r>
+          </w:p>
+          <w:p>
+            <w:pPr>
+              <w:pStyle w:val="ListBullet"/>
+              <w:spacing w:after="40"/>
+            </w:pPr>
+            <w:r>
+              <w:rPr>
+                <w:b w:val="0"/>
+                <w:i w:val="0"/>
+                <w:color w:val="1F2328"/>
+                <w:sz w:val="22"/>
+              </w:rPr>
+              <w:t>3ª: quebra ou reescreve a tarefa. 4ª: bloqueia e passa ao humano — insistir custaria sem aumentar a chance de acerto.</w:t>
+            </w:r>
+          </w:p>
+        </w:tc>
+        <w:tc>
+          <w:tcPr>
+            <w:tcW w:type="dxa" w:w="5669"/>
+            <w:shd w:val="clear" w:color="auto" w:fill="2A9D8F"/>
+            <w:tcMar>
+              <w:top w:w="170" w:type="dxa"/>
+              <w:left w:w="170" w:type="dxa"/>
+              <w:bottom w:w="170" w:type="dxa"/>
+              <w:right w:w="170" w:type="dxa"/>
+            </w:tcMar>
+          </w:tcPr>
+          <w:p>
+            <w:pPr>
+              <w:spacing w:before="0" w:after="80"/>
+            </w:pPr>
+            <w:r>
+              <w:rPr>
+                <w:b/>
+                <w:i w:val="0"/>
+                <w:color w:val="FFFFFF"/>
+                <w:sz w:val="21"/>
+              </w:rPr>
+              <w:t>POR QUE É RELEVANTE</w:t>
+            </w:r>
+          </w:p>
+          <w:p>
+            <w:pPr>
+              <w:spacing w:before="0" w:after="0"/>
+            </w:pPr>
+            <w:r>
+              <w:rPr>
+                <w:b/>
+                <w:i w:val="0"/>
+                <w:color w:val="FFFFFF"/>
+                <w:sz w:val="24"/>
+              </w:rPr>
+              <w:t>Sem uma pessoa aprovando cada passo, o sistema precisa reagir sozinho ao próprio fracasso — e saber a hora de parar.</w:t>
+            </w:r>
+          </w:p>
+        </w:tc>
+      </w:tr>
+    </w:tbl>
+    <w:p>
+      <w:pPr>
+        <w:pageBreakBefore/>
+        <w:spacing w:before="0" w:after="40"/>
+      </w:pPr>
+      <w:r>
+        <w:rPr>
+          <w:rFonts w:ascii="Cambria" w:hAnsi="Cambria"/>
+          <w:b/>
+          <w:i w:val="0"/>
+          <w:color w:val="1B2A41"/>
+          <w:sz w:val="48"/>
+        </w:rPr>
+        <w:t>Peça 4 · Plano, tarefas e critérios</w:t>
+      </w:r>
+    </w:p>
+    <w:p>
+      <w:pPr>
+        <w:spacing w:before="0" w:after="200"/>
+      </w:pPr>
+      <w:r>
+        <w:rPr>
+          <w:b w:val="0"/>
+          <w:i w:val="0"/>
+          <w:color w:val="6B7480"/>
+          <w:sz w:val="25"/>
+        </w:rPr>
+        <w:t>145 dias em 10 etapas e três fases. A construção é dividida em 39 tarefas; a validação só para quando 8 critérios numéricos forem atingidos.</w:t>
+      </w:r>
+    </w:p>
+    <w:p>
+      <w:pPr>
+        <w:jc w:val="center"/>
+      </w:pPr>
+      <w:r>
+        <w:drawing>
+          <wp:inline xmlns:a="http://schemas.openxmlformats.org/drawingml/2006/main" xmlns:pic="http://schemas.openxmlformats.org/drawingml/2006/picture">
+            <wp:extent cx="8639996" cy="1283969"/>
+            <wp:docPr id="9" name="Picture 9"/>
+            <wp:cNvGraphicFramePr>
+              <a:graphicFrameLocks noChangeAspect="1"/>
+            </wp:cNvGraphicFramePr>
+            <a:graphic>
+              <a:graphicData uri="http://schemas.openxmlformats.org/drawingml/2006/picture">
+                <pic:pic>
+                  <pic:nvPicPr>
+                    <pic:cNvPr id="0" name="E1-cascata.png"/>
+                    <pic:cNvPicPr/>
+                  </pic:nvPicPr>
+                  <pic:blipFill>
+                    <a:blip r:embed="rId19"/>
+                    <a:stretch>
+                      <a:fillRect/>
+                    </a:stretch>
+                  </pic:blipFill>
+                  <pic:spPr>
+                    <a:xfrm>
+                      <a:off x="0" y="0"/>
+                      <a:ext cx="8639996" cy="1283969"/>
+                    </a:xfrm>
+                    <a:prstGeom prst="rect"/>
+                  </pic:spPr>
+                </pic:pic>
+              </a:graphicData>
+            </a:graphic>
+          </wp:inline>
+        </w:drawing>
+      </w:r>
+    </w:p>
+    <w:p>
+      <w:pPr>
+        <w:spacing w:before="0" w:after="80"/>
+      </w:pPr>
+    </w:p>
+    <w:tbl>
+      <w:tblPr>
+        <w:tblW w:type="auto" w:w="0"/>
+        <w:jc w:val="center"/>
+        <w:tblLayout w:type="fixed"/>
+        <w:tblLook w:firstColumn="1" w:firstRow="1" w:lastColumn="0" w:lastRow="0" w:noHBand="0" w:noVBand="1" w:val="04A0"/>
+        <w:tblBorders>
+          <w:top w:val="nil"/>
+          <w:left w:val="nil"/>
+          <w:bottom w:val="nil"/>
+          <w:right w:val="nil"/>
+          <w:insideH w:val="nil"/>
+          <w:insideV w:val="nil"/>
+        </w:tblBorders>
+      </w:tblPr>
+      <w:tblGrid>
+        <w:gridCol w:w="9354"/>
+        <w:gridCol w:w="5669"/>
+      </w:tblGrid>
+      <w:tr>
+        <w:tc>
+          <w:tcPr>
+            <w:tcW w:type="dxa" w:w="9354"/>
+            <w:shd w:val="clear" w:color="auto" w:fill="F2F4F7"/>
+            <w:tcMar>
+              <w:top w:w="170" w:type="dxa"/>
+              <w:left w:w="170" w:type="dxa"/>
+              <w:bottom w:w="170" w:type="dxa"/>
+              <w:right w:w="170" w:type="dxa"/>
+            </w:tcMar>
+          </w:tcPr>
+          <w:p>
+            <w:pPr>
+              <w:spacing w:before="0" w:after="60"/>
+            </w:pPr>
+            <w:r>
+              <w:rPr>
+                <w:b/>
+                <w:i w:val="0"/>
+                <w:color w:val="4A6FA5"/>
+                <w:sz w:val="21"/>
+              </w:rPr>
+              <w:t>COMO FUNCIONA</w:t>
+            </w:r>
+          </w:p>
+          <w:p>
+            <w:pPr>
+              <w:pStyle w:val="ListBullet"/>
+              <w:spacing w:after="40"/>
+            </w:pPr>
+            <w:r>
+              <w:rPr>
+                <w:b w:val="0"/>
+                <w:i w:val="0"/>
+                <w:color w:val="1F2328"/>
+                <w:sz w:val="22"/>
+              </w:rPr>
+              <w:t>Cascata: requisitos e arquitetura fecham na E1; a construção vai da E2 à E7, uma parte do sistema por etapa; a validação começa com o sistema completo.</w:t>
+            </w:r>
+          </w:p>
+          <w:p>
+            <w:pPr>
+              <w:pStyle w:val="ListBullet"/>
+              <w:spacing w:after="40"/>
+            </w:pPr>
+            <w:r>
+              <w:rPr>
+                <w:b w:val="0"/>
+                <w:i w:val="0"/>
+                <w:color w:val="1F2328"/>
+                <w:sz w:val="22"/>
+              </w:rPr>
+              <w:t>Cada etapa da construção vira tarefas pequenas, uma por pacote do plano, com critérios de aceite que são comandos.</w:t>
+            </w:r>
+          </w:p>
+          <w:p>
+            <w:pPr>
+              <w:pStyle w:val="ListBullet"/>
+              <w:spacing w:after="40"/>
+            </w:pPr>
+            <w:r>
+              <w:rPr>
+                <w:b w:val="0"/>
+                <w:i w:val="0"/>
+                <w:color w:val="1F2328"/>
+                <w:sz w:val="22"/>
+              </w:rPr>
+              <w:t>8 critérios: constrói sozinho, conclui as tarefas, pouco retrabalho, não aprova errado, governa de verdade, aguenta falha, custo sob controle, cabe na máquina.</w:t>
+            </w:r>
+          </w:p>
+        </w:tc>
+        <w:tc>
+          <w:tcPr>
+            <w:tcW w:type="dxa" w:w="5669"/>
+            <w:shd w:val="clear" w:color="auto" w:fill="2A9D8F"/>
+            <w:tcMar>
+              <w:top w:w="170" w:type="dxa"/>
+              <w:left w:w="170" w:type="dxa"/>
+              <w:bottom w:w="170" w:type="dxa"/>
+              <w:right w:w="170" w:type="dxa"/>
+            </w:tcMar>
+          </w:tcPr>
+          <w:p>
+            <w:pPr>
+              <w:spacing w:before="0" w:after="80"/>
+            </w:pPr>
+            <w:r>
+              <w:rPr>
+                <w:b/>
+                <w:i w:val="0"/>
+                <w:color w:val="FFFFFF"/>
+                <w:sz w:val="21"/>
+              </w:rPr>
+              <w:t>POR QUE É RELEVANTE</w:t>
+            </w:r>
+          </w:p>
+          <w:p>
+            <w:pPr>
+              <w:spacing w:before="0" w:after="0"/>
+            </w:pPr>
+            <w:r>
+              <w:rPr>
+                <w:b/>
+                <w:i w:val="0"/>
+                <w:color w:val="FFFFFF"/>
+                <w:sz w:val="24"/>
+              </w:rPr>
+              <w:t>Os critérios são a condição de parada da validação e não mudam. O quadro de tarefas transforma cada etapa em entregas verificáveis.</w:t>
+            </w:r>
+          </w:p>
+        </w:tc>
+      </w:tr>
+    </w:tbl>
+    <w:p>
+      <w:pPr>
+        <w:pageBreakBefore/>
+        <w:spacing w:before="0" w:after="40"/>
+      </w:pPr>
+      <w:r>
+        <w:rPr>
+          <w:rFonts w:ascii="Cambria" w:hAnsi="Cambria"/>
+          <w:b/>
+          <w:i w:val="0"/>
+          <w:color w:val="1B2A41"/>
+          <w:sz w:val="48"/>
+        </w:rPr>
+        <w:t>Peça 5 · Os cinco projetos de teste</w:t>
+      </w:r>
+    </w:p>
+    <w:p>
+      <w:pPr>
+        <w:spacing w:before="0" w:after="200"/>
+      </w:pPr>
+      <w:r>
+        <w:rPr>
+          <w:b w:val="0"/>
+          <w:i w:val="0"/>
+          <w:color w:val="6B7480"/>
+          <w:sz w:val="25"/>
+        </w:rPr>
+        <w:t>Cinco pedidos reais, de tamanhos e tipos diferentes, que a validação vai executar do pedido à entrega sem intervenção.</w:t>
+      </w:r>
+    </w:p>
+    <w:p>
+      <w:pPr>
+        <w:jc w:val="center"/>
+      </w:pPr>
+      <w:r>
+        <w:drawing>
+          <wp:inline xmlns:a="http://schemas.openxmlformats.org/drawingml/2006/main" xmlns:pic="http://schemas.openxmlformats.org/drawingml/2006/picture">
+            <wp:extent cx="6908466" cy="2160000"/>
+            <wp:docPr id="10" name="Picture 10"/>
+            <wp:cNvGraphicFramePr>
+              <a:graphicFrameLocks noChangeAspect="1"/>
+            </wp:cNvGraphicFramePr>
+            <a:graphic>
+              <a:graphicData uri="http://schemas.openxmlformats.org/drawingml/2006/picture">
+                <pic:pic>
+                  <pic:nvPicPr>
+                    <pic:cNvPr id="0" name="E1-projetos.png"/>
+                    <pic:cNvPicPr/>
+                  </pic:nvPicPr>
+                  <pic:blipFill>
+                    <a:blip r:embed="rId20"/>
+                    <a:stretch>
+                      <a:fillRect/>
+                    </a:stretch>
+                  </pic:blipFill>
+                  <pic:spPr>
+                    <a:xfrm>
+                      <a:off x="0" y="0"/>
+                      <a:ext cx="6908466" cy="2160000"/>
+                    </a:xfrm>
+                    <a:prstGeom prst="rect"/>
+                  </pic:spPr>
+                </pic:pic>
+              </a:graphicData>
+            </a:graphic>
+          </wp:inline>
+        </w:drawing>
+      </w:r>
+    </w:p>
+    <w:p>
+      <w:pPr>
+        <w:spacing w:before="0" w:after="80"/>
+      </w:pPr>
+    </w:p>
+    <w:tbl>
+      <w:tblPr>
+        <w:tblW w:type="auto" w:w="0"/>
+        <w:jc w:val="center"/>
+        <w:tblLayout w:type="fixed"/>
+        <w:tblLook w:firstColumn="1" w:firstRow="1" w:lastColumn="0" w:lastRow="0" w:noHBand="0" w:noVBand="1" w:val="04A0"/>
+        <w:tblBorders>
+          <w:top w:val="nil"/>
+          <w:left w:val="nil"/>
+          <w:bottom w:val="nil"/>
+          <w:right w:val="nil"/>
+          <w:insideH w:val="nil"/>
+          <w:insideV w:val="nil"/>
+        </w:tblBorders>
+      </w:tblPr>
+      <w:tblGrid>
+        <w:gridCol w:w="9354"/>
+        <w:gridCol w:w="5669"/>
+      </w:tblGrid>
+      <w:tr>
+        <w:tc>
+          <w:tcPr>
+            <w:tcW w:type="dxa" w:w="9354"/>
+            <w:shd w:val="clear" w:color="auto" w:fill="F2F4F7"/>
+            <w:tcMar>
+              <w:top w:w="170" w:type="dxa"/>
+              <w:left w:w="170" w:type="dxa"/>
+              <w:bottom w:w="170" w:type="dxa"/>
+              <w:right w:w="170" w:type="dxa"/>
+            </w:tcMar>
+          </w:tcPr>
+          <w:p>
+            <w:pPr>
+              <w:spacing w:before="0" w:after="60"/>
+            </w:pPr>
+            <w:r>
+              <w:rPr>
+                <w:b/>
+                <w:i w:val="0"/>
+                <w:color w:val="4A6FA5"/>
+                <w:sz w:val="21"/>
+              </w:rPr>
+              <w:t>COMO FUNCIONA</w:t>
+            </w:r>
+          </w:p>
+          <w:p>
+            <w:pPr>
+              <w:pStyle w:val="ListBullet"/>
+              <w:spacing w:after="40"/>
+            </w:pPr>
+            <w:r>
+              <w:rPr>
+                <w:b w:val="0"/>
+                <w:i w:val="0"/>
+                <w:color w:val="1F2328"/>
+                <w:sz w:val="22"/>
+              </w:rPr>
+              <w:t>P1 lista de tarefas no terminal · P2 API de biblioteca · P3 relatório a partir de planilha · P4 site de portfólio · P5 apresentação a partir dos dados de P3.</w:t>
+            </w:r>
+          </w:p>
+          <w:p>
+            <w:pPr>
+              <w:pStyle w:val="ListBullet"/>
+              <w:spacing w:after="40"/>
+            </w:pPr>
+            <w:r>
+              <w:rPr>
+                <w:b w:val="0"/>
+                <w:i w:val="0"/>
+                <w:color w:val="1F2328"/>
+                <w:sz w:val="22"/>
+              </w:rPr>
+              <w:t>Cada projeto tem o pedido em linguagem natural e um "pronto quando" objetivo.</w:t>
+            </w:r>
+          </w:p>
+          <w:p>
+            <w:pPr>
+              <w:pStyle w:val="ListBullet"/>
+              <w:spacing w:after="40"/>
+            </w:pPr>
+            <w:r>
+              <w:rPr>
+                <w:b w:val="0"/>
+                <w:i w:val="0"/>
+                <w:color w:val="1F2328"/>
+                <w:sz w:val="22"/>
+              </w:rPr>
+              <w:t>Não são usados durante a construção (E2–E7): só entram na validação, para a régua não ser ajustada ao sistema.</w:t>
+            </w:r>
+          </w:p>
+        </w:tc>
+        <w:tc>
+          <w:tcPr>
+            <w:tcW w:type="dxa" w:w="5669"/>
+            <w:shd w:val="clear" w:color="auto" w:fill="2A9D8F"/>
+            <w:tcMar>
+              <w:top w:w="170" w:type="dxa"/>
+              <w:left w:w="170" w:type="dxa"/>
+              <w:bottom w:w="170" w:type="dxa"/>
+              <w:right w:w="170" w:type="dxa"/>
+            </w:tcMar>
+          </w:tcPr>
+          <w:p>
+            <w:pPr>
+              <w:spacing w:before="0" w:after="80"/>
+            </w:pPr>
+            <w:r>
+              <w:rPr>
+                <w:b/>
+                <w:i w:val="0"/>
+                <w:color w:val="FFFFFF"/>
+                <w:sz w:val="21"/>
+              </w:rPr>
+              <w:t>POR QUE É RELEVANTE</w:t>
+            </w:r>
+          </w:p>
+          <w:p>
+            <w:pPr>
+              <w:spacing w:before="0" w:after="0"/>
+            </w:pPr>
+            <w:r>
+              <w:rPr>
+                <w:b/>
+                <w:i w:val="0"/>
+                <w:color w:val="FFFFFF"/>
+                <w:sz w:val="24"/>
+              </w:rPr>
+              <w:t>Os critérios de desempenho são medidos nesses projetos. É a única pendência da etapa: a proposta aguarda a validação do orientador.</w:t>
+            </w:r>
+          </w:p>
+        </w:tc>
+      </w:tr>
+    </w:tbl>
     <w:p>
       <w:pPr>
         <w:pageBreakBefore/>
@@ -1440,75 +4146,190 @@
           <w:color w:val="6B7480"/>
           <w:sz w:val="25"/>
         </w:rPr>
-        <w:t>A entrega combinada no plano, demonstrada por um teste ou execução real.</w:t>
+        <w:t>Entrega combinada: Requisitos, arquitetura, tarefas, critérios e projetos de teste aprovados.</w:t>
       </w:r>
     </w:p>
-    <w:tbl>
-      <w:tblPr>
-        <w:tblW w:type="auto" w:w="0"/>
-        <w:jc w:val="center"/>
-        <w:tblLayout w:type="fixed"/>
-        <w:tblLook w:firstColumn="1" w:firstRow="1" w:lastColumn="0" w:lastRow="0" w:noHBand="0" w:noVBand="1" w:val="04A0"/>
-        <w:tblBorders>
-          <w:top w:val="nil"/>
-          <w:left w:val="nil"/>
-          <w:bottom w:val="nil"/>
-          <w:right w:val="nil"/>
-          <w:insideH w:val="nil"/>
-          <w:insideV w:val="nil"/>
-        </w:tblBorders>
-      </w:tblPr>
-      <w:tblGrid>
-        <w:gridCol w:w="15024"/>
-      </w:tblGrid>
-      <w:tr>
-        <w:tc>
-          <w:tcPr>
-            <w:tcW w:type="dxa" w:w="15024"/>
-            <w:shd w:val="clear" w:color="auto" w:fill="1B2A41"/>
-            <w:tcMar>
-              <w:top w:w="255" w:type="dxa"/>
-              <w:left w:w="255" w:type="dxa"/>
-              <w:bottom w:w="255" w:type="dxa"/>
-              <w:right w:w="255" w:type="dxa"/>
-            </w:tcMar>
-          </w:tcPr>
-          <w:p>
-            <w:pPr>
-              <w:spacing w:before="0" w:after="80"/>
-            </w:pPr>
-            <w:r>
-              <w:rPr>
-                <w:b/>
-                <w:i w:val="0"/>
-                <w:color w:val="FFFFFF"/>
-                <w:sz w:val="21"/>
-              </w:rPr>
-              <w:t>ENTREGA COMBINADA</w:t>
-            </w:r>
-          </w:p>
-          <w:p>
-            <w:pPr>
-              <w:spacing w:before="0" w:after="0"/>
-            </w:pPr>
-            <w:r>
-              <w:rPr>
-                <w:rFonts w:ascii="Cambria" w:hAnsi="Cambria"/>
-                <w:b/>
-                <w:i w:val="0"/>
-                <w:color w:val="FFFFFF"/>
-                <w:sz w:val="30"/>
-              </w:rPr>
-              <w:t>Requisitos, arquitetura, tarefas, critérios e projetos de teste aprovados.</w:t>
-            </w:r>
-          </w:p>
-        </w:tc>
-      </w:tr>
-    </w:tbl>
     <w:p>
       <w:pPr>
         <w:spacing w:before="0" w:after="80"/>
       </w:pPr>
+      <w:r>
+        <w:rPr>
+          <w:b w:val="0"/>
+          <w:i w:val="0"/>
+          <w:color w:val="1F2328"/>
+          <w:sz w:val="23"/>
+        </w:rPr>
+        <w:t>A E1 não tem código, então a prova não é um teste automático: é a aprovação dos documentos na reunião de fim de etapa. Quatro dos cinco estão fechados; os projetos de teste são uma proposta, porque são eles que vão julgar o trabalho.</w:t>
+      </w:r>
+    </w:p>
+    <w:p>
+      <w:pPr>
+        <w:jc w:val="center"/>
+      </w:pPr>
+      <w:r>
+        <w:drawing>
+          <wp:inline xmlns:a="http://schemas.openxmlformats.org/drawingml/2006/main" xmlns:pic="http://schemas.openxmlformats.org/drawingml/2006/picture">
+            <wp:extent cx="3373510" cy="1800000"/>
+            <wp:docPr id="11" name="Picture 11"/>
+            <wp:cNvGraphicFramePr>
+              <a:graphicFrameLocks noChangeAspect="1"/>
+            </wp:cNvGraphicFramePr>
+            <a:graphic>
+              <a:graphicData uri="http://schemas.openxmlformats.org/drawingml/2006/picture">
+                <pic:pic>
+                  <pic:nvPicPr>
+                    <pic:cNvPr id="0" name="E1-marco.png"/>
+                    <pic:cNvPicPr/>
+                  </pic:nvPicPr>
+                  <pic:blipFill>
+                    <a:blip r:embed="rId21"/>
+                    <a:stretch>
+                      <a:fillRect/>
+                    </a:stretch>
+                  </pic:blipFill>
+                  <pic:spPr>
+                    <a:xfrm>
+                      <a:off x="0" y="0"/>
+                      <a:ext cx="3373510" cy="1800000"/>
+                    </a:xfrm>
+                    <a:prstGeom prst="rect"/>
+                  </pic:spPr>
+                </pic:pic>
+              </a:graphicData>
+            </a:graphic>
+          </wp:inline>
+        </w:drawing>
+      </w:r>
+    </w:p>
+    <w:p>
+      <w:pPr>
+        <w:spacing w:before="0" w:after="40"/>
+      </w:pPr>
+      <w:r>
+        <w:rPr>
+          <w:b/>
+          <w:i w:val="0"/>
+          <w:color w:val="1B2A41"/>
+          <w:sz w:val="26"/>
+        </w:rPr>
+        <w:t>O que se confere, item a item</w:t>
+      </w:r>
+    </w:p>
+    <w:p>
+      <w:pPr>
+        <w:spacing w:before="0" w:after="40"/>
+      </w:pPr>
+      <w:r>
+        <w:rPr>
+          <w:b/>
+          <w:i w:val="0"/>
+          <w:color w:val="E9A23B"/>
+          <w:sz w:val="24"/>
+        </w:rPr>
+        <w:t xml:space="preserve">1.  </w:t>
+      </w:r>
+      <w:r>
+        <w:rPr>
+          <w:b w:val="0"/>
+          <w:i w:val="0"/>
+          <w:color w:val="1F2328"/>
+          <w:sz w:val="22"/>
+        </w:rPr>
+        <w:t>Requisitos: os 15 estão em docs/planejamento/requisitos.md, cada um com a etapa responsável e a forma de verificação.</w:t>
+      </w:r>
+    </w:p>
+    <w:p>
+      <w:pPr>
+        <w:spacing w:before="0" w:after="40"/>
+      </w:pPr>
+      <w:r>
+        <w:rPr>
+          <w:b/>
+          <w:i w:val="0"/>
+          <w:color w:val="E9A23B"/>
+          <w:sz w:val="24"/>
+        </w:rPr>
+        <w:t xml:space="preserve">2.  </w:t>
+      </w:r>
+      <w:r>
+        <w:rPr>
+          <w:b w:val="0"/>
+          <w:i w:val="0"/>
+          <w:color w:val="1F2328"/>
+          <w:sz w:val="22"/>
+        </w:rPr>
+        <w:t>Estado da arte: a comparação com o sistema mais próximo e a visão dos quatro sistemas estão nos dois PDFs de docs/planejamento/.</w:t>
+      </w:r>
+    </w:p>
+    <w:p>
+      <w:pPr>
+        <w:spacing w:before="0" w:after="40"/>
+      </w:pPr>
+      <w:r>
+        <w:rPr>
+          <w:b/>
+          <w:i w:val="0"/>
+          <w:color w:val="E9A23B"/>
+          <w:sz w:val="24"/>
+        </w:rPr>
+        <w:t xml:space="preserve">3.  </w:t>
+      </w:r>
+      <w:r>
+        <w:rPr>
+          <w:b w:val="0"/>
+          <w:i w:val="0"/>
+          <w:color w:val="1F2328"/>
+          <w:sz w:val="22"/>
+        </w:rPr>
+        <w:t>Arquitetura: camadas, estados, portões, escada de falha e pilha estão em docs/planejamento/arquitetura.md, com os diagramas renderizados no GitHub.</w:t>
+      </w:r>
+    </w:p>
+    <w:p>
+      <w:pPr>
+        <w:spacing w:before="0" w:after="40"/>
+      </w:pPr>
+      <w:r>
+        <w:rPr>
+          <w:b/>
+          <w:i w:val="0"/>
+          <w:color w:val="E9A23B"/>
+          <w:sz w:val="24"/>
+        </w:rPr>
+        <w:t xml:space="preserve">4.  </w:t>
+      </w:r>
+      <w:r>
+        <w:rPr>
+          <w:b w:val="0"/>
+          <w:i w:val="0"/>
+          <w:color w:val="1F2328"/>
+          <w:sz w:val="22"/>
+        </w:rPr>
+        <w:t>Plano e critérios: o plano de desenvolvimento, os 8 critérios com limite numérico e as 39 tarefas de E2–E7 em docs/tasks/.</w:t>
+      </w:r>
+    </w:p>
+    <w:p>
+      <w:pPr>
+        <w:spacing w:before="0" w:after="40"/>
+      </w:pPr>
+      <w:r>
+        <w:rPr>
+          <w:b/>
+          <w:i w:val="0"/>
+          <w:color w:val="E9A23B"/>
+          <w:sz w:val="24"/>
+        </w:rPr>
+        <w:t xml:space="preserve">5.  </w:t>
+      </w:r>
+      <w:r>
+        <w:rPr>
+          <w:b w:val="0"/>
+          <w:i w:val="0"/>
+          <w:color w:val="1F2328"/>
+          <w:sz w:val="22"/>
+        </w:rPr>
+        <w:t>Projetos de teste: os cinco estão propostos em docs/planejamento/projetos-de-teste.md e aguardam a validação do orientador.</w:t>
+      </w:r>
     </w:p>
     <w:p>
       <w:pPr>
@@ -1688,6 +4509,116 @@
         </w:tc>
       </w:tr>
     </w:tbl>
+    <w:p>
+      <w:pPr>
+        <w:pageBreakBefore/>
+        <w:spacing w:before="0" w:after="40"/>
+      </w:pPr>
+      <w:r>
+        <w:rPr>
+          <w:rFonts w:ascii="Cambria" w:hAnsi="Cambria"/>
+          <w:b/>
+          <w:i w:val="0"/>
+          <w:color w:val="1B2A41"/>
+          <w:sz w:val="48"/>
+        </w:rPr>
+        <w:t>Commits desta etapa</w:t>
+      </w:r>
+    </w:p>
+    <w:p>
+      <w:pPr>
+        <w:spacing w:before="0" w:after="200"/>
+      </w:pPr>
+      <w:r>
+        <w:rPr>
+          <w:b w:val="0"/>
+          <w:i w:val="0"/>
+          <w:color w:val="6B7480"/>
+          <w:sz w:val="25"/>
+        </w:rPr>
+        <w:t>Na ordem em que entraram na branch.</w:t>
+      </w:r>
+    </w:p>
+    <w:p>
+      <w:pPr>
+        <w:pStyle w:val="ListBullet"/>
+        <w:spacing w:after="0"/>
+      </w:pPr>
+      <w:r>
+        <w:rPr>
+          <w:rFonts w:ascii="Consolas" w:hAnsi="Consolas"/>
+          <w:b w:val="0"/>
+          <w:i w:val="0"/>
+          <w:color w:val="1F2328"/>
+          <w:sz w:val="20"/>
+        </w:rPr>
+        <w:t>docs: add requirements R1-R15 (FAB-101)</w:t>
+      </w:r>
+    </w:p>
+    <w:p>
+      <w:pPr>
+        <w:pStyle w:val="ListBullet"/>
+        <w:spacing w:after="0"/>
+      </w:pPr>
+      <w:r>
+        <w:rPr>
+          <w:rFonts w:ascii="Consolas" w:hAnsi="Consolas"/>
+          <w:b w:val="0"/>
+          <w:i w:val="0"/>
+          <w:color w:val="1F2328"/>
+          <w:sz w:val="20"/>
+        </w:rPr>
+        <w:t>docs: add state-of-the-art comparison (FAB-102)</w:t>
+      </w:r>
+    </w:p>
+    <w:p>
+      <w:pPr>
+        <w:pStyle w:val="ListBullet"/>
+        <w:spacing w:after="0"/>
+      </w:pPr>
+      <w:r>
+        <w:rPr>
+          <w:rFonts w:ascii="Consolas" w:hAnsi="Consolas"/>
+          <w:b w:val="0"/>
+          <w:i w:val="0"/>
+          <w:color w:val="1F2328"/>
+          <w:sz w:val="20"/>
+        </w:rPr>
+        <w:t>docs: add architecture: layers, task lifecycle and failure ladder (FAB-103)</w:t>
+      </w:r>
+    </w:p>
+    <w:p>
+      <w:pPr>
+        <w:pStyle w:val="ListBullet"/>
+        <w:spacing w:after="0"/>
+      </w:pPr>
+      <w:r>
+        <w:rPr>
+          <w:rFonts w:ascii="Consolas" w:hAnsi="Consolas"/>
+          <w:b w:val="0"/>
+          <w:i w:val="0"/>
+          <w:color w:val="1F2328"/>
+          <w:sz w:val="20"/>
+        </w:rPr>
+        <w:t>docs: add development plan, performance criteria and E2-E7 backlog (FAB-104)</w:t>
+      </w:r>
+    </w:p>
+    <w:p>
+      <w:pPr>
+        <w:pStyle w:val="ListBullet"/>
+        <w:spacing w:after="0"/>
+      </w:pPr>
+      <w:r>
+        <w:rPr>
+          <w:rFonts w:ascii="Consolas" w:hAnsi="Consolas"/>
+          <w:b w:val="0"/>
+          <w:i w:val="0"/>
+          <w:color w:val="1F2328"/>
+          <w:sz w:val="20"/>
+        </w:rPr>
+        <w:t>docs: propose the five test projects (FAB-105)</w:t>
+      </w:r>
+    </w:p>
     <w:sectPr>
       <w:headerReference w:type="default" r:id="rId9"/>
       <w:footerReference w:type="default" r:id="rId10"/>

</xml_diff>